<commit_message>
Provisional updates to Aspire Info
</commit_message>
<xml_diff>
--- a/bin/PeterBradyCV.docx
+++ b/bin/PeterBradyCV.docx
@@ -311,7 +311,36 @@
           <w:szCs w:val="22"/>
           <w:shd w:val="clear" w:color="auto" w:fill="FFFFFF"/>
         </w:rPr>
-        <w:t>I always deliver high quality code, enjoy new challenges. am experienced in agile</w:t>
+        <w:t xml:space="preserve">I endeavour to always </w:t>
+      </w:r>
+      <w:bookmarkStart w:id="0" w:name="_GoBack"/>
+      <w:bookmarkEnd w:id="0"/>
+      <w:r>
+        <w:rPr>
+          <w:rFonts w:cs="Arial"/>
+          <w:color w:val="000000"/>
+          <w:szCs w:val="22"/>
+          <w:shd w:val="clear" w:color="auto" w:fill="FFFFFF"/>
+        </w:rPr>
+        <w:t>deliver high quality code, enjoy new</w:t>
+      </w:r>
+      <w:r>
+        <w:rPr>
+          <w:rFonts w:cs="Arial"/>
+          <w:color w:val="000000"/>
+          <w:szCs w:val="22"/>
+          <w:shd w:val="clear" w:color="auto" w:fill="FFFFFF"/>
+        </w:rPr>
+        <w:t xml:space="preserve"> challenges,</w:t>
+      </w:r>
+      <w:r>
+        <w:rPr>
+          <w:rFonts w:cs="Arial"/>
+          <w:color w:val="000000"/>
+          <w:szCs w:val="22"/>
+          <w:shd w:val="clear" w:color="auto" w:fill="FFFFFF"/>
+        </w:rPr>
+        <w:t xml:space="preserve"> am experienced in agile</w:t>
       </w:r>
       <w:r>
         <w:rPr>
@@ -2846,18 +2875,7 @@
           <w:lang w:val="en-GB"/>
         </w:rPr>
         <w:tab/>
-        <w:t xml:space="preserve">    </w:t>
-      </w:r>
-      <w:bookmarkStart w:id="0" w:name="_GoBack"/>
-      <w:bookmarkEnd w:id="0"/>
-      <w:r>
-        <w:rPr>
-          <w:rFonts w:cs="Arial"/>
-          <w:b/>
-          <w:sz w:val="24"/>
-          <w:lang w:val="en-GB"/>
-        </w:rPr>
-        <w:t>2016 – 2017</w:t>
+        <w:t xml:space="preserve">    2016 – 2017</w:t>
       </w:r>
     </w:p>
     <w:p>
@@ -6737,7 +6755,7 @@
 </file>
 
 <file path=customXml/itemProps1.xml><?xml version="1.0" encoding="utf-8"?>
-<ds:datastoreItem xmlns:ds="http://schemas.openxmlformats.org/officeDocument/2006/customXml" ds:itemID="{20CBCE83-CDD1-4C3F-BED5-8861A2A8F2FC}">
+<ds:datastoreItem xmlns:ds="http://schemas.openxmlformats.org/officeDocument/2006/customXml" ds:itemID="{C148B601-269A-4C2D-9390-481B1C287CCC}">
   <ds:schemaRefs>
     <ds:schemaRef ds:uri="http://schemas.openxmlformats.org/officeDocument/2006/bibliography"/>
   </ds:schemaRefs>

</xml_diff>

<commit_message>
New updated with Equisoft CVs
</commit_message>
<xml_diff>
--- a/bin/PeterBradyCV.docx
+++ b/bin/PeterBradyCV.docx
@@ -9,14 +9,16 @@
         <w:rPr>
           <w:rFonts w:cs="Arial"/>
           <w:b/>
-          <w:sz w:val="24"/>
-          <w:lang w:val="en-GB"/>
-        </w:rPr>
-      </w:pPr>
-      <w:r>
-        <w:rPr>
-          <w:rFonts w:cs="Arial"/>
-          <w:b/>
+          <w:noProof/>
+          <w:sz w:val="24"/>
+          <w:lang w:val="en-GB"/>
+        </w:rPr>
+      </w:pPr>
+      <w:r>
+        <w:rPr>
+          <w:rFonts w:cs="Arial"/>
+          <w:b/>
+          <w:noProof/>
           <w:sz w:val="24"/>
           <w:lang w:val="en-GB"/>
         </w:rPr>
@@ -29,13 +31,15 @@
         <w:jc w:val="center"/>
         <w:rPr>
           <w:rFonts w:cs="Arial"/>
-          <w:szCs w:val="22"/>
-          <w:lang w:val="en-GB"/>
-        </w:rPr>
-      </w:pPr>
-      <w:r>
-        <w:rPr>
-          <w:rFonts w:cs="Arial"/>
+          <w:noProof/>
+          <w:szCs w:val="22"/>
+          <w:lang w:val="en-GB"/>
+        </w:rPr>
+      </w:pPr>
+      <w:r>
+        <w:rPr>
+          <w:rFonts w:cs="Arial"/>
+          <w:noProof/>
           <w:szCs w:val="22"/>
           <w:lang w:val="en-GB"/>
         </w:rPr>
@@ -44,6 +48,7 @@
       <w:r>
         <w:rPr>
           <w:rFonts w:cs="Arial"/>
+          <w:noProof/>
           <w:szCs w:val="22"/>
           <w:lang w:val="en-GB"/>
         </w:rPr>
@@ -52,6 +57,7 @@
       <w:r>
         <w:rPr>
           <w:rFonts w:cs="Arial"/>
+          <w:noProof/>
           <w:szCs w:val="22"/>
           <w:lang w:val="en-GB"/>
         </w:rPr>
@@ -60,6 +66,7 @@
       <w:r>
         <w:rPr>
           <w:rFonts w:cs="Arial"/>
+          <w:noProof/>
           <w:szCs w:val="22"/>
           <w:lang w:val="en-GB"/>
         </w:rPr>
@@ -73,6 +80,7 @@
         <w:rPr>
           <w:rStyle w:val="Hyperlink"/>
           <w:rFonts w:cs="Arial"/>
+          <w:noProof/>
           <w:color w:val="000000" w:themeColor="text1"/>
           <w:szCs w:val="22"/>
           <w:u w:val="none"/>
@@ -82,6 +90,7 @@
       <w:r>
         <w:rPr>
           <w:rFonts w:cs="Arial"/>
+          <w:noProof/>
           <w:szCs w:val="22"/>
           <w:lang w:val="en-GB"/>
         </w:rPr>
@@ -92,6 +101,7 @@
           <w:rPr>
             <w:rStyle w:val="Hyperlink"/>
             <w:rFonts w:cs="Arial"/>
+            <w:noProof/>
             <w:szCs w:val="22"/>
             <w:lang w:val="en-GB"/>
           </w:rPr>
@@ -105,6 +115,7 @@
         <w:jc w:val="center"/>
         <w:rPr>
           <w:rFonts w:cs="Arial"/>
+          <w:noProof/>
           <w:szCs w:val="22"/>
           <w:lang w:val="en-GB"/>
         </w:rPr>
@@ -113,6 +124,7 @@
         <w:rPr>
           <w:rStyle w:val="Hyperlink"/>
           <w:rFonts w:cs="Arial"/>
+          <w:noProof/>
           <w:color w:val="000000" w:themeColor="text1"/>
           <w:szCs w:val="22"/>
           <w:u w:val="none"/>
@@ -125,6 +137,7 @@
           <w:rPr>
             <w:rStyle w:val="Hyperlink"/>
             <w:rFonts w:cs="Arial"/>
+            <w:noProof/>
             <w:szCs w:val="22"/>
             <w:lang w:val="en-GB"/>
           </w:rPr>
@@ -139,6 +152,7 @@
         <w:rPr>
           <w:rStyle w:val="Hyperlink"/>
           <w:rFonts w:cs="Arial"/>
+          <w:noProof/>
           <w:color w:val="000000" w:themeColor="text1"/>
           <w:szCs w:val="22"/>
           <w:u w:val="none"/>
@@ -149,6 +163,7 @@
         <w:rPr>
           <w:rStyle w:val="Hyperlink"/>
           <w:rFonts w:cs="Arial"/>
+          <w:noProof/>
           <w:color w:val="000000" w:themeColor="text1"/>
           <w:szCs w:val="22"/>
           <w:u w:val="none"/>
@@ -159,9 +174,11 @@
       <w:r>
         <w:rPr>
           <w:rFonts w:cs="Arial"/>
+          <w:noProof/>
           <w:color w:val="0000FF"/>
           <w:szCs w:val="22"/>
           <w:u w:val="single"/>
+          <w:lang w:val="en-GB"/>
         </w:rPr>
         <w:t>www.linkedin.com/in/peterbrady1984</w:t>
       </w:r>
@@ -173,6 +190,7 @@
         <w:rPr>
           <w:rFonts w:ascii="Arial" w:hAnsi="Arial" w:cs="Arial"/>
           <w:b/>
+          <w:noProof/>
           <w:color w:val="1F4E79" w:themeColor="accent1" w:themeShade="80"/>
           <w:szCs w:val="22"/>
           <w:lang w:val="en-GB"/>
@@ -189,6 +207,7 @@
         <w:rPr>
           <w:rFonts w:ascii="Arial" w:hAnsi="Arial" w:cs="Arial"/>
           <w:b/>
+          <w:noProof/>
           <w:color w:val="auto"/>
           <w:sz w:val="20"/>
           <w:szCs w:val="20"/>
@@ -199,6 +218,7 @@
         <w:rPr>
           <w:rFonts w:ascii="Arial" w:hAnsi="Arial" w:cs="Arial"/>
           <w:b/>
+          <w:noProof/>
           <w:color w:val="1F4E79" w:themeColor="accent1" w:themeShade="80"/>
           <w:sz w:val="24"/>
           <w:lang w:val="en-GB"/>
@@ -213,6 +233,7 @@
         <w:rPr>
           <w:rFonts w:ascii="Arial" w:hAnsi="Arial" w:cs="Arial"/>
           <w:b/>
+          <w:noProof/>
           <w:color w:val="auto"/>
           <w:sz w:val="20"/>
           <w:szCs w:val="20"/>
@@ -229,11 +250,13 @@
         <w:jc w:val="both"/>
         <w:rPr>
           <w:rFonts w:cs="Arial"/>
-          <w:lang w:val="en-GB"/>
-        </w:rPr>
-      </w:pPr>
-      <w:r>
-        <w:rPr>
+          <w:noProof/>
+          <w:lang w:val="en-GB"/>
+        </w:rPr>
+      </w:pPr>
+      <w:r>
+        <w:rPr>
+          <w:noProof/>
           <w:szCs w:val="22"/>
           <w:lang w:val="en-GB"/>
         </w:rPr>
@@ -241,6 +264,7 @@
       </w:r>
       <w:r>
         <w:rPr>
+          <w:noProof/>
           <w:szCs w:val="22"/>
           <w:lang w:val="en-GB"/>
         </w:rPr>
@@ -248,6 +272,7 @@
       </w:r>
       <w:r>
         <w:rPr>
+          <w:noProof/>
           <w:szCs w:val="22"/>
           <w:lang w:val="en-GB"/>
         </w:rPr>
@@ -255,6 +280,7 @@
       </w:r>
       <w:r>
         <w:rPr>
+          <w:noProof/>
           <w:szCs w:val="22"/>
           <w:lang w:val="en-GB"/>
         </w:rPr>
@@ -262,6 +288,7 @@
       </w:r>
       <w:r>
         <w:rPr>
+          <w:noProof/>
           <w:szCs w:val="22"/>
           <w:lang w:val="en-GB"/>
         </w:rPr>
@@ -269,43 +296,47 @@
       </w:r>
       <w:r>
         <w:rPr>
-          <w:szCs w:val="22"/>
-          <w:lang w:val="en-GB"/>
-        </w:rPr>
-        <w:t>Frontend Software</w:t>
-      </w:r>
-      <w:r>
-        <w:rPr>
-          <w:szCs w:val="22"/>
-          <w:lang w:val="en-GB"/>
-        </w:rPr>
-        <w:t xml:space="preserve"> Dev</w:t>
-      </w:r>
-      <w:bookmarkStart w:id="0" w:name="_GoBack"/>
-      <w:bookmarkEnd w:id="0"/>
-      <w:r>
-        <w:rPr>
-          <w:szCs w:val="22"/>
-          <w:lang w:val="en-GB"/>
-        </w:rPr>
-        <w:t>eloper</w:t>
-      </w:r>
-      <w:r>
-        <w:rPr>
-          <w:szCs w:val="22"/>
-          <w:lang w:val="en-GB"/>
-        </w:rPr>
-        <w:t xml:space="preserve"> with Aspire Technolog</w:t>
-      </w:r>
-      <w:r>
-        <w:rPr>
-          <w:szCs w:val="22"/>
-          <w:lang w:val="en-GB"/>
-        </w:rPr>
-        <w:t>y.</w:t>
-      </w:r>
-      <w:r>
-        <w:rPr>
+          <w:noProof/>
+          <w:szCs w:val="22"/>
+          <w:lang w:val="en-GB"/>
+        </w:rPr>
+        <w:t>Software</w:t>
+      </w:r>
+      <w:r>
+        <w:rPr>
+          <w:noProof/>
+          <w:szCs w:val="22"/>
+          <w:lang w:val="en-GB"/>
+        </w:rPr>
+        <w:t xml:space="preserve"> Developer</w:t>
+      </w:r>
+      <w:r>
+        <w:rPr>
+          <w:noProof/>
+          <w:szCs w:val="22"/>
+          <w:lang w:val="en-GB"/>
+        </w:rPr>
+        <w:t xml:space="preserve"> with </w:t>
+      </w:r>
+      <w:r>
+        <w:rPr>
+          <w:noProof/>
+          <w:szCs w:val="22"/>
+          <w:lang w:val="en-GB"/>
+        </w:rPr>
+        <w:t>Equisoft DAC</w:t>
+      </w:r>
+      <w:r>
+        <w:rPr>
+          <w:noProof/>
+          <w:szCs w:val="22"/>
+          <w:lang w:val="en-GB"/>
+        </w:rPr>
+        <w:t>.</w:t>
+      </w:r>
+      <w:r>
+        <w:rPr>
+          <w:noProof/>
           <w:szCs w:val="22"/>
           <w:lang w:val="en-GB"/>
         </w:rPr>
@@ -314,42 +345,51 @@
       <w:r>
         <w:rPr>
           <w:rFonts w:cs="Arial"/>
+          <w:noProof/>
           <w:color w:val="000000"/>
           <w:szCs w:val="22"/>
           <w:shd w:val="clear" w:color="auto" w:fill="FFFFFF"/>
+          <w:lang w:val="en-GB"/>
         </w:rPr>
         <w:t xml:space="preserve">I endeavour to always </w:t>
       </w:r>
       <w:r>
         <w:rPr>
           <w:rFonts w:cs="Arial"/>
+          <w:noProof/>
           <w:color w:val="000000"/>
           <w:szCs w:val="22"/>
           <w:shd w:val="clear" w:color="auto" w:fill="FFFFFF"/>
+          <w:lang w:val="en-GB"/>
         </w:rPr>
         <w:t>deliver high quality code, enjoy new</w:t>
       </w:r>
       <w:r>
         <w:rPr>
           <w:rFonts w:cs="Arial"/>
+          <w:noProof/>
           <w:color w:val="000000"/>
           <w:szCs w:val="22"/>
           <w:shd w:val="clear" w:color="auto" w:fill="FFFFFF"/>
+          <w:lang w:val="en-GB"/>
         </w:rPr>
         <w:t xml:space="preserve"> challenges,</w:t>
       </w:r>
       <w:r>
         <w:rPr>
           <w:rFonts w:cs="Arial"/>
+          <w:noProof/>
           <w:color w:val="000000"/>
           <w:szCs w:val="22"/>
           <w:shd w:val="clear" w:color="auto" w:fill="FFFFFF"/>
+          <w:lang w:val="en-GB"/>
         </w:rPr>
         <w:t xml:space="preserve"> am experienced in agile</w:t>
       </w:r>
       <w:r>
         <w:rPr>
           <w:rStyle w:val="background-details"/>
+          <w:noProof/>
           <w:szCs w:val="22"/>
           <w:lang w:val="en-GB"/>
         </w:rPr>
@@ -358,6 +398,7 @@
       <w:r>
         <w:rPr>
           <w:rStyle w:val="background-details"/>
+          <w:noProof/>
           <w:szCs w:val="22"/>
           <w:lang w:val="en-GB"/>
         </w:rPr>
@@ -366,6 +407,7 @@
       <w:r>
         <w:rPr>
           <w:rStyle w:val="background-details"/>
+          <w:noProof/>
           <w:szCs w:val="22"/>
           <w:lang w:val="en-GB"/>
         </w:rPr>
@@ -374,30 +416,82 @@
       <w:r>
         <w:rPr>
           <w:rStyle w:val="background-details"/>
-          <w:szCs w:val="22"/>
-          <w:lang w:val="en-GB"/>
-        </w:rPr>
-        <w:t>eveloping</w:t>
+          <w:noProof/>
+          <w:szCs w:val="22"/>
+          <w:lang w:val="en-GB"/>
+        </w:rPr>
+        <w:t>eveloped</w:t>
       </w:r>
       <w:r>
         <w:rPr>
           <w:rStyle w:val="background-details"/>
-          <w:szCs w:val="22"/>
-          <w:lang w:val="en-GB"/>
-        </w:rPr>
-        <w:t xml:space="preserve"> in C</w:t>
+          <w:noProof/>
+          <w:szCs w:val="22"/>
+          <w:lang w:val="en-GB"/>
+        </w:rPr>
+        <w:t xml:space="preserve"> in </w:t>
       </w:r>
       <w:r>
         <w:rPr>
           <w:rStyle w:val="background-details"/>
-          <w:szCs w:val="22"/>
-          <w:lang w:val="en-GB"/>
-        </w:rPr>
-        <w:t>++ and</w:t>
+          <w:noProof/>
+          <w:szCs w:val="22"/>
+          <w:lang w:val="en-GB"/>
+        </w:rPr>
+        <w:t>PowerBuilder</w:t>
       </w:r>
       <w:r>
         <w:rPr>
           <w:rStyle w:val="background-details"/>
+          <w:noProof/>
+          <w:szCs w:val="22"/>
+          <w:lang w:val="en-GB"/>
+        </w:rPr>
+        <w:t xml:space="preserve">, </w:t>
+      </w:r>
+      <w:r>
+        <w:rPr>
+          <w:rStyle w:val="background-details"/>
+          <w:b/>
+          <w:noProof/>
+          <w:szCs w:val="22"/>
+          <w:lang w:val="en-GB"/>
+        </w:rPr>
+        <w:t>C</w:t>
+      </w:r>
+      <w:r>
+        <w:rPr>
+          <w:rStyle w:val="background-details"/>
+          <w:b/>
+          <w:noProof/>
+          <w:szCs w:val="22"/>
+          <w:lang w:val="en-GB"/>
+        </w:rPr>
+        <w:t>++</w:t>
+      </w:r>
+      <w:r>
+        <w:rPr>
+          <w:rStyle w:val="background-details"/>
+          <w:noProof/>
+          <w:szCs w:val="22"/>
+          <w:lang w:val="en-GB"/>
+        </w:rPr>
+        <w:t xml:space="preserve">, </w:t>
+      </w:r>
+      <w:r>
+        <w:rPr>
+          <w:rStyle w:val="background-details"/>
+          <w:b/>
+          <w:noProof/>
+          <w:szCs w:val="22"/>
+          <w:lang w:val="en-GB"/>
+        </w:rPr>
+        <w:t>Java</w:t>
+      </w:r>
+      <w:r>
+        <w:rPr>
+          <w:rStyle w:val="background-details"/>
+          <w:noProof/>
           <w:szCs w:val="22"/>
           <w:lang w:val="en-GB"/>
         </w:rPr>
@@ -406,6 +500,25 @@
       <w:r>
         <w:rPr>
           <w:rStyle w:val="background-details"/>
+          <w:noProof/>
+          <w:szCs w:val="22"/>
+          <w:lang w:val="en-GB"/>
+        </w:rPr>
+        <w:t>and</w:t>
+      </w:r>
+      <w:r>
+        <w:rPr>
+          <w:rStyle w:val="background-details"/>
+          <w:noProof/>
+          <w:szCs w:val="22"/>
+          <w:lang w:val="en-GB"/>
+        </w:rPr>
+        <w:t xml:space="preserve"> </w:t>
+      </w:r>
+      <w:r>
+        <w:rPr>
+          <w:rStyle w:val="background-details"/>
+          <w:noProof/>
           <w:szCs w:val="22"/>
           <w:lang w:val="en-GB"/>
         </w:rPr>
@@ -414,6 +527,7 @@
       <w:r>
         <w:rPr>
           <w:rStyle w:val="background-details"/>
+          <w:noProof/>
           <w:szCs w:val="22"/>
           <w:lang w:val="en-GB"/>
         </w:rPr>
@@ -423,6 +537,7 @@
         <w:rPr>
           <w:rStyle w:val="background-details"/>
           <w:b/>
+          <w:noProof/>
           <w:szCs w:val="22"/>
           <w:lang w:val="en-GB"/>
         </w:rPr>
@@ -432,6 +547,7 @@
         <w:rPr>
           <w:rStyle w:val="background-details"/>
           <w:b/>
+          <w:noProof/>
           <w:szCs w:val="22"/>
           <w:lang w:val="en-GB"/>
         </w:rPr>
@@ -441,6 +557,7 @@
         <w:rPr>
           <w:rStyle w:val="background-details"/>
           <w:b/>
+          <w:noProof/>
           <w:szCs w:val="22"/>
           <w:lang w:val="en-GB"/>
         </w:rPr>
@@ -450,6 +567,7 @@
         <w:rPr>
           <w:rStyle w:val="background-details"/>
           <w:b/>
+          <w:noProof/>
           <w:szCs w:val="22"/>
           <w:lang w:val="en-GB"/>
         </w:rPr>
@@ -459,13 +577,33 @@
         <w:rPr>
           <w:rStyle w:val="background-details"/>
           <w:b/>
-          <w:lang w:val="en-GB"/>
-        </w:rPr>
-        <w:t>, JQuery, Javascript, Bootstrap</w:t>
+          <w:noProof/>
+          <w:lang w:val="en-GB"/>
+        </w:rPr>
+        <w:t xml:space="preserve">, JQuery, </w:t>
       </w:r>
       <w:r>
         <w:rPr>
           <w:rStyle w:val="background-details"/>
+          <w:b/>
+          <w:noProof/>
+          <w:lang w:val="en-GB"/>
+        </w:rPr>
+        <w:t>JavaScript</w:t>
+      </w:r>
+      <w:r>
+        <w:rPr>
+          <w:rStyle w:val="background-details"/>
+          <w:b/>
+          <w:noProof/>
+          <w:lang w:val="en-GB"/>
+        </w:rPr>
+        <w:t>, Bootstrap</w:t>
+      </w:r>
+      <w:r>
+        <w:rPr>
+          <w:rStyle w:val="background-details"/>
+          <w:noProof/>
           <w:lang w:val="en-GB"/>
         </w:rPr>
         <w:t xml:space="preserve"> and Perl. </w:t>
@@ -473,20 +611,23 @@
       <w:r>
         <w:rPr>
           <w:rStyle w:val="background-details"/>
-          <w:lang w:val="en-GB"/>
-        </w:rPr>
-        <w:t>Prior to this</w:t>
+          <w:noProof/>
+          <w:lang w:val="en-GB"/>
+        </w:rPr>
+        <w:t xml:space="preserve">Prior to </w:t>
       </w:r>
       <w:r>
         <w:rPr>
           <w:rStyle w:val="background-details"/>
-          <w:lang w:val="en-GB"/>
-        </w:rPr>
-        <w:t xml:space="preserve"> employment</w:t>
+          <w:noProof/>
+          <w:lang w:val="en-GB"/>
+        </w:rPr>
+        <w:t>employment</w:t>
       </w:r>
       <w:r>
         <w:rPr>
           <w:rStyle w:val="background-details"/>
+          <w:noProof/>
           <w:lang w:val="en-GB"/>
         </w:rPr>
         <w:t xml:space="preserve"> I successfully completed a BSc</w:t>
@@ -494,6 +635,7 @@
       <w:r>
         <w:rPr>
           <w:rStyle w:val="background-details"/>
+          <w:noProof/>
           <w:lang w:val="en-GB"/>
         </w:rPr>
         <w:t>.</w:t>
@@ -501,6 +643,7 @@
       <w:r>
         <w:rPr>
           <w:rStyle w:val="background-details"/>
+          <w:noProof/>
           <w:lang w:val="en-GB"/>
         </w:rPr>
         <w:t xml:space="preserve"> in Computer Science </w:t>
@@ -508,6 +651,7 @@
       <w:r>
         <w:rPr>
           <w:rStyle w:val="background-details"/>
+          <w:noProof/>
           <w:lang w:val="en-GB"/>
         </w:rPr>
         <w:t xml:space="preserve">(honours) </w:t>
@@ -515,6 +659,7 @@
       <w:r>
         <w:rPr>
           <w:rStyle w:val="background-details"/>
+          <w:noProof/>
           <w:lang w:val="en-GB"/>
         </w:rPr>
         <w:t xml:space="preserve">degree achieving First Class </w:t>
@@ -522,6 +667,7 @@
       <w:r>
         <w:rPr>
           <w:rStyle w:val="background-details"/>
+          <w:noProof/>
           <w:lang w:val="en-GB"/>
         </w:rPr>
         <w:t>H</w:t>
@@ -529,6 +675,7 @@
       <w:r>
         <w:rPr>
           <w:rStyle w:val="background-details"/>
+          <w:noProof/>
           <w:lang w:val="en-GB"/>
         </w:rPr>
         <w:t>onours in the process.</w:t>
@@ -543,6 +690,7 @@
         <w:rPr>
           <w:rFonts w:cs="Arial"/>
           <w:b/>
+          <w:noProof/>
           <w:szCs w:val="22"/>
           <w:lang w:val="en-GB"/>
         </w:rPr>
@@ -559,6 +707,7 @@
         <w:rPr>
           <w:rFonts w:cs="Arial"/>
           <w:b/>
+          <w:noProof/>
           <w:color w:val="1F4E79" w:themeColor="accent1" w:themeShade="80"/>
           <w:sz w:val="24"/>
           <w:lang w:val="en-GB"/>
@@ -568,6 +717,7 @@
         <w:rPr>
           <w:rFonts w:cs="Arial"/>
           <w:b/>
+          <w:noProof/>
           <w:color w:val="1F4E79" w:themeColor="accent1" w:themeShade="80"/>
           <w:sz w:val="24"/>
           <w:lang w:val="en-GB"/>
@@ -578,6 +728,7 @@
         <w:rPr>
           <w:rFonts w:cs="Arial"/>
           <w:b/>
+          <w:noProof/>
           <w:color w:val="1F4E79" w:themeColor="accent1" w:themeShade="80"/>
           <w:sz w:val="24"/>
           <w:lang w:val="en-GB"/>
@@ -592,6 +743,7 @@
         <w:adjustRightInd w:val="0"/>
         <w:rPr>
           <w:rFonts w:cs="Arial"/>
+          <w:noProof/>
           <w:sz w:val="20"/>
           <w:szCs w:val="20"/>
           <w:lang w:val="en-GB"/>
@@ -605,45 +757,22 @@
         <w:adjustRightInd w:val="0"/>
         <w:rPr>
           <w:rFonts w:cs="Arial"/>
-          <w:sz w:val="24"/>
-          <w:lang w:val="en-GB"/>
-        </w:rPr>
-      </w:pPr>
-      <w:r>
-        <w:rPr>
-          <w:rFonts w:cs="Arial"/>
-          <w:b/>
-          <w:sz w:val="24"/>
-          <w:lang w:val="en-GB"/>
-        </w:rPr>
-        <w:t>Aspire Technolog</w:t>
-      </w:r>
-      <w:r>
-        <w:rPr>
-          <w:rFonts w:cs="Arial"/>
-          <w:b/>
-          <w:sz w:val="24"/>
-          <w:lang w:val="en-GB"/>
-        </w:rPr>
-        <w:t>y</w:t>
-      </w:r>
-      <w:r>
-        <w:rPr>
-          <w:rFonts w:cs="Arial"/>
-          <w:b/>
-          <w:sz w:val="24"/>
-          <w:lang w:val="en-GB"/>
-        </w:rPr>
-        <w:t xml:space="preserve">:  </w:t>
-      </w:r>
-      <w:r>
-        <w:rPr>
-          <w:rFonts w:cs="Arial"/>
-          <w:b/>
-          <w:sz w:val="24"/>
-          <w:lang w:val="en-GB"/>
-        </w:rPr>
-        <w:t>Sandyford, Dublin 18</w:t>
+          <w:noProof/>
+          <w:sz w:val="24"/>
+          <w:u w:val="single" w:color="1F4E79" w:themeColor="accent1" w:themeShade="80"/>
+          <w:lang w:val="en-GB"/>
+        </w:rPr>
+      </w:pPr>
+      <w:r>
+        <w:rPr>
+          <w:rFonts w:cs="Arial"/>
+          <w:b/>
+          <w:noProof/>
+          <w:sz w:val="24"/>
+          <w:u w:val="single" w:color="1F4E79" w:themeColor="accent1" w:themeShade="80"/>
+          <w:lang w:val="en-GB"/>
+        </w:rPr>
+        <w:t>Equisoft:  Newbridge, Co Kildare</w:t>
       </w:r>
     </w:p>
     <w:p>
@@ -653,6 +782,7 @@
         <w:adjustRightInd w:val="0"/>
         <w:rPr>
           <w:rFonts w:cs="Arial"/>
+          <w:noProof/>
           <w:sz w:val="20"/>
           <w:szCs w:val="20"/>
           <w:lang w:val="en-GB"/>
@@ -668,43 +798,40 @@
         <w:autoSpaceDE w:val="0"/>
         <w:autoSpaceDN w:val="0"/>
         <w:adjustRightInd w:val="0"/>
-        <w:rPr>
-          <w:rFonts w:cs="Arial"/>
-          <w:sz w:val="24"/>
-          <w:lang w:val="en-GB"/>
-        </w:rPr>
-      </w:pPr>
-      <w:r>
-        <w:rPr>
-          <w:rFonts w:cs="Arial"/>
-          <w:b/>
-          <w:sz w:val="24"/>
-          <w:lang w:val="en-GB"/>
-        </w:rPr>
-        <w:t>Position:</w:t>
-      </w:r>
-      <w:r>
-        <w:rPr>
-          <w:rFonts w:cs="Arial"/>
-          <w:b/>
-          <w:sz w:val="24"/>
-          <w:lang w:val="en-GB"/>
-        </w:rPr>
-        <w:t xml:space="preserve"> Frontend Developer</w:t>
-      </w:r>
-      <w:r>
-        <w:rPr>
-          <w:rFonts w:cs="Arial"/>
-          <w:b/>
+        <w:jc w:val="both"/>
+        <w:rPr>
+          <w:rFonts w:cs="Arial"/>
+          <w:noProof/>
+          <w:sz w:val="24"/>
+          <w:lang w:val="en-GB"/>
+        </w:rPr>
+      </w:pPr>
+      <w:r>
+        <w:rPr>
+          <w:rFonts w:cs="Arial"/>
+          <w:b/>
+          <w:noProof/>
           <w:sz w:val="24"/>
           <w:lang w:val="en-GB"/>
         </w:rPr>
         <w:tab/>
-      </w:r>
-      <w:r>
-        <w:rPr>
-          <w:rFonts w:cs="Arial"/>
-          <w:b/>
+        <w:t xml:space="preserve">   </w:t>
+      </w:r>
+      <w:r>
+        <w:rPr>
+          <w:rFonts w:cs="Arial"/>
+          <w:b/>
+          <w:noProof/>
+          <w:sz w:val="24"/>
+          <w:lang w:val="en-GB"/>
+        </w:rPr>
+        <w:t>Position: Software Developer</w:t>
+      </w:r>
+      <w:r>
+        <w:rPr>
+          <w:rFonts w:cs="Arial"/>
+          <w:b/>
+          <w:noProof/>
           <w:sz w:val="24"/>
           <w:lang w:val="en-GB"/>
         </w:rPr>
@@ -714,6 +841,17 @@
         <w:rPr>
           <w:rFonts w:cs="Arial"/>
           <w:b/>
+          <w:noProof/>
+          <w:sz w:val="24"/>
+          <w:lang w:val="en-GB"/>
+        </w:rPr>
+        <w:t xml:space="preserve">   </w:t>
+      </w:r>
+      <w:r>
+        <w:rPr>
+          <w:rFonts w:cs="Arial"/>
+          <w:b/>
+          <w:noProof/>
           <w:sz w:val="24"/>
           <w:lang w:val="en-GB"/>
         </w:rPr>
@@ -723,6 +861,7 @@
         <w:rPr>
           <w:rFonts w:cs="Arial"/>
           <w:b/>
+          <w:noProof/>
           <w:sz w:val="24"/>
           <w:lang w:val="en-GB"/>
         </w:rPr>
@@ -732,29 +871,43 @@
         <w:rPr>
           <w:rFonts w:cs="Arial"/>
           <w:b/>
+          <w:noProof/>
           <w:sz w:val="24"/>
           <w:lang w:val="en-GB"/>
         </w:rPr>
         <w:tab/>
-      </w:r>
-      <w:r>
-        <w:rPr>
-          <w:rFonts w:cs="Arial"/>
-          <w:b/>
+        <w:t xml:space="preserve">      </w:t>
+      </w:r>
+      <w:r>
+        <w:rPr>
+          <w:rFonts w:cs="Arial"/>
+          <w:b/>
+          <w:noProof/>
+          <w:sz w:val="24"/>
+          <w:lang w:val="en-GB"/>
+        </w:rPr>
+        <w:t xml:space="preserve">   </w:t>
+      </w:r>
+      <w:r>
+        <w:rPr>
+          <w:rFonts w:cs="Arial"/>
+          <w:b/>
+          <w:noProof/>
           <w:sz w:val="24"/>
           <w:lang w:val="en-GB"/>
         </w:rPr>
         <w:tab/>
-        <w:t xml:space="preserve">    </w:t>
-      </w:r>
-      <w:r>
-        <w:rPr>
-          <w:rFonts w:cs="Arial"/>
-          <w:b/>
-          <w:sz w:val="24"/>
-          <w:lang w:val="en-GB"/>
-        </w:rPr>
-        <w:t>February 2019 – Present</w:t>
+        <w:t xml:space="preserve">       </w:t>
+      </w:r>
+      <w:r>
+        <w:rPr>
+          <w:rFonts w:cs="Arial"/>
+          <w:b/>
+          <w:noProof/>
+          <w:sz w:val="24"/>
+          <w:lang w:val="en-GB"/>
+        </w:rPr>
+        <w:t>January 2020 - Present</w:t>
       </w:r>
     </w:p>
     <w:p>
@@ -762,18 +915,21 @@
         <w:pStyle w:val="NormalWeb"/>
         <w:shd w:val="clear" w:color="auto" w:fill="FFFFFF"/>
         <w:spacing w:after="0" w:afterAutospacing="0"/>
-        <w:rPr>
-          <w:rFonts w:ascii="Arial" w:hAnsi="Arial" w:cs="Arial"/>
-          <w:b/>
-          <w:bCs/>
-          <w:lang w:val="en-GB"/>
-        </w:rPr>
-      </w:pPr>
-      <w:r>
-        <w:rPr>
-          <w:rFonts w:ascii="Arial" w:hAnsi="Arial" w:cs="Arial"/>
-          <w:b/>
-          <w:bCs/>
+        <w:ind w:firstLine="357"/>
+        <w:rPr>
+          <w:rFonts w:ascii="Arial" w:hAnsi="Arial" w:cs="Arial"/>
+          <w:b/>
+          <w:bCs/>
+          <w:noProof/>
+          <w:lang w:val="en-GB"/>
+        </w:rPr>
+      </w:pPr>
+      <w:r>
+        <w:rPr>
+          <w:rFonts w:ascii="Arial" w:hAnsi="Arial" w:cs="Arial"/>
+          <w:b/>
+          <w:bCs/>
+          <w:noProof/>
           <w:lang w:val="en-GB"/>
         </w:rPr>
         <w:t>Main Responsibilities</w:t>
@@ -788,6 +944,7 @@
           <w:rFonts w:ascii="Arial" w:hAnsi="Arial" w:cs="Arial"/>
           <w:b/>
           <w:bCs/>
+          <w:noProof/>
           <w:sz w:val="22"/>
           <w:szCs w:val="22"/>
           <w:lang w:val="en-GB"/>
@@ -809,220 +966,33 @@
         <w:rPr>
           <w:rFonts w:ascii="Arial" w:hAnsi="Arial" w:cs="Arial"/>
           <w:bCs/>
-          <w:sz w:val="22"/>
-          <w:szCs w:val="22"/>
-          <w:lang w:val="en-GB"/>
-        </w:rPr>
-      </w:pPr>
-      <w:r>
-        <w:rPr>
-          <w:rFonts w:ascii="Arial" w:hAnsi="Arial" w:cs="Arial"/>
-          <w:bCs/>
-          <w:sz w:val="22"/>
-          <w:szCs w:val="22"/>
-          <w:lang w:val="en-GB"/>
-        </w:rPr>
-        <w:t>Delivery of high quality</w:t>
-      </w:r>
-      <w:r>
-        <w:rPr>
-          <w:rFonts w:ascii="Arial" w:hAnsi="Arial" w:cs="Arial"/>
-          <w:bCs/>
-          <w:sz w:val="22"/>
-          <w:szCs w:val="22"/>
-          <w:lang w:val="en-GB"/>
-        </w:rPr>
-        <w:t>, interactive</w:t>
-      </w:r>
-      <w:r>
-        <w:rPr>
-          <w:rFonts w:ascii="Arial" w:hAnsi="Arial" w:cs="Arial"/>
-          <w:bCs/>
-          <w:sz w:val="22"/>
-          <w:szCs w:val="22"/>
-          <w:lang w:val="en-GB"/>
-        </w:rPr>
-        <w:t xml:space="preserve"> fron</w:t>
-      </w:r>
-      <w:r>
-        <w:rPr>
-          <w:rFonts w:ascii="Arial" w:hAnsi="Arial" w:cs="Arial"/>
-          <w:bCs/>
-          <w:sz w:val="22"/>
-          <w:szCs w:val="22"/>
-          <w:lang w:val="en-GB"/>
-        </w:rPr>
-        <w:t>t</w:t>
-      </w:r>
-      <w:r>
-        <w:rPr>
-          <w:rFonts w:ascii="Arial" w:hAnsi="Arial" w:cs="Arial"/>
-          <w:bCs/>
-          <w:sz w:val="22"/>
-          <w:szCs w:val="22"/>
-          <w:lang w:val="en-GB"/>
-        </w:rPr>
-        <w:t xml:space="preserve">end dashboards for </w:t>
-      </w:r>
-      <w:r>
-        <w:rPr>
-          <w:rFonts w:ascii="Arial" w:hAnsi="Arial" w:cs="Arial"/>
-          <w:bCs/>
-          <w:sz w:val="22"/>
-          <w:szCs w:val="22"/>
-          <w:lang w:val="en-GB"/>
-        </w:rPr>
-        <w:t xml:space="preserve">both </w:t>
-      </w:r>
-      <w:r>
-        <w:rPr>
-          <w:rFonts w:ascii="Arial" w:hAnsi="Arial" w:cs="Arial"/>
-          <w:bCs/>
-          <w:sz w:val="22"/>
-          <w:szCs w:val="22"/>
-          <w:lang w:val="en-GB"/>
-        </w:rPr>
-        <w:t xml:space="preserve">internal and external </w:t>
-      </w:r>
-      <w:r>
-        <w:rPr>
-          <w:rFonts w:ascii="Arial" w:hAnsi="Arial" w:cs="Arial"/>
-          <w:bCs/>
-          <w:sz w:val="22"/>
-          <w:szCs w:val="22"/>
-          <w:lang w:val="en-GB"/>
-        </w:rPr>
-        <w:t>use</w:t>
-      </w:r>
-      <w:r>
-        <w:rPr>
-          <w:rFonts w:ascii="Arial" w:hAnsi="Arial" w:cs="Arial"/>
-          <w:bCs/>
-          <w:sz w:val="22"/>
-          <w:szCs w:val="22"/>
-          <w:lang w:val="en-GB"/>
-        </w:rPr>
-        <w:t xml:space="preserve">. </w:t>
-      </w:r>
-      <w:r>
-        <w:rPr>
-          <w:rFonts w:ascii="Arial" w:hAnsi="Arial" w:cs="Arial"/>
-          <w:bCs/>
-          <w:sz w:val="22"/>
-          <w:szCs w:val="22"/>
-          <w:lang w:val="en-GB"/>
-        </w:rPr>
-        <w:t xml:space="preserve">Examples </w:t>
-      </w:r>
-      <w:r>
-        <w:rPr>
-          <w:rFonts w:ascii="Arial" w:hAnsi="Arial" w:cs="Arial"/>
-          <w:bCs/>
-          <w:sz w:val="22"/>
-          <w:szCs w:val="22"/>
-          <w:lang w:val="en-GB"/>
-        </w:rPr>
-        <w:t xml:space="preserve">include </w:t>
-      </w:r>
-      <w:r>
-        <w:rPr>
-          <w:rFonts w:ascii="Arial" w:hAnsi="Arial" w:cs="Arial"/>
-          <w:bCs/>
-          <w:sz w:val="22"/>
-          <w:szCs w:val="22"/>
-          <w:lang w:val="en-GB"/>
-        </w:rPr>
-        <w:t>V</w:t>
-      </w:r>
-      <w:r>
-        <w:rPr>
-          <w:rFonts w:ascii="Arial" w:hAnsi="Arial" w:cs="Arial"/>
-          <w:bCs/>
-          <w:sz w:val="22"/>
-          <w:szCs w:val="22"/>
-          <w:lang w:val="en-GB"/>
-        </w:rPr>
-        <w:t xml:space="preserve">oice and </w:t>
-      </w:r>
-      <w:r>
-        <w:rPr>
-          <w:rFonts w:ascii="Arial" w:hAnsi="Arial" w:cs="Arial"/>
-          <w:bCs/>
-          <w:sz w:val="22"/>
-          <w:szCs w:val="22"/>
-          <w:lang w:val="en-GB"/>
-        </w:rPr>
-        <w:t>D</w:t>
-      </w:r>
-      <w:r>
-        <w:rPr>
-          <w:rFonts w:ascii="Arial" w:hAnsi="Arial" w:cs="Arial"/>
-          <w:bCs/>
-          <w:sz w:val="22"/>
-          <w:szCs w:val="22"/>
-          <w:lang w:val="en-GB"/>
-        </w:rPr>
-        <w:t xml:space="preserve">ata </w:t>
-      </w:r>
-      <w:r>
-        <w:rPr>
-          <w:rFonts w:ascii="Arial" w:hAnsi="Arial" w:cs="Arial"/>
-          <w:bCs/>
-          <w:sz w:val="22"/>
-          <w:szCs w:val="22"/>
-          <w:lang w:val="en-GB"/>
-        </w:rPr>
-        <w:t>Q</w:t>
-      </w:r>
-      <w:r>
-        <w:rPr>
-          <w:rFonts w:ascii="Arial" w:hAnsi="Arial" w:cs="Arial"/>
-          <w:bCs/>
-          <w:sz w:val="22"/>
-          <w:szCs w:val="22"/>
-          <w:lang w:val="en-GB"/>
-        </w:rPr>
-        <w:t xml:space="preserve">uality </w:t>
-      </w:r>
-      <w:r>
-        <w:rPr>
-          <w:rFonts w:ascii="Arial" w:hAnsi="Arial" w:cs="Arial"/>
-          <w:bCs/>
-          <w:sz w:val="22"/>
-          <w:szCs w:val="22"/>
-          <w:lang w:val="en-GB"/>
-        </w:rPr>
-        <w:t>V</w:t>
-      </w:r>
-      <w:r>
-        <w:rPr>
-          <w:rFonts w:ascii="Arial" w:hAnsi="Arial" w:cs="Arial"/>
-          <w:bCs/>
-          <w:sz w:val="22"/>
-          <w:szCs w:val="22"/>
-          <w:lang w:val="en-GB"/>
-        </w:rPr>
-        <w:t>isualisation</w:t>
-      </w:r>
-      <w:r>
-        <w:rPr>
-          <w:rFonts w:ascii="Arial" w:hAnsi="Arial" w:cs="Arial"/>
-          <w:bCs/>
-          <w:sz w:val="22"/>
-          <w:szCs w:val="22"/>
-          <w:lang w:val="en-GB"/>
-        </w:rPr>
-        <w:t>s</w:t>
-      </w:r>
-      <w:r>
-        <w:rPr>
-          <w:rFonts w:ascii="Arial" w:hAnsi="Arial" w:cs="Arial"/>
-          <w:bCs/>
-          <w:sz w:val="22"/>
-          <w:szCs w:val="22"/>
-          <w:lang w:val="en-GB"/>
-        </w:rPr>
-        <w:t xml:space="preserve"> and Site Alarm Trends.</w:t>
+          <w:noProof/>
+          <w:sz w:val="22"/>
+          <w:szCs w:val="22"/>
+          <w:lang w:val="en-GB"/>
+        </w:rPr>
+      </w:pPr>
+      <w:r>
+        <w:rPr>
+          <w:rFonts w:ascii="Arial" w:hAnsi="Arial" w:cs="Arial"/>
+          <w:bCs/>
+          <w:noProof/>
+          <w:sz w:val="22"/>
+          <w:szCs w:val="22"/>
+          <w:lang w:val="en-GB"/>
+        </w:rPr>
+        <w:t>Development of high quality code for the Timesheets and Horse Management System, communicating within an agile environment, to deliver software releases on time</w:t>
+      </w:r>
+      <w:r>
+        <w:rPr>
+          <w:rFonts w:ascii="Arial" w:hAnsi="Arial" w:cs="Arial"/>
+          <w:bCs/>
+          <w:noProof/>
+          <w:sz w:val="22"/>
+          <w:szCs w:val="22"/>
+          <w:lang w:val="en-GB"/>
+        </w:rPr>
+        <w:t>.</w:t>
       </w:r>
     </w:p>
     <w:p>
@@ -1040,15 +1010,541 @@
         <w:rPr>
           <w:rFonts w:ascii="Arial" w:hAnsi="Arial" w:cs="Arial"/>
           <w:bCs/>
-          <w:sz w:val="22"/>
-          <w:szCs w:val="22"/>
-          <w:lang w:val="en-GB"/>
-        </w:rPr>
-      </w:pPr>
-      <w:r>
-        <w:rPr>
-          <w:rFonts w:ascii="Arial" w:hAnsi="Arial" w:cs="Arial"/>
-          <w:bCs/>
+          <w:noProof/>
+          <w:sz w:val="22"/>
+          <w:szCs w:val="22"/>
+          <w:lang w:val="en-GB"/>
+        </w:rPr>
+      </w:pPr>
+      <w:r>
+        <w:rPr>
+          <w:rFonts w:ascii="Arial" w:hAnsi="Arial" w:cs="Arial"/>
+          <w:bCs/>
+          <w:noProof/>
+          <w:sz w:val="22"/>
+          <w:szCs w:val="22"/>
+          <w:lang w:val="en-GB"/>
+        </w:rPr>
+        <w:t>Developed within PowerBuilder IDE along with Microsoft SQL Server and SourceSafe for version control.</w:t>
+      </w:r>
+    </w:p>
+    <w:p>
+      <w:pPr>
+        <w:pStyle w:val="NormalWeb"/>
+        <w:shd w:val="clear" w:color="auto" w:fill="FFFFFF"/>
+        <w:spacing w:after="200" w:afterAutospacing="0" w:line="276" w:lineRule="auto"/>
+        <w:ind w:left="714"/>
+        <w:contextualSpacing/>
+        <w:jc w:val="both"/>
+        <w:rPr>
+          <w:rFonts w:ascii="Arial" w:hAnsi="Arial" w:cs="Arial"/>
+          <w:bCs/>
+          <w:noProof/>
+          <w:sz w:val="20"/>
+          <w:szCs w:val="20"/>
+          <w:lang w:val="en-GB"/>
+        </w:rPr>
+      </w:pPr>
+    </w:p>
+    <w:p>
+      <w:pPr>
+        <w:autoSpaceDE w:val="0"/>
+        <w:autoSpaceDN w:val="0"/>
+        <w:adjustRightInd w:val="0"/>
+        <w:rPr>
+          <w:rFonts w:cs="Arial"/>
+          <w:noProof/>
+          <w:sz w:val="24"/>
+          <w:u w:val="single" w:color="1F4E79" w:themeColor="accent1" w:themeShade="80"/>
+          <w:lang w:val="en-GB"/>
+        </w:rPr>
+      </w:pPr>
+      <w:r>
+        <w:rPr>
+          <w:rFonts w:cs="Arial"/>
+          <w:b/>
+          <w:noProof/>
+          <w:sz w:val="24"/>
+          <w:u w:val="single" w:color="1F4E79" w:themeColor="accent1" w:themeShade="80"/>
+          <w:lang w:val="en-GB"/>
+        </w:rPr>
+        <w:t>Aspire Technolog</w:t>
+      </w:r>
+      <w:r>
+        <w:rPr>
+          <w:rFonts w:cs="Arial"/>
+          <w:b/>
+          <w:noProof/>
+          <w:sz w:val="24"/>
+          <w:u w:val="single" w:color="1F4E79" w:themeColor="accent1" w:themeShade="80"/>
+          <w:lang w:val="en-GB"/>
+        </w:rPr>
+        <w:t>y</w:t>
+      </w:r>
+      <w:r>
+        <w:rPr>
+          <w:rFonts w:cs="Arial"/>
+          <w:b/>
+          <w:noProof/>
+          <w:sz w:val="24"/>
+          <w:u w:val="single" w:color="1F4E79" w:themeColor="accent1" w:themeShade="80"/>
+          <w:lang w:val="en-GB"/>
+        </w:rPr>
+        <w:t xml:space="preserve">:  </w:t>
+      </w:r>
+      <w:r>
+        <w:rPr>
+          <w:rFonts w:cs="Arial"/>
+          <w:b/>
+          <w:noProof/>
+          <w:sz w:val="24"/>
+          <w:u w:val="single" w:color="1F4E79" w:themeColor="accent1" w:themeShade="80"/>
+          <w:lang w:val="en-GB"/>
+        </w:rPr>
+        <w:t>Sandyford, Dublin 18</w:t>
+      </w:r>
+    </w:p>
+    <w:p>
+      <w:pPr>
+        <w:autoSpaceDE w:val="0"/>
+        <w:autoSpaceDN w:val="0"/>
+        <w:adjustRightInd w:val="0"/>
+        <w:rPr>
+          <w:rFonts w:cs="Arial"/>
+          <w:noProof/>
+          <w:sz w:val="20"/>
+          <w:szCs w:val="20"/>
+          <w:lang w:val="en-GB"/>
+        </w:rPr>
+      </w:pPr>
+    </w:p>
+    <w:p>
+      <w:pPr>
+        <w:tabs>
+          <w:tab w:val="right" w:pos="567"/>
+          <w:tab w:val="right" w:pos="3402"/>
+        </w:tabs>
+        <w:autoSpaceDE w:val="0"/>
+        <w:autoSpaceDN w:val="0"/>
+        <w:adjustRightInd w:val="0"/>
+        <w:rPr>
+          <w:rFonts w:cs="Arial"/>
+          <w:noProof/>
+          <w:sz w:val="24"/>
+          <w:lang w:val="en-GB"/>
+        </w:rPr>
+      </w:pPr>
+      <w:r>
+        <w:rPr>
+          <w:rFonts w:cs="Arial"/>
+          <w:b/>
+          <w:noProof/>
+          <w:sz w:val="24"/>
+          <w:lang w:val="en-GB"/>
+        </w:rPr>
+        <w:t xml:space="preserve">   </w:t>
+      </w:r>
+      <w:r>
+        <w:rPr>
+          <w:rFonts w:cs="Arial"/>
+          <w:b/>
+          <w:noProof/>
+          <w:sz w:val="24"/>
+          <w:lang w:val="en-GB"/>
+        </w:rPr>
+        <w:t>Position:</w:t>
+      </w:r>
+      <w:r>
+        <w:rPr>
+          <w:rFonts w:cs="Arial"/>
+          <w:b/>
+          <w:noProof/>
+          <w:sz w:val="24"/>
+          <w:lang w:val="en-GB"/>
+        </w:rPr>
+        <w:t xml:space="preserve"> Frontend Developer</w:t>
+      </w:r>
+      <w:r>
+        <w:rPr>
+          <w:rFonts w:cs="Arial"/>
+          <w:b/>
+          <w:noProof/>
+          <w:sz w:val="24"/>
+          <w:lang w:val="en-GB"/>
+        </w:rPr>
+        <w:tab/>
+      </w:r>
+      <w:r>
+        <w:rPr>
+          <w:rFonts w:cs="Arial"/>
+          <w:b/>
+          <w:noProof/>
+          <w:sz w:val="24"/>
+          <w:lang w:val="en-GB"/>
+        </w:rPr>
+        <w:tab/>
+      </w:r>
+      <w:r>
+        <w:rPr>
+          <w:rFonts w:cs="Arial"/>
+          <w:b/>
+          <w:noProof/>
+          <w:sz w:val="24"/>
+          <w:lang w:val="en-GB"/>
+        </w:rPr>
+        <w:tab/>
+      </w:r>
+      <w:r>
+        <w:rPr>
+          <w:rFonts w:cs="Arial"/>
+          <w:b/>
+          <w:noProof/>
+          <w:sz w:val="24"/>
+          <w:lang w:val="en-GB"/>
+        </w:rPr>
+        <w:tab/>
+      </w:r>
+      <w:r>
+        <w:rPr>
+          <w:rFonts w:cs="Arial"/>
+          <w:b/>
+          <w:noProof/>
+          <w:sz w:val="24"/>
+          <w:lang w:val="en-GB"/>
+        </w:rPr>
+        <w:t xml:space="preserve">February 2019 – </w:t>
+      </w:r>
+      <w:r>
+        <w:rPr>
+          <w:rFonts w:cs="Arial"/>
+          <w:b/>
+          <w:noProof/>
+          <w:sz w:val="24"/>
+          <w:lang w:val="en-GB"/>
+        </w:rPr>
+        <w:t>September 2019</w:t>
+      </w:r>
+    </w:p>
+    <w:p>
+      <w:pPr>
+        <w:pStyle w:val="NormalWeb"/>
+        <w:shd w:val="clear" w:color="auto" w:fill="FFFFFF"/>
+        <w:spacing w:after="0" w:afterAutospacing="0"/>
+        <w:ind w:firstLine="357"/>
+        <w:rPr>
+          <w:rFonts w:ascii="Arial" w:hAnsi="Arial" w:cs="Arial"/>
+          <w:b/>
+          <w:bCs/>
+          <w:noProof/>
+          <w:lang w:val="en-GB"/>
+        </w:rPr>
+      </w:pPr>
+      <w:r>
+        <w:rPr>
+          <w:rFonts w:ascii="Arial" w:hAnsi="Arial" w:cs="Arial"/>
+          <w:b/>
+          <w:bCs/>
+          <w:noProof/>
+          <w:lang w:val="en-GB"/>
+        </w:rPr>
+        <w:t>Main Responsibilities</w:t>
+      </w:r>
+    </w:p>
+    <w:p>
+      <w:pPr>
+        <w:pStyle w:val="NormalWeb"/>
+        <w:shd w:val="clear" w:color="auto" w:fill="FFFFFF"/>
+        <w:spacing w:after="0" w:afterAutospacing="0"/>
+        <w:rPr>
+          <w:rFonts w:ascii="Arial" w:hAnsi="Arial" w:cs="Arial"/>
+          <w:b/>
+          <w:bCs/>
+          <w:noProof/>
+          <w:sz w:val="22"/>
+          <w:szCs w:val="22"/>
+          <w:lang w:val="en-GB"/>
+        </w:rPr>
+      </w:pPr>
+    </w:p>
+    <w:p>
+      <w:pPr>
+        <w:pStyle w:val="NormalWeb"/>
+        <w:numPr>
+          <w:ilvl w:val="0"/>
+          <w:numId w:val="7"/>
+        </w:numPr>
+        <w:shd w:val="clear" w:color="auto" w:fill="FFFFFF"/>
+        <w:spacing w:after="200" w:afterAutospacing="0" w:line="276" w:lineRule="auto"/>
+        <w:ind w:left="714" w:hanging="357"/>
+        <w:contextualSpacing/>
+        <w:jc w:val="both"/>
+        <w:rPr>
+          <w:rFonts w:ascii="Arial" w:hAnsi="Arial" w:cs="Arial"/>
+          <w:bCs/>
+          <w:noProof/>
+          <w:sz w:val="22"/>
+          <w:szCs w:val="22"/>
+          <w:lang w:val="en-GB"/>
+        </w:rPr>
+      </w:pPr>
+      <w:r>
+        <w:rPr>
+          <w:rFonts w:ascii="Arial" w:hAnsi="Arial" w:cs="Arial"/>
+          <w:bCs/>
+          <w:noProof/>
+          <w:sz w:val="22"/>
+          <w:szCs w:val="22"/>
+          <w:lang w:val="en-GB"/>
+        </w:rPr>
+        <w:t>Delivery of high quality</w:t>
+      </w:r>
+      <w:r>
+        <w:rPr>
+          <w:rFonts w:ascii="Arial" w:hAnsi="Arial" w:cs="Arial"/>
+          <w:bCs/>
+          <w:noProof/>
+          <w:sz w:val="22"/>
+          <w:szCs w:val="22"/>
+          <w:lang w:val="en-GB"/>
+        </w:rPr>
+        <w:t>, interactive</w:t>
+      </w:r>
+      <w:r>
+        <w:rPr>
+          <w:rFonts w:ascii="Arial" w:hAnsi="Arial" w:cs="Arial"/>
+          <w:bCs/>
+          <w:noProof/>
+          <w:sz w:val="22"/>
+          <w:szCs w:val="22"/>
+          <w:lang w:val="en-GB"/>
+        </w:rPr>
+        <w:t xml:space="preserve"> fron</w:t>
+      </w:r>
+      <w:r>
+        <w:rPr>
+          <w:rFonts w:ascii="Arial" w:hAnsi="Arial" w:cs="Arial"/>
+          <w:bCs/>
+          <w:noProof/>
+          <w:sz w:val="22"/>
+          <w:szCs w:val="22"/>
+          <w:lang w:val="en-GB"/>
+        </w:rPr>
+        <w:t>t</w:t>
+      </w:r>
+      <w:r>
+        <w:rPr>
+          <w:rFonts w:ascii="Arial" w:hAnsi="Arial" w:cs="Arial"/>
+          <w:bCs/>
+          <w:noProof/>
+          <w:sz w:val="22"/>
+          <w:szCs w:val="22"/>
+          <w:lang w:val="en-GB"/>
+        </w:rPr>
+        <w:t xml:space="preserve">end dashboards for </w:t>
+      </w:r>
+      <w:r>
+        <w:rPr>
+          <w:rFonts w:ascii="Arial" w:hAnsi="Arial" w:cs="Arial"/>
+          <w:bCs/>
+          <w:noProof/>
+          <w:sz w:val="22"/>
+          <w:szCs w:val="22"/>
+          <w:lang w:val="en-GB"/>
+        </w:rPr>
+        <w:t xml:space="preserve">both </w:t>
+      </w:r>
+      <w:r>
+        <w:rPr>
+          <w:rFonts w:ascii="Arial" w:hAnsi="Arial" w:cs="Arial"/>
+          <w:bCs/>
+          <w:noProof/>
+          <w:sz w:val="22"/>
+          <w:szCs w:val="22"/>
+          <w:lang w:val="en-GB"/>
+        </w:rPr>
+        <w:t xml:space="preserve">internal and external </w:t>
+      </w:r>
+      <w:r>
+        <w:rPr>
+          <w:rFonts w:ascii="Arial" w:hAnsi="Arial" w:cs="Arial"/>
+          <w:bCs/>
+          <w:noProof/>
+          <w:sz w:val="22"/>
+          <w:szCs w:val="22"/>
+          <w:lang w:val="en-GB"/>
+        </w:rPr>
+        <w:t>use</w:t>
+      </w:r>
+      <w:r>
+        <w:rPr>
+          <w:rFonts w:ascii="Arial" w:hAnsi="Arial" w:cs="Arial"/>
+          <w:bCs/>
+          <w:noProof/>
+          <w:sz w:val="22"/>
+          <w:szCs w:val="22"/>
+          <w:lang w:val="en-GB"/>
+        </w:rPr>
+        <w:t xml:space="preserve">. </w:t>
+      </w:r>
+      <w:r>
+        <w:rPr>
+          <w:rFonts w:ascii="Arial" w:hAnsi="Arial" w:cs="Arial"/>
+          <w:bCs/>
+          <w:noProof/>
+          <w:sz w:val="22"/>
+          <w:szCs w:val="22"/>
+          <w:lang w:val="en-GB"/>
+        </w:rPr>
+        <w:t xml:space="preserve">Examples </w:t>
+      </w:r>
+      <w:r>
+        <w:rPr>
+          <w:rFonts w:ascii="Arial" w:hAnsi="Arial" w:cs="Arial"/>
+          <w:bCs/>
+          <w:noProof/>
+          <w:sz w:val="22"/>
+          <w:szCs w:val="22"/>
+          <w:lang w:val="en-GB"/>
+        </w:rPr>
+        <w:t xml:space="preserve">include </w:t>
+      </w:r>
+      <w:r>
+        <w:rPr>
+          <w:rFonts w:ascii="Arial" w:hAnsi="Arial" w:cs="Arial"/>
+          <w:bCs/>
+          <w:noProof/>
+          <w:sz w:val="22"/>
+          <w:szCs w:val="22"/>
+          <w:lang w:val="en-GB"/>
+        </w:rPr>
+        <w:t>V</w:t>
+      </w:r>
+      <w:r>
+        <w:rPr>
+          <w:rFonts w:ascii="Arial" w:hAnsi="Arial" w:cs="Arial"/>
+          <w:bCs/>
+          <w:noProof/>
+          <w:sz w:val="22"/>
+          <w:szCs w:val="22"/>
+          <w:lang w:val="en-GB"/>
+        </w:rPr>
+        <w:t xml:space="preserve">oice and </w:t>
+      </w:r>
+      <w:r>
+        <w:rPr>
+          <w:rFonts w:ascii="Arial" w:hAnsi="Arial" w:cs="Arial"/>
+          <w:bCs/>
+          <w:noProof/>
+          <w:sz w:val="22"/>
+          <w:szCs w:val="22"/>
+          <w:lang w:val="en-GB"/>
+        </w:rPr>
+        <w:t>D</w:t>
+      </w:r>
+      <w:r>
+        <w:rPr>
+          <w:rFonts w:ascii="Arial" w:hAnsi="Arial" w:cs="Arial"/>
+          <w:bCs/>
+          <w:noProof/>
+          <w:sz w:val="22"/>
+          <w:szCs w:val="22"/>
+          <w:lang w:val="en-GB"/>
+        </w:rPr>
+        <w:t xml:space="preserve">ata </w:t>
+      </w:r>
+      <w:r>
+        <w:rPr>
+          <w:rFonts w:ascii="Arial" w:hAnsi="Arial" w:cs="Arial"/>
+          <w:bCs/>
+          <w:noProof/>
+          <w:sz w:val="22"/>
+          <w:szCs w:val="22"/>
+          <w:lang w:val="en-GB"/>
+        </w:rPr>
+        <w:t>Q</w:t>
+      </w:r>
+      <w:r>
+        <w:rPr>
+          <w:rFonts w:ascii="Arial" w:hAnsi="Arial" w:cs="Arial"/>
+          <w:bCs/>
+          <w:noProof/>
+          <w:sz w:val="22"/>
+          <w:szCs w:val="22"/>
+          <w:lang w:val="en-GB"/>
+        </w:rPr>
+        <w:t xml:space="preserve">uality </w:t>
+      </w:r>
+      <w:r>
+        <w:rPr>
+          <w:rFonts w:ascii="Arial" w:hAnsi="Arial" w:cs="Arial"/>
+          <w:bCs/>
+          <w:noProof/>
+          <w:sz w:val="22"/>
+          <w:szCs w:val="22"/>
+          <w:lang w:val="en-GB"/>
+        </w:rPr>
+        <w:t>V</w:t>
+      </w:r>
+      <w:r>
+        <w:rPr>
+          <w:rFonts w:ascii="Arial" w:hAnsi="Arial" w:cs="Arial"/>
+          <w:bCs/>
+          <w:noProof/>
+          <w:sz w:val="22"/>
+          <w:szCs w:val="22"/>
+          <w:lang w:val="en-GB"/>
+        </w:rPr>
+        <w:t>isualisation</w:t>
+      </w:r>
+      <w:r>
+        <w:rPr>
+          <w:rFonts w:ascii="Arial" w:hAnsi="Arial" w:cs="Arial"/>
+          <w:bCs/>
+          <w:noProof/>
+          <w:sz w:val="22"/>
+          <w:szCs w:val="22"/>
+          <w:lang w:val="en-GB"/>
+        </w:rPr>
+        <w:t>s</w:t>
+      </w:r>
+      <w:r>
+        <w:rPr>
+          <w:rFonts w:ascii="Arial" w:hAnsi="Arial" w:cs="Arial"/>
+          <w:bCs/>
+          <w:noProof/>
+          <w:sz w:val="22"/>
+          <w:szCs w:val="22"/>
+          <w:lang w:val="en-GB"/>
+        </w:rPr>
+        <w:t xml:space="preserve"> and Site Alarm Trends.</w:t>
+      </w:r>
+    </w:p>
+    <w:p>
+      <w:pPr>
+        <w:pStyle w:val="NormalWeb"/>
+        <w:numPr>
+          <w:ilvl w:val="0"/>
+          <w:numId w:val="7"/>
+        </w:numPr>
+        <w:shd w:val="clear" w:color="auto" w:fill="FFFFFF"/>
+        <w:spacing w:after="200" w:afterAutospacing="0" w:line="276" w:lineRule="auto"/>
+        <w:ind w:left="714" w:hanging="357"/>
+        <w:contextualSpacing/>
+        <w:jc w:val="both"/>
+        <w:rPr>
+          <w:rFonts w:ascii="Arial" w:hAnsi="Arial" w:cs="Arial"/>
+          <w:bCs/>
+          <w:noProof/>
+          <w:sz w:val="22"/>
+          <w:szCs w:val="22"/>
+          <w:lang w:val="en-GB"/>
+        </w:rPr>
+      </w:pPr>
+      <w:r>
+        <w:rPr>
+          <w:rFonts w:ascii="Arial" w:hAnsi="Arial" w:cs="Arial"/>
+          <w:bCs/>
+          <w:noProof/>
           <w:sz w:val="22"/>
           <w:szCs w:val="22"/>
           <w:lang w:val="en-GB"/>
@@ -1059,6 +1555,7 @@
         <w:rPr>
           <w:rFonts w:ascii="Arial" w:hAnsi="Arial" w:cs="Arial"/>
           <w:bCs/>
+          <w:noProof/>
           <w:sz w:val="22"/>
           <w:szCs w:val="22"/>
           <w:lang w:val="en-GB"/>
@@ -1069,6 +1566,7 @@
         <w:rPr>
           <w:rFonts w:ascii="Arial" w:hAnsi="Arial" w:cs="Arial"/>
           <w:bCs/>
+          <w:noProof/>
           <w:sz w:val="22"/>
           <w:szCs w:val="22"/>
           <w:lang w:val="en-GB"/>
@@ -1079,6 +1577,7 @@
         <w:rPr>
           <w:rFonts w:ascii="Arial" w:hAnsi="Arial" w:cs="Arial"/>
           <w:bCs/>
+          <w:noProof/>
           <w:sz w:val="22"/>
           <w:szCs w:val="22"/>
           <w:lang w:val="en-GB"/>
@@ -1089,6 +1588,7 @@
         <w:rPr>
           <w:rFonts w:ascii="Arial" w:hAnsi="Arial" w:cs="Arial"/>
           <w:bCs/>
+          <w:noProof/>
           <w:sz w:val="22"/>
           <w:szCs w:val="22"/>
           <w:lang w:val="en-GB"/>
@@ -1099,6 +1599,7 @@
         <w:rPr>
           <w:rFonts w:ascii="Arial" w:hAnsi="Arial" w:cs="Arial"/>
           <w:bCs/>
+          <w:noProof/>
           <w:sz w:val="22"/>
           <w:szCs w:val="22"/>
           <w:lang w:val="en-GB"/>
@@ -1109,6 +1610,7 @@
         <w:rPr>
           <w:rFonts w:ascii="Arial" w:hAnsi="Arial" w:cs="Arial"/>
           <w:bCs/>
+          <w:noProof/>
           <w:sz w:val="22"/>
           <w:szCs w:val="22"/>
           <w:lang w:val="en-GB"/>
@@ -1119,6 +1621,7 @@
         <w:rPr>
           <w:rFonts w:ascii="Arial" w:hAnsi="Arial" w:cs="Arial"/>
           <w:bCs/>
+          <w:noProof/>
           <w:sz w:val="22"/>
           <w:szCs w:val="22"/>
           <w:lang w:val="en-GB"/>
@@ -1129,6 +1632,7 @@
         <w:rPr>
           <w:rFonts w:ascii="Arial" w:hAnsi="Arial" w:cs="Arial"/>
           <w:bCs/>
+          <w:noProof/>
           <w:sz w:val="22"/>
           <w:szCs w:val="22"/>
           <w:lang w:val="en-GB"/>
@@ -1139,6 +1643,7 @@
         <w:rPr>
           <w:rFonts w:ascii="Arial" w:hAnsi="Arial" w:cs="Arial"/>
           <w:bCs/>
+          <w:noProof/>
           <w:sz w:val="22"/>
           <w:szCs w:val="22"/>
           <w:lang w:val="en-GB"/>
@@ -1149,6 +1654,7 @@
         <w:rPr>
           <w:rFonts w:ascii="Arial" w:hAnsi="Arial" w:cs="Arial"/>
           <w:bCs/>
+          <w:noProof/>
           <w:sz w:val="22"/>
           <w:szCs w:val="22"/>
           <w:lang w:val="en-GB"/>
@@ -1159,6 +1665,7 @@
         <w:rPr>
           <w:rFonts w:ascii="Arial" w:hAnsi="Arial" w:cs="Arial"/>
           <w:bCs/>
+          <w:noProof/>
           <w:sz w:val="22"/>
           <w:szCs w:val="22"/>
           <w:lang w:val="en-GB"/>
@@ -1185,6 +1692,7 @@
         <w:jc w:val="both"/>
         <w:rPr>
           <w:rFonts w:ascii="Arial" w:hAnsi="Arial" w:cs="Arial"/>
+          <w:noProof/>
           <w:sz w:val="20"/>
           <w:szCs w:val="20"/>
           <w:lang w:val="en-GB"/>
@@ -1194,6 +1702,7 @@
         <w:rPr>
           <w:rFonts w:ascii="Arial" w:hAnsi="Arial" w:cs="Arial"/>
           <w:bCs/>
+          <w:noProof/>
           <w:sz w:val="22"/>
           <w:szCs w:val="22"/>
           <w:lang w:val="en-GB"/>
@@ -1204,6 +1713,7 @@
         <w:rPr>
           <w:rFonts w:ascii="Arial" w:hAnsi="Arial" w:cs="Arial"/>
           <w:bCs/>
+          <w:noProof/>
           <w:sz w:val="22"/>
           <w:szCs w:val="22"/>
           <w:lang w:val="en-GB"/>
@@ -1214,6 +1724,7 @@
         <w:rPr>
           <w:rFonts w:ascii="Arial" w:hAnsi="Arial" w:cs="Arial"/>
           <w:bCs/>
+          <w:noProof/>
           <w:sz w:val="22"/>
           <w:szCs w:val="22"/>
           <w:lang w:val="en-GB"/>
@@ -1224,6 +1735,7 @@
         <w:rPr>
           <w:rFonts w:ascii="Arial" w:hAnsi="Arial" w:cs="Arial"/>
           <w:bCs/>
+          <w:noProof/>
           <w:sz w:val="22"/>
           <w:szCs w:val="22"/>
           <w:lang w:val="en-GB"/>
@@ -1234,6 +1746,7 @@
         <w:rPr>
           <w:rFonts w:ascii="Arial" w:hAnsi="Arial" w:cs="Arial"/>
           <w:bCs/>
+          <w:noProof/>
           <w:sz w:val="22"/>
           <w:szCs w:val="22"/>
           <w:lang w:val="en-GB"/>
@@ -1244,6 +1757,7 @@
         <w:rPr>
           <w:rFonts w:ascii="Arial" w:hAnsi="Arial" w:cs="Arial"/>
           <w:bCs/>
+          <w:noProof/>
           <w:sz w:val="22"/>
           <w:szCs w:val="22"/>
           <w:lang w:val="en-GB"/>
@@ -1254,6 +1768,7 @@
         <w:rPr>
           <w:rFonts w:ascii="Arial" w:hAnsi="Arial" w:cs="Arial"/>
           <w:bCs/>
+          <w:noProof/>
           <w:sz w:val="22"/>
           <w:szCs w:val="22"/>
           <w:lang w:val="en-GB"/>
@@ -1264,6 +1779,7 @@
         <w:rPr>
           <w:rFonts w:ascii="Arial" w:hAnsi="Arial" w:cs="Arial"/>
           <w:bCs/>
+          <w:noProof/>
           <w:sz w:val="22"/>
           <w:szCs w:val="22"/>
           <w:lang w:val="en-GB"/>
@@ -1274,6 +1790,7 @@
         <w:rPr>
           <w:rFonts w:ascii="Arial" w:hAnsi="Arial" w:cs="Arial"/>
           <w:bCs/>
+          <w:noProof/>
           <w:sz w:val="22"/>
           <w:szCs w:val="22"/>
           <w:lang w:val="en-GB"/>
@@ -1284,6 +1801,7 @@
         <w:rPr>
           <w:rFonts w:ascii="Arial" w:hAnsi="Arial" w:cs="Arial"/>
           <w:bCs/>
+          <w:noProof/>
           <w:sz w:val="22"/>
           <w:szCs w:val="22"/>
           <w:lang w:val="en-GB"/>
@@ -1294,6 +1812,7 @@
         <w:rPr>
           <w:rFonts w:ascii="Arial" w:hAnsi="Arial" w:cs="Arial"/>
           <w:bCs/>
+          <w:noProof/>
           <w:sz w:val="22"/>
           <w:szCs w:val="22"/>
           <w:lang w:val="en-GB"/>
@@ -1304,6 +1823,7 @@
         <w:rPr>
           <w:rFonts w:ascii="Arial" w:hAnsi="Arial" w:cs="Arial"/>
           <w:bCs/>
+          <w:noProof/>
           <w:sz w:val="22"/>
           <w:szCs w:val="22"/>
           <w:lang w:val="en-GB"/>
@@ -1314,6 +1834,7 @@
         <w:rPr>
           <w:rFonts w:ascii="Arial" w:hAnsi="Arial" w:cs="Arial"/>
           <w:bCs/>
+          <w:noProof/>
           <w:sz w:val="22"/>
           <w:szCs w:val="22"/>
           <w:lang w:val="en-GB"/>
@@ -1324,6 +1845,7 @@
         <w:rPr>
           <w:rFonts w:ascii="Arial" w:hAnsi="Arial" w:cs="Arial"/>
           <w:bCs/>
+          <w:noProof/>
           <w:sz w:val="22"/>
           <w:szCs w:val="22"/>
           <w:lang w:val="en-GB"/>
@@ -1334,6 +1856,7 @@
         <w:rPr>
           <w:rFonts w:ascii="Arial" w:hAnsi="Arial" w:cs="Arial"/>
           <w:bCs/>
+          <w:noProof/>
           <w:sz w:val="22"/>
           <w:szCs w:val="22"/>
           <w:lang w:val="en-GB"/>
@@ -1360,6 +1883,7 @@
         <w:jc w:val="both"/>
         <w:rPr>
           <w:rFonts w:cs="Arial"/>
+          <w:noProof/>
           <w:color w:val="000000"/>
           <w:szCs w:val="22"/>
           <w:lang w:val="en-GB"/>
@@ -1368,36 +1892,51 @@
       <w:r>
         <w:rPr>
           <w:rFonts w:ascii="Arial" w:hAnsi="Arial" w:cs="Arial"/>
+          <w:noProof/>
           <w:color w:val="000000"/>
           <w:sz w:val="22"/>
           <w:szCs w:val="22"/>
           <w:lang w:val="en-GB"/>
         </w:rPr>
-        <w:t>Excellent communication skills were required working in a team environment</w:t>
-      </w:r>
-      <w:r>
-        <w:rPr>
-          <w:rFonts w:ascii="Arial" w:hAnsi="Arial" w:cs="Arial"/>
+        <w:t>Required e</w:t>
+      </w:r>
+      <w:r>
+        <w:rPr>
+          <w:rFonts w:ascii="Arial" w:hAnsi="Arial" w:cs="Arial"/>
+          <w:noProof/>
           <w:color w:val="000000"/>
           <w:sz w:val="22"/>
           <w:szCs w:val="22"/>
           <w:lang w:val="en-GB"/>
         </w:rPr>
+        <w:t>xcellent communication skills working in a team environment</w:t>
+      </w:r>
+      <w:r>
+        <w:rPr>
+          <w:rFonts w:ascii="Arial" w:hAnsi="Arial" w:cs="Arial"/>
+          <w:noProof/>
+          <w:color w:val="000000"/>
+          <w:sz w:val="22"/>
+          <w:szCs w:val="22"/>
+          <w:lang w:val="en-GB"/>
+        </w:rPr>
         <w:t>,</w:t>
       </w:r>
       <w:r>
         <w:rPr>
           <w:rFonts w:ascii="Arial" w:hAnsi="Arial" w:cs="Arial"/>
+          <w:noProof/>
           <w:color w:val="000000"/>
           <w:sz w:val="22"/>
           <w:szCs w:val="22"/>
           <w:lang w:val="en-GB"/>
         </w:rPr>
-        <w:t xml:space="preserve"> based both in Dublin and Belgrade</w:t>
-      </w:r>
-      <w:r>
-        <w:rPr>
-          <w:rFonts w:ascii="Arial" w:hAnsi="Arial" w:cs="Arial"/>
+        <w:t xml:space="preserve"> based in Dublin and Belgrade</w:t>
+      </w:r>
+      <w:r>
+        <w:rPr>
+          <w:rFonts w:ascii="Arial" w:hAnsi="Arial" w:cs="Arial"/>
+          <w:noProof/>
           <w:color w:val="000000"/>
           <w:sz w:val="22"/>
           <w:szCs w:val="22"/>
@@ -1408,6 +1947,7 @@
       <w:r>
         <w:rPr>
           <w:rFonts w:ascii="Arial" w:hAnsi="Arial" w:cs="Arial"/>
+          <w:noProof/>
           <w:color w:val="000000"/>
           <w:sz w:val="22"/>
           <w:szCs w:val="22"/>
@@ -1423,14 +1963,26 @@
         <w:adjustRightInd w:val="0"/>
         <w:rPr>
           <w:rFonts w:cs="Arial"/>
-          <w:sz w:val="24"/>
-          <w:lang w:val="en-GB"/>
-        </w:rPr>
-      </w:pPr>
-      <w:r>
-        <w:rPr>
-          <w:rFonts w:cs="Arial"/>
-          <w:b/>
+          <w:noProof/>
+          <w:sz w:val="24"/>
+          <w:lang w:val="en-GB"/>
+        </w:rPr>
+      </w:pPr>
+      <w:r>
+        <w:rPr>
+          <w:rFonts w:cs="Arial"/>
+          <w:b/>
+          <w:noProof/>
+          <w:sz w:val="24"/>
+          <w:lang w:val="en-GB"/>
+        </w:rPr>
+        <w:t xml:space="preserve">   </w:t>
+      </w:r>
+      <w:r>
+        <w:rPr>
+          <w:rFonts w:cs="Arial"/>
+          <w:b/>
+          <w:noProof/>
           <w:sz w:val="24"/>
           <w:lang w:val="en-GB"/>
         </w:rPr>
@@ -1440,6 +1992,7 @@
         <w:rPr>
           <w:rFonts w:cs="Arial"/>
           <w:b/>
+          <w:noProof/>
           <w:sz w:val="24"/>
           <w:lang w:val="en-GB"/>
         </w:rPr>
@@ -1449,6 +2002,7 @@
         <w:rPr>
           <w:rFonts w:cs="Arial"/>
           <w:b/>
+          <w:noProof/>
           <w:sz w:val="24"/>
           <w:lang w:val="en-GB"/>
         </w:rPr>
@@ -1458,6 +2012,7 @@
         <w:rPr>
           <w:rFonts w:cs="Arial"/>
           <w:b/>
+          <w:noProof/>
           <w:sz w:val="24"/>
           <w:lang w:val="en-GB"/>
         </w:rPr>
@@ -1467,6 +2022,7 @@
         <w:rPr>
           <w:rFonts w:cs="Arial"/>
           <w:b/>
+          <w:noProof/>
           <w:sz w:val="24"/>
           <w:lang w:val="en-GB"/>
         </w:rPr>
@@ -1476,6 +2032,7 @@
         <w:rPr>
           <w:rFonts w:cs="Arial"/>
           <w:b/>
+          <w:noProof/>
           <w:sz w:val="24"/>
           <w:lang w:val="en-GB"/>
         </w:rPr>
@@ -1486,6 +2043,7 @@
         <w:rPr>
           <w:rFonts w:cs="Arial"/>
           <w:b/>
+          <w:noProof/>
           <w:sz w:val="24"/>
           <w:lang w:val="en-GB"/>
         </w:rPr>
@@ -1495,6 +2053,7 @@
         <w:rPr>
           <w:rFonts w:cs="Arial"/>
           <w:b/>
+          <w:noProof/>
           <w:sz w:val="24"/>
           <w:lang w:val="en-GB"/>
         </w:rPr>
@@ -1506,18 +2065,21 @@
         <w:pStyle w:val="NormalWeb"/>
         <w:shd w:val="clear" w:color="auto" w:fill="FFFFFF"/>
         <w:spacing w:after="0" w:afterAutospacing="0"/>
-        <w:rPr>
-          <w:rFonts w:ascii="Arial" w:hAnsi="Arial" w:cs="Arial"/>
-          <w:b/>
-          <w:bCs/>
-          <w:lang w:val="en-GB"/>
-        </w:rPr>
-      </w:pPr>
-      <w:r>
-        <w:rPr>
-          <w:rFonts w:ascii="Arial" w:hAnsi="Arial" w:cs="Arial"/>
-          <w:b/>
-          <w:bCs/>
+        <w:ind w:firstLine="357"/>
+        <w:rPr>
+          <w:rFonts w:ascii="Arial" w:hAnsi="Arial" w:cs="Arial"/>
+          <w:b/>
+          <w:bCs/>
+          <w:noProof/>
+          <w:lang w:val="en-GB"/>
+        </w:rPr>
+      </w:pPr>
+      <w:r>
+        <w:rPr>
+          <w:rFonts w:ascii="Arial" w:hAnsi="Arial" w:cs="Arial"/>
+          <w:b/>
+          <w:bCs/>
+          <w:noProof/>
           <w:lang w:val="en-GB"/>
         </w:rPr>
         <w:t>Main Responsibilities</w:t>
@@ -1532,6 +2094,7 @@
           <w:rFonts w:ascii="Arial" w:hAnsi="Arial" w:cs="Arial"/>
           <w:b/>
           <w:bCs/>
+          <w:noProof/>
           <w:sz w:val="22"/>
           <w:szCs w:val="22"/>
           <w:lang w:val="en-GB"/>
@@ -1553,15 +2116,17 @@
         <w:rPr>
           <w:rFonts w:ascii="Arial" w:hAnsi="Arial" w:cs="Arial"/>
           <w:bCs/>
-          <w:sz w:val="22"/>
-          <w:szCs w:val="22"/>
-          <w:lang w:val="en-GB"/>
-        </w:rPr>
-      </w:pPr>
-      <w:r>
-        <w:rPr>
-          <w:rFonts w:ascii="Arial" w:hAnsi="Arial" w:cs="Arial"/>
-          <w:bCs/>
+          <w:noProof/>
+          <w:sz w:val="22"/>
+          <w:szCs w:val="22"/>
+          <w:lang w:val="en-GB"/>
+        </w:rPr>
+      </w:pPr>
+      <w:r>
+        <w:rPr>
+          <w:rFonts w:ascii="Arial" w:hAnsi="Arial" w:cs="Arial"/>
+          <w:bCs/>
+          <w:noProof/>
           <w:sz w:val="22"/>
           <w:szCs w:val="22"/>
           <w:lang w:val="en-GB"/>
@@ -1572,6 +2137,7 @@
         <w:rPr>
           <w:rFonts w:ascii="Arial" w:hAnsi="Arial" w:cs="Arial"/>
           <w:bCs/>
+          <w:noProof/>
           <w:sz w:val="22"/>
           <w:szCs w:val="22"/>
           <w:lang w:val="en-GB"/>
@@ -1582,6 +2148,7 @@
         <w:rPr>
           <w:rFonts w:ascii="Arial" w:hAnsi="Arial" w:cs="Arial"/>
           <w:bCs/>
+          <w:noProof/>
           <w:sz w:val="22"/>
           <w:szCs w:val="22"/>
           <w:lang w:val="en-GB"/>
@@ -1604,15 +2171,17 @@
         <w:rPr>
           <w:rFonts w:ascii="Arial" w:hAnsi="Arial" w:cs="Arial"/>
           <w:bCs/>
-          <w:sz w:val="22"/>
-          <w:szCs w:val="22"/>
-          <w:lang w:val="en-GB"/>
-        </w:rPr>
-      </w:pPr>
-      <w:r>
-        <w:rPr>
-          <w:rFonts w:ascii="Arial" w:hAnsi="Arial" w:cs="Arial"/>
-          <w:bCs/>
+          <w:noProof/>
+          <w:sz w:val="22"/>
+          <w:szCs w:val="22"/>
+          <w:lang w:val="en-GB"/>
+        </w:rPr>
+      </w:pPr>
+      <w:r>
+        <w:rPr>
+          <w:rFonts w:ascii="Arial" w:hAnsi="Arial" w:cs="Arial"/>
+          <w:bCs/>
+          <w:noProof/>
           <w:sz w:val="22"/>
           <w:szCs w:val="22"/>
           <w:lang w:val="en-GB"/>
@@ -1623,6 +2192,7 @@
         <w:rPr>
           <w:rFonts w:ascii="Arial" w:hAnsi="Arial" w:cs="Arial"/>
           <w:bCs/>
+          <w:noProof/>
           <w:sz w:val="22"/>
           <w:szCs w:val="22"/>
           <w:lang w:val="en-GB"/>
@@ -1633,6 +2203,7 @@
         <w:rPr>
           <w:rFonts w:ascii="Arial" w:hAnsi="Arial" w:cs="Arial"/>
           <w:bCs/>
+          <w:noProof/>
           <w:sz w:val="22"/>
           <w:szCs w:val="22"/>
           <w:lang w:val="en-GB"/>
@@ -1659,6 +2230,7 @@
         <w:jc w:val="both"/>
         <w:rPr>
           <w:rFonts w:ascii="Arial" w:hAnsi="Arial" w:cs="Arial"/>
+          <w:noProof/>
           <w:sz w:val="20"/>
           <w:szCs w:val="20"/>
           <w:lang w:val="en-GB"/>
@@ -1668,6 +2240,7 @@
         <w:rPr>
           <w:rFonts w:ascii="Arial" w:hAnsi="Arial" w:cs="Arial"/>
           <w:bCs/>
+          <w:noProof/>
           <w:sz w:val="22"/>
           <w:szCs w:val="22"/>
           <w:lang w:val="en-GB"/>
@@ -1677,24 +2250,51 @@
     </w:p>
     <w:p>
       <w:pPr>
-        <w:pStyle w:val="NormalWeb"/>
-        <w:widowControl w:val="0"/>
-        <w:shd w:val="clear" w:color="auto" w:fill="FFFFFF"/>
-        <w:overflowPunct w:val="0"/>
         <w:autoSpaceDE w:val="0"/>
         <w:autoSpaceDN w:val="0"/>
         <w:adjustRightInd w:val="0"/>
-        <w:spacing w:after="200" w:afterAutospacing="0" w:line="276" w:lineRule="auto"/>
-        <w:ind w:left="714"/>
-        <w:contextualSpacing/>
-        <w:jc w:val="both"/>
-        <w:rPr>
-          <w:rFonts w:ascii="Arial" w:hAnsi="Arial" w:cs="Arial"/>
-          <w:sz w:val="20"/>
-          <w:szCs w:val="20"/>
-          <w:lang w:val="en-GB"/>
-        </w:rPr>
-      </w:pPr>
+        <w:rPr>
+          <w:rFonts w:cs="Arial"/>
+          <w:noProof/>
+          <w:sz w:val="24"/>
+          <w:u w:val="single" w:color="1F4E79" w:themeColor="accent1" w:themeShade="80"/>
+          <w:lang w:val="en-GB"/>
+        </w:rPr>
+      </w:pPr>
+      <w:r>
+        <w:rPr>
+          <w:rFonts w:cs="Arial"/>
+          <w:b/>
+          <w:noProof/>
+          <w:sz w:val="24"/>
+          <w:u w:val="single" w:color="1F4E79" w:themeColor="accent1" w:themeShade="80"/>
+          <w:lang w:val="en-GB"/>
+        </w:rPr>
+        <w:lastRenderedPageBreak/>
+        <w:t>Ericsson Ireland</w:t>
+      </w:r>
+      <w:r>
+        <w:rPr>
+          <w:rFonts w:cs="Arial"/>
+          <w:b/>
+          <w:noProof/>
+          <w:sz w:val="24"/>
+          <w:u w:val="single" w:color="1F4E79" w:themeColor="accent1" w:themeShade="80"/>
+          <w:lang w:val="en-GB"/>
+        </w:rPr>
+        <w:t xml:space="preserve">:  </w:t>
+      </w:r>
+      <w:r>
+        <w:rPr>
+          <w:rFonts w:cs="Arial"/>
+          <w:b/>
+          <w:noProof/>
+          <w:sz w:val="24"/>
+          <w:u w:val="single" w:color="1F4E79" w:themeColor="accent1" w:themeShade="80"/>
+          <w:lang w:val="en-GB"/>
+        </w:rPr>
+        <w:t>Athlone, Co Westmeath</w:t>
+      </w:r>
     </w:p>
     <w:p>
       <w:pPr>
@@ -1703,37 +2303,12 @@
         <w:adjustRightInd w:val="0"/>
         <w:rPr>
           <w:rFonts w:cs="Arial"/>
-          <w:sz w:val="24"/>
-          <w:lang w:val="en-GB"/>
-        </w:rPr>
-      </w:pPr>
-      <w:r>
-        <w:rPr>
-          <w:rFonts w:cs="Arial"/>
-          <w:b/>
-          <w:sz w:val="24"/>
-          <w:lang w:val="en-GB"/>
-        </w:rPr>
-        <w:t>Ericsson Ireland</w:t>
-      </w:r>
-      <w:r>
-        <w:rPr>
-          <w:rFonts w:cs="Arial"/>
-          <w:b/>
-          <w:sz w:val="24"/>
-          <w:lang w:val="en-GB"/>
-        </w:rPr>
-        <w:t xml:space="preserve">:  </w:t>
-      </w:r>
-      <w:r>
-        <w:rPr>
-          <w:rFonts w:cs="Arial"/>
-          <w:b/>
-          <w:sz w:val="24"/>
-          <w:lang w:val="en-GB"/>
-        </w:rPr>
-        <w:t>Athlone, Co Westmeath</w:t>
-      </w:r>
+          <w:noProof/>
+          <w:sz w:val="20"/>
+          <w:szCs w:val="20"/>
+          <w:lang w:val="en-GB"/>
+        </w:rPr>
+      </w:pPr>
     </w:p>
     <w:p>
       <w:pPr>
@@ -1742,27 +2317,26 @@
         <w:adjustRightInd w:val="0"/>
         <w:rPr>
           <w:rFonts w:cs="Arial"/>
-          <w:sz w:val="20"/>
-          <w:szCs w:val="20"/>
-          <w:lang w:val="en-GB"/>
-        </w:rPr>
-      </w:pPr>
-    </w:p>
-    <w:p>
-      <w:pPr>
-        <w:autoSpaceDE w:val="0"/>
-        <w:autoSpaceDN w:val="0"/>
-        <w:adjustRightInd w:val="0"/>
-        <w:rPr>
-          <w:rFonts w:cs="Arial"/>
-          <w:sz w:val="24"/>
-          <w:lang w:val="en-GB"/>
-        </w:rPr>
-      </w:pPr>
-      <w:r>
-        <w:rPr>
-          <w:rFonts w:cs="Arial"/>
-          <w:b/>
+          <w:noProof/>
+          <w:sz w:val="24"/>
+          <w:lang w:val="en-GB"/>
+        </w:rPr>
+      </w:pPr>
+      <w:r>
+        <w:rPr>
+          <w:rFonts w:cs="Arial"/>
+          <w:b/>
+          <w:noProof/>
+          <w:sz w:val="24"/>
+          <w:lang w:val="en-GB"/>
+        </w:rPr>
+        <w:t xml:space="preserve">   </w:t>
+      </w:r>
+      <w:r>
+        <w:rPr>
+          <w:rFonts w:cs="Arial"/>
+          <w:b/>
+          <w:noProof/>
           <w:sz w:val="24"/>
           <w:lang w:val="en-GB"/>
         </w:rPr>
@@ -1772,6 +2346,7 @@
         <w:rPr>
           <w:rFonts w:cs="Arial"/>
           <w:b/>
+          <w:noProof/>
           <w:sz w:val="24"/>
           <w:lang w:val="en-GB"/>
         </w:rPr>
@@ -1781,6 +2356,7 @@
         <w:rPr>
           <w:rFonts w:cs="Arial"/>
           <w:b/>
+          <w:noProof/>
           <w:sz w:val="24"/>
           <w:lang w:val="en-GB"/>
         </w:rPr>
@@ -1789,6 +2365,7 @@
       <w:r>
         <w:rPr>
           <w:rFonts w:cs="Arial"/>
+          <w:noProof/>
           <w:szCs w:val="22"/>
           <w:lang w:val="en-GB"/>
         </w:rPr>
@@ -1797,6 +2374,7 @@
       <w:r>
         <w:rPr>
           <w:rFonts w:cs="Arial"/>
+          <w:noProof/>
           <w:szCs w:val="22"/>
           <w:lang w:val="en-GB"/>
         </w:rPr>
@@ -1805,6 +2383,7 @@
       <w:r>
         <w:rPr>
           <w:rFonts w:cs="Arial"/>
+          <w:noProof/>
           <w:szCs w:val="22"/>
           <w:lang w:val="en-GB"/>
         </w:rPr>
@@ -1815,6 +2394,7 @@
         <w:rPr>
           <w:rFonts w:cs="Arial"/>
           <w:b/>
+          <w:noProof/>
           <w:sz w:val="24"/>
           <w:lang w:val="en-GB"/>
         </w:rPr>
@@ -1826,18 +2406,21 @@
         <w:pStyle w:val="NormalWeb"/>
         <w:shd w:val="clear" w:color="auto" w:fill="FFFFFF"/>
         <w:spacing w:after="0" w:afterAutospacing="0"/>
-        <w:rPr>
-          <w:rFonts w:ascii="Arial" w:hAnsi="Arial" w:cs="Arial"/>
-          <w:b/>
-          <w:bCs/>
-          <w:lang w:val="en-GB"/>
-        </w:rPr>
-      </w:pPr>
-      <w:r>
-        <w:rPr>
-          <w:rFonts w:ascii="Arial" w:hAnsi="Arial" w:cs="Arial"/>
-          <w:b/>
-          <w:bCs/>
+        <w:ind w:firstLine="357"/>
+        <w:rPr>
+          <w:rFonts w:ascii="Arial" w:hAnsi="Arial" w:cs="Arial"/>
+          <w:b/>
+          <w:bCs/>
+          <w:noProof/>
+          <w:lang w:val="en-GB"/>
+        </w:rPr>
+      </w:pPr>
+      <w:r>
+        <w:rPr>
+          <w:rFonts w:ascii="Arial" w:hAnsi="Arial" w:cs="Arial"/>
+          <w:b/>
+          <w:bCs/>
+          <w:noProof/>
           <w:lang w:val="en-GB"/>
         </w:rPr>
         <w:t>Main Responsibilities</w:t>
@@ -1852,6 +2435,7 @@
           <w:rFonts w:ascii="Arial" w:hAnsi="Arial" w:cs="Arial"/>
           <w:b/>
           <w:bCs/>
+          <w:noProof/>
           <w:sz w:val="22"/>
           <w:szCs w:val="22"/>
           <w:lang w:val="en-GB"/>
@@ -1872,15 +2456,17 @@
         <w:rPr>
           <w:rFonts w:ascii="Arial" w:hAnsi="Arial" w:cs="Arial"/>
           <w:bCs/>
-          <w:sz w:val="22"/>
-          <w:szCs w:val="22"/>
-          <w:lang w:val="en-GB"/>
-        </w:rPr>
-      </w:pPr>
-      <w:r>
-        <w:rPr>
-          <w:rFonts w:ascii="Arial" w:hAnsi="Arial" w:cs="Arial"/>
-          <w:bCs/>
+          <w:noProof/>
+          <w:sz w:val="22"/>
+          <w:szCs w:val="22"/>
+          <w:lang w:val="en-GB"/>
+        </w:rPr>
+      </w:pPr>
+      <w:r>
+        <w:rPr>
+          <w:rFonts w:ascii="Arial" w:hAnsi="Arial" w:cs="Arial"/>
+          <w:bCs/>
+          <w:noProof/>
           <w:sz w:val="22"/>
           <w:szCs w:val="22"/>
           <w:lang w:val="en-GB"/>
@@ -1891,6 +2477,7 @@
         <w:rPr>
           <w:rFonts w:ascii="Arial" w:hAnsi="Arial" w:cs="Arial"/>
           <w:bCs/>
+          <w:noProof/>
           <w:sz w:val="22"/>
           <w:szCs w:val="22"/>
           <w:lang w:val="en-GB"/>
@@ -1912,31 +2499,77 @@
         <w:rPr>
           <w:rFonts w:ascii="Arial" w:hAnsi="Arial" w:cs="Arial"/>
           <w:bCs/>
-          <w:sz w:val="22"/>
-          <w:szCs w:val="22"/>
-          <w:lang w:val="en-GB"/>
-        </w:rPr>
-      </w:pPr>
-      <w:r>
-        <w:rPr>
-          <w:rFonts w:ascii="Arial" w:hAnsi="Arial" w:cs="Arial"/>
-          <w:bCs/>
-          <w:sz w:val="22"/>
-          <w:szCs w:val="22"/>
-          <w:lang w:val="en-GB"/>
-        </w:rPr>
-        <w:lastRenderedPageBreak/>
+          <w:noProof/>
+          <w:sz w:val="22"/>
+          <w:szCs w:val="22"/>
+          <w:lang w:val="en-GB"/>
+        </w:rPr>
+      </w:pPr>
+      <w:r>
+        <w:rPr>
+          <w:rFonts w:ascii="Arial" w:hAnsi="Arial" w:cs="Arial"/>
+          <w:bCs/>
+          <w:noProof/>
+          <w:sz w:val="22"/>
+          <w:szCs w:val="22"/>
+          <w:lang w:val="en-GB"/>
+        </w:rPr>
         <w:t>Gathering</w:t>
       </w:r>
       <w:r>
         <w:rPr>
           <w:rFonts w:ascii="Arial" w:hAnsi="Arial" w:cs="Arial"/>
           <w:bCs/>
-          <w:sz w:val="22"/>
-          <w:szCs w:val="22"/>
-          <w:lang w:val="en-GB"/>
-        </w:rPr>
-        <w:t xml:space="preserve"> requirements, coding, testing, documenting and the delivery of software at set intervals.</w:t>
+          <w:noProof/>
+          <w:sz w:val="22"/>
+          <w:szCs w:val="22"/>
+          <w:lang w:val="en-GB"/>
+        </w:rPr>
+        <w:t xml:space="preserve"> requirements, co</w:t>
+      </w:r>
+      <w:r>
+        <w:rPr>
+          <w:rFonts w:ascii="Arial" w:hAnsi="Arial" w:cs="Arial"/>
+          <w:bCs/>
+          <w:noProof/>
+          <w:sz w:val="22"/>
+          <w:szCs w:val="22"/>
+          <w:lang w:val="en-GB"/>
+        </w:rPr>
+        <w:t xml:space="preserve">ding, testing, documenting and </w:t>
+      </w:r>
+      <w:r>
+        <w:rPr>
+          <w:rFonts w:ascii="Arial" w:hAnsi="Arial" w:cs="Arial"/>
+          <w:bCs/>
+          <w:noProof/>
+          <w:sz w:val="22"/>
+          <w:szCs w:val="22"/>
+          <w:lang w:val="en-GB"/>
+        </w:rPr>
+        <w:t>software</w:t>
+      </w:r>
+      <w:r>
+        <w:rPr>
+          <w:rFonts w:ascii="Arial" w:hAnsi="Arial" w:cs="Arial"/>
+          <w:bCs/>
+          <w:noProof/>
+          <w:sz w:val="22"/>
+          <w:szCs w:val="22"/>
+          <w:lang w:val="en-GB"/>
+        </w:rPr>
+        <w:t xml:space="preserve"> delivery</w:t>
+      </w:r>
+      <w:r>
+        <w:rPr>
+          <w:rFonts w:ascii="Arial" w:hAnsi="Arial" w:cs="Arial"/>
+          <w:bCs/>
+          <w:noProof/>
+          <w:sz w:val="22"/>
+          <w:szCs w:val="22"/>
+          <w:lang w:val="en-GB"/>
+        </w:rPr>
+        <w:t xml:space="preserve"> at set intervals.</w:t>
       </w:r>
     </w:p>
     <w:p>
@@ -1955,6 +2588,7 @@
         <w:jc w:val="both"/>
         <w:rPr>
           <w:rFonts w:cs="Arial"/>
+          <w:noProof/>
           <w:sz w:val="20"/>
           <w:szCs w:val="20"/>
           <w:lang w:val="en-GB"/>
@@ -1963,6 +2597,7 @@
       <w:r>
         <w:rPr>
           <w:rFonts w:cs="Arial"/>
+          <w:noProof/>
           <w:color w:val="000000"/>
           <w:szCs w:val="22"/>
           <w:lang w:val="en-GB"/>
@@ -1972,6 +2607,7 @@
       <w:r>
         <w:rPr>
           <w:rFonts w:cs="Arial"/>
+          <w:noProof/>
           <w:color w:val="000000"/>
           <w:szCs w:val="22"/>
           <w:lang w:val="en-GB"/>
@@ -1981,6 +2617,7 @@
       <w:r>
         <w:rPr>
           <w:rFonts w:cs="Arial"/>
+          <w:noProof/>
           <w:color w:val="000000"/>
           <w:szCs w:val="22"/>
           <w:lang w:val="en-GB"/>
@@ -1990,6 +2627,7 @@
       <w:r>
         <w:rPr>
           <w:rFonts w:cs="Arial"/>
+          <w:noProof/>
           <w:color w:val="000000"/>
           <w:szCs w:val="22"/>
           <w:lang w:val="en-GB"/>
@@ -2009,6 +2647,7 @@
         <w:jc w:val="both"/>
         <w:rPr>
           <w:rFonts w:cs="Arial"/>
+          <w:noProof/>
           <w:sz w:val="20"/>
           <w:szCs w:val="20"/>
           <w:lang w:val="en-GB"/>
@@ -2025,15 +2664,19 @@
         <w:rPr>
           <w:rFonts w:cs="Arial"/>
           <w:b/>
-          <w:sz w:val="24"/>
-          <w:lang w:val="en-GB"/>
-        </w:rPr>
-      </w:pPr>
-      <w:r>
-        <w:rPr>
-          <w:rFonts w:cs="Arial"/>
-          <w:b/>
-          <w:sz w:val="24"/>
+          <w:noProof/>
+          <w:sz w:val="24"/>
+          <w:u w:val="single" w:color="1F4E79" w:themeColor="accent1" w:themeShade="80"/>
+          <w:lang w:val="en-GB"/>
+        </w:rPr>
+      </w:pPr>
+      <w:r>
+        <w:rPr>
+          <w:rFonts w:cs="Arial"/>
+          <w:b/>
+          <w:noProof/>
+          <w:sz w:val="24"/>
+          <w:u w:val="single" w:color="1F4E79" w:themeColor="accent1" w:themeShade="80"/>
           <w:lang w:val="en-GB"/>
         </w:rPr>
         <w:t>O’Doherty’</w:t>
@@ -2042,7 +2685,9 @@
         <w:rPr>
           <w:rFonts w:cs="Arial"/>
           <w:b/>
-          <w:sz w:val="24"/>
+          <w:noProof/>
+          <w:sz w:val="24"/>
+          <w:u w:val="single" w:color="1F4E79" w:themeColor="accent1" w:themeShade="80"/>
           <w:lang w:val="en-GB"/>
         </w:rPr>
         <w:t xml:space="preserve">s Audio and Video Productions:  </w:t>
@@ -2051,7 +2696,9 @@
         <w:rPr>
           <w:rFonts w:cs="Arial"/>
           <w:b/>
-          <w:sz w:val="24"/>
+          <w:noProof/>
+          <w:sz w:val="24"/>
+          <w:u w:val="single" w:color="1F4E79" w:themeColor="accent1" w:themeShade="80"/>
           <w:lang w:val="en-GB"/>
         </w:rPr>
         <w:t>Clondalkin, Dublin 22</w:t>
@@ -2061,6 +2708,7 @@
       <w:pPr>
         <w:rPr>
           <w:rFonts w:cs="Arial"/>
+          <w:noProof/>
           <w:sz w:val="20"/>
           <w:szCs w:val="20"/>
           <w:lang w:val="en-GB"/>
@@ -2073,14 +2721,26 @@
         <w:rPr>
           <w:rFonts w:cs="Arial"/>
           <w:b/>
-          <w:sz w:val="24"/>
-          <w:lang w:val="en-GB"/>
-        </w:rPr>
-      </w:pPr>
-      <w:r>
-        <w:rPr>
-          <w:rFonts w:cs="Arial"/>
-          <w:b/>
+          <w:noProof/>
+          <w:sz w:val="24"/>
+          <w:lang w:val="en-GB"/>
+        </w:rPr>
+      </w:pPr>
+      <w:r>
+        <w:rPr>
+          <w:rFonts w:cs="Arial"/>
+          <w:b/>
+          <w:noProof/>
+          <w:sz w:val="24"/>
+          <w:lang w:val="en-GB"/>
+        </w:rPr>
+        <w:t xml:space="preserve">   </w:t>
+      </w:r>
+      <w:r>
+        <w:rPr>
+          <w:rFonts w:cs="Arial"/>
+          <w:b/>
+          <w:noProof/>
           <w:sz w:val="24"/>
           <w:lang w:val="en-GB"/>
         </w:rPr>
@@ -2090,6 +2750,7 @@
         <w:rPr>
           <w:rFonts w:cs="Arial"/>
           <w:b/>
+          <w:noProof/>
           <w:sz w:val="24"/>
           <w:lang w:val="en-GB"/>
         </w:rPr>
@@ -2099,6 +2760,7 @@
         <w:rPr>
           <w:rFonts w:cs="Arial"/>
           <w:b/>
+          <w:noProof/>
           <w:sz w:val="24"/>
           <w:lang w:val="en-GB"/>
         </w:rPr>
@@ -2108,6 +2770,7 @@
         <w:rPr>
           <w:rFonts w:cs="Arial"/>
           <w:b/>
+          <w:noProof/>
           <w:sz w:val="24"/>
           <w:lang w:val="en-GB"/>
         </w:rPr>
@@ -2117,15 +2780,7 @@
         <w:rPr>
           <w:rFonts w:cs="Arial"/>
           <w:b/>
-          <w:sz w:val="24"/>
-          <w:lang w:val="en-GB"/>
-        </w:rPr>
-        <w:tab/>
-      </w:r>
-      <w:r>
-        <w:rPr>
-          <w:rFonts w:cs="Arial"/>
-          <w:b/>
+          <w:noProof/>
           <w:sz w:val="24"/>
           <w:lang w:val="en-GB"/>
         </w:rPr>
@@ -2136,6 +2791,7 @@
         <w:rPr>
           <w:rFonts w:cs="Arial"/>
           <w:b/>
+          <w:noProof/>
           <w:sz w:val="24"/>
           <w:lang w:val="en-GB"/>
         </w:rPr>
@@ -2145,6 +2801,7 @@
         <w:rPr>
           <w:rFonts w:cs="Arial"/>
           <w:b/>
+          <w:noProof/>
           <w:sz w:val="24"/>
           <w:lang w:val="en-GB"/>
         </w:rPr>
@@ -2156,18 +2813,21 @@
         <w:pStyle w:val="NormalWeb"/>
         <w:shd w:val="clear" w:color="auto" w:fill="FFFFFF"/>
         <w:spacing w:after="0" w:afterAutospacing="0"/>
-        <w:rPr>
-          <w:rFonts w:ascii="Arial" w:hAnsi="Arial" w:cs="Arial"/>
-          <w:b/>
-          <w:bCs/>
-          <w:lang w:val="en-GB"/>
-        </w:rPr>
-      </w:pPr>
-      <w:r>
-        <w:rPr>
-          <w:rFonts w:ascii="Arial" w:hAnsi="Arial" w:cs="Arial"/>
-          <w:b/>
-          <w:bCs/>
+        <w:ind w:firstLine="357"/>
+        <w:rPr>
+          <w:rFonts w:ascii="Arial" w:hAnsi="Arial" w:cs="Arial"/>
+          <w:b/>
+          <w:bCs/>
+          <w:noProof/>
+          <w:lang w:val="en-GB"/>
+        </w:rPr>
+      </w:pPr>
+      <w:r>
+        <w:rPr>
+          <w:rFonts w:ascii="Arial" w:hAnsi="Arial" w:cs="Arial"/>
+          <w:b/>
+          <w:bCs/>
+          <w:noProof/>
           <w:lang w:val="en-GB"/>
         </w:rPr>
         <w:t xml:space="preserve">Main Responsibilities </w:t>
@@ -2183,6 +2843,7 @@
         <w:jc w:val="both"/>
         <w:rPr>
           <w:rFonts w:cs="Arial"/>
+          <w:noProof/>
           <w:szCs w:val="22"/>
           <w:lang w:val="en-GB"/>
         </w:rPr>
@@ -2202,15 +2863,17 @@
         <w:rPr>
           <w:rFonts w:ascii="Arial" w:hAnsi="Arial" w:cs="Arial"/>
           <w:bCs/>
-          <w:sz w:val="22"/>
-          <w:szCs w:val="22"/>
-          <w:lang w:val="en-GB"/>
-        </w:rPr>
-      </w:pPr>
-      <w:r>
-        <w:rPr>
-          <w:rFonts w:ascii="Arial" w:hAnsi="Arial" w:cs="Arial"/>
-          <w:bCs/>
+          <w:noProof/>
+          <w:sz w:val="22"/>
+          <w:szCs w:val="22"/>
+          <w:lang w:val="en-GB"/>
+        </w:rPr>
+      </w:pPr>
+      <w:r>
+        <w:rPr>
+          <w:rFonts w:ascii="Arial" w:hAnsi="Arial" w:cs="Arial"/>
+          <w:bCs/>
+          <w:noProof/>
           <w:sz w:val="22"/>
           <w:szCs w:val="22"/>
           <w:lang w:val="en-GB"/>
@@ -2221,36 +2884,51 @@
         <w:rPr>
           <w:rFonts w:ascii="Arial" w:hAnsi="Arial" w:cs="Arial"/>
           <w:bCs/>
-          <w:sz w:val="22"/>
-          <w:szCs w:val="22"/>
-          <w:lang w:val="en-GB"/>
-        </w:rPr>
-        <w:t>ecording, archiving and selling of horse racing footage onto various types of media formats. Digitally editting footage to create montage clips</w:t>
-      </w:r>
-      <w:r>
-        <w:rPr>
-          <w:rFonts w:ascii="Arial" w:hAnsi="Arial" w:cs="Arial"/>
-          <w:bCs/>
-          <w:sz w:val="22"/>
-          <w:szCs w:val="22"/>
-          <w:lang w:val="en-GB"/>
-        </w:rPr>
-        <w:t xml:space="preserve"> or </w:t>
-      </w:r>
-      <w:r>
-        <w:rPr>
-          <w:rFonts w:ascii="Arial" w:hAnsi="Arial" w:cs="Arial"/>
-          <w:bCs/>
-          <w:sz w:val="22"/>
-          <w:szCs w:val="22"/>
-          <w:lang w:val="en-GB"/>
-        </w:rPr>
-        <w:t>add graphics</w:t>
-      </w:r>
-      <w:r>
-        <w:rPr>
-          <w:rFonts w:ascii="Arial" w:hAnsi="Arial" w:cs="Arial"/>
-          <w:bCs/>
+          <w:noProof/>
+          <w:sz w:val="22"/>
+          <w:szCs w:val="22"/>
+          <w:lang w:val="en-GB"/>
+        </w:rPr>
+        <w:t xml:space="preserve">ecording, archiving and selling of horse racing footage onto various types of media formats. Digitally </w:t>
+      </w:r>
+      <w:r>
+        <w:rPr>
+          <w:rFonts w:ascii="Arial" w:hAnsi="Arial" w:cs="Arial"/>
+          <w:bCs/>
+          <w:noProof/>
+          <w:sz w:val="22"/>
+          <w:szCs w:val="22"/>
+          <w:lang w:val="en-GB"/>
+        </w:rPr>
+        <w:t>editing</w:t>
+      </w:r>
+      <w:r>
+        <w:rPr>
+          <w:rFonts w:ascii="Arial" w:hAnsi="Arial" w:cs="Arial"/>
+          <w:bCs/>
+          <w:noProof/>
+          <w:sz w:val="22"/>
+          <w:szCs w:val="22"/>
+          <w:lang w:val="en-GB"/>
+        </w:rPr>
+        <w:t xml:space="preserve"> footage to create montage clips</w:t>
+      </w:r>
+      <w:r>
+        <w:rPr>
+          <w:rFonts w:ascii="Arial" w:hAnsi="Arial" w:cs="Arial"/>
+          <w:bCs/>
+          <w:noProof/>
+          <w:sz w:val="22"/>
+          <w:szCs w:val="22"/>
+          <w:lang w:val="en-GB"/>
+        </w:rPr>
+        <w:t xml:space="preserve"> or add graphics</w:t>
+      </w:r>
+      <w:r>
+        <w:rPr>
+          <w:rFonts w:ascii="Arial" w:hAnsi="Arial" w:cs="Arial"/>
+          <w:bCs/>
+          <w:noProof/>
           <w:sz w:val="22"/>
           <w:szCs w:val="22"/>
           <w:lang w:val="en-GB"/>
@@ -2272,15 +2950,17 @@
         <w:rPr>
           <w:rFonts w:ascii="Arial" w:hAnsi="Arial" w:cs="Arial"/>
           <w:bCs/>
-          <w:sz w:val="22"/>
-          <w:szCs w:val="22"/>
-          <w:lang w:val="en-GB"/>
-        </w:rPr>
-      </w:pPr>
-      <w:r>
-        <w:rPr>
-          <w:rFonts w:ascii="Arial" w:hAnsi="Arial" w:cs="Arial"/>
-          <w:bCs/>
+          <w:noProof/>
+          <w:sz w:val="22"/>
+          <w:szCs w:val="22"/>
+          <w:lang w:val="en-GB"/>
+        </w:rPr>
+      </w:pPr>
+      <w:r>
+        <w:rPr>
+          <w:rFonts w:ascii="Arial" w:hAnsi="Arial" w:cs="Arial"/>
+          <w:bCs/>
+          <w:noProof/>
           <w:sz w:val="22"/>
           <w:szCs w:val="22"/>
           <w:lang w:val="en-GB"/>
@@ -2298,6 +2978,7 @@
         <w:rPr>
           <w:rFonts w:ascii="Arial" w:hAnsi="Arial" w:cs="Arial"/>
           <w:bCs/>
+          <w:noProof/>
           <w:sz w:val="22"/>
           <w:szCs w:val="22"/>
           <w:lang w:val="en-GB"/>
@@ -2314,6 +2995,7 @@
         <w:rPr>
           <w:rFonts w:ascii="Arial" w:hAnsi="Arial" w:cs="Arial"/>
           <w:b/>
+          <w:noProof/>
           <w:color w:val="1F4E79" w:themeColor="accent1" w:themeShade="80"/>
           <w:sz w:val="24"/>
           <w:lang w:val="en-GB"/>
@@ -2323,6 +3005,7 @@
         <w:rPr>
           <w:rFonts w:ascii="Arial" w:hAnsi="Arial" w:cs="Arial"/>
           <w:b/>
+          <w:noProof/>
           <w:color w:val="1F4E79" w:themeColor="accent1" w:themeShade="80"/>
           <w:sz w:val="24"/>
           <w:lang w:val="en-GB"/>
@@ -2336,6 +3019,7 @@
         <w:ind w:left="0"/>
         <w:rPr>
           <w:rFonts w:ascii="Arial" w:hAnsi="Arial"/>
+          <w:noProof/>
           <w:color w:val="auto"/>
           <w:sz w:val="20"/>
           <w:szCs w:val="20"/>
@@ -2350,6 +3034,7 @@
         <w:rPr>
           <w:rFonts w:ascii="Arial" w:hAnsi="Arial"/>
           <w:b/>
+          <w:noProof/>
           <w:color w:val="auto"/>
           <w:sz w:val="24"/>
           <w:lang w:val="en-GB"/>
@@ -2359,8 +3044,10 @@
         <w:rPr>
           <w:rFonts w:ascii="Arial" w:hAnsi="Arial"/>
           <w:b/>
+          <w:noProof/>
           <w:color w:val="auto"/>
           <w:sz w:val="24"/>
+          <w:u w:val="single" w:color="1F4E79" w:themeColor="accent1" w:themeShade="80"/>
           <w:lang w:val="en-GB"/>
         </w:rPr>
         <w:t>Institute o</w:t>
@@ -2369,8 +3056,10 @@
         <w:rPr>
           <w:rFonts w:ascii="Arial" w:hAnsi="Arial"/>
           <w:b/>
+          <w:noProof/>
           <w:color w:val="auto"/>
           <w:sz w:val="24"/>
+          <w:u w:val="single" w:color="1F4E79" w:themeColor="accent1" w:themeShade="80"/>
           <w:lang w:val="en-GB"/>
         </w:rPr>
         <w:t>f Technology Tallaght, Dublin 24</w:t>
@@ -2379,6 +3068,7 @@
         <w:rPr>
           <w:rFonts w:ascii="Arial" w:hAnsi="Arial"/>
           <w:b/>
+          <w:noProof/>
           <w:color w:val="auto"/>
           <w:sz w:val="24"/>
           <w:lang w:val="en-GB"/>
@@ -2389,6 +3079,7 @@
         <w:rPr>
           <w:rFonts w:ascii="Arial" w:hAnsi="Arial"/>
           <w:b/>
+          <w:noProof/>
           <w:color w:val="auto"/>
           <w:sz w:val="24"/>
           <w:lang w:val="en-GB"/>
@@ -2399,6 +3090,7 @@
         <w:rPr>
           <w:rFonts w:ascii="Arial" w:hAnsi="Arial"/>
           <w:b/>
+          <w:noProof/>
           <w:color w:val="auto"/>
           <w:sz w:val="24"/>
           <w:lang w:val="en-GB"/>
@@ -2409,6 +3101,7 @@
         <w:rPr>
           <w:rFonts w:ascii="Arial" w:hAnsi="Arial"/>
           <w:b/>
+          <w:noProof/>
           <w:color w:val="auto"/>
           <w:sz w:val="24"/>
           <w:lang w:val="en-GB"/>
@@ -2419,6 +3112,7 @@
         <w:rPr>
           <w:rFonts w:ascii="Arial" w:hAnsi="Arial"/>
           <w:b/>
+          <w:noProof/>
           <w:color w:val="auto"/>
           <w:sz w:val="24"/>
           <w:lang w:val="en-GB"/>
@@ -2430,6 +3124,7 @@
         <w:rPr>
           <w:rFonts w:ascii="Arial" w:hAnsi="Arial"/>
           <w:b/>
+          <w:noProof/>
           <w:color w:val="auto"/>
           <w:sz w:val="24"/>
           <w:lang w:val="en-GB"/>
@@ -2440,6 +3135,7 @@
         <w:rPr>
           <w:rFonts w:ascii="Arial" w:hAnsi="Arial"/>
           <w:b/>
+          <w:noProof/>
           <w:color w:val="auto"/>
           <w:sz w:val="24"/>
           <w:lang w:val="en-GB"/>
@@ -2453,6 +3149,7 @@
         <w:ind w:left="0"/>
         <w:rPr>
           <w:rFonts w:ascii="Arial" w:hAnsi="Arial"/>
+          <w:noProof/>
           <w:color w:val="auto"/>
           <w:sz w:val="20"/>
           <w:szCs w:val="20"/>
@@ -2467,6 +3164,7 @@
         <w:rPr>
           <w:rFonts w:ascii="Arial" w:hAnsi="Arial"/>
           <w:b/>
+          <w:noProof/>
           <w:color w:val="auto"/>
           <w:sz w:val="24"/>
           <w:lang w:val="en-GB"/>
@@ -2476,16 +3174,29 @@
         <w:rPr>
           <w:rFonts w:ascii="Arial" w:hAnsi="Arial"/>
           <w:b/>
+          <w:noProof/>
           <w:color w:val="auto"/>
           <w:sz w:val="24"/>
           <w:lang w:val="en-GB"/>
         </w:rPr>
+        <w:t xml:space="preserve">   </w:t>
+      </w:r>
+      <w:r>
+        <w:rPr>
+          <w:rFonts w:ascii="Arial" w:hAnsi="Arial"/>
+          <w:b/>
+          <w:noProof/>
+          <w:color w:val="auto"/>
+          <w:sz w:val="24"/>
+          <w:lang w:val="en-GB"/>
+        </w:rPr>
         <w:t>BSc (Honours) in Computing</w:t>
       </w:r>
       <w:r>
         <w:rPr>
           <w:rFonts w:ascii="Arial" w:hAnsi="Arial"/>
           <w:b/>
+          <w:noProof/>
           <w:color w:val="auto"/>
           <w:sz w:val="24"/>
           <w:lang w:val="en-GB"/>
@@ -2497,6 +3208,7 @@
         <w:rPr>
           <w:rFonts w:ascii="Arial" w:hAnsi="Arial"/>
           <w:b/>
+          <w:noProof/>
           <w:color w:val="auto"/>
           <w:sz w:val="24"/>
           <w:lang w:val="en-GB"/>
@@ -2510,6 +3222,7 @@
         <w:ind w:left="0"/>
         <w:rPr>
           <w:rFonts w:ascii="Arial" w:hAnsi="Arial"/>
+          <w:noProof/>
           <w:color w:val="auto"/>
           <w:szCs w:val="22"/>
           <w:lang w:val="en-GB"/>
@@ -2518,15 +3231,27 @@
       <w:r>
         <w:rPr>
           <w:rFonts w:ascii="Arial" w:hAnsi="Arial"/>
+          <w:noProof/>
           <w:color w:val="auto"/>
           <w:szCs w:val="22"/>
           <w:lang w:val="en-GB"/>
         </w:rPr>
+        <w:t xml:space="preserve">      </w:t>
+      </w:r>
+      <w:r>
+        <w:rPr>
+          <w:rFonts w:ascii="Arial" w:hAnsi="Arial"/>
+          <w:noProof/>
+          <w:color w:val="auto"/>
+          <w:szCs w:val="22"/>
+          <w:lang w:val="en-GB"/>
+        </w:rPr>
         <w:t>Having s</w:t>
       </w:r>
       <w:r>
         <w:rPr>
           <w:rFonts w:ascii="Arial" w:hAnsi="Arial"/>
+          <w:noProof/>
           <w:color w:val="auto"/>
           <w:szCs w:val="22"/>
           <w:lang w:val="en-GB"/>
@@ -2536,6 +3261,7 @@
       <w:r>
         <w:rPr>
           <w:rFonts w:ascii="Arial" w:hAnsi="Arial"/>
+          <w:noProof/>
           <w:color w:val="auto"/>
           <w:szCs w:val="22"/>
           <w:lang w:val="en-GB"/>
@@ -2545,6 +3271,7 @@
       <w:r>
         <w:rPr>
           <w:rFonts w:ascii="Arial" w:hAnsi="Arial"/>
+          <w:noProof/>
           <w:color w:val="auto"/>
           <w:szCs w:val="22"/>
           <w:lang w:val="en-GB"/>
@@ -2555,6 +3282,7 @@
         <w:rPr>
           <w:rFonts w:ascii="Arial" w:hAnsi="Arial"/>
           <w:b/>
+          <w:noProof/>
           <w:color w:val="auto"/>
           <w:szCs w:val="22"/>
           <w:lang w:val="en-GB"/>
@@ -2569,6 +3297,7 @@
         <w:rPr>
           <w:rFonts w:ascii="Arial" w:hAnsi="Arial" w:cs="Arial"/>
           <w:b/>
+          <w:noProof/>
           <w:color w:val="auto"/>
           <w:szCs w:val="22"/>
           <w:lang w:val="en-GB"/>
@@ -2586,6 +3315,7 @@
         <w:jc w:val="both"/>
         <w:rPr>
           <w:rFonts w:ascii="Arial" w:hAnsi="Arial" w:cs="Arial"/>
+          <w:noProof/>
           <w:color w:val="auto"/>
           <w:szCs w:val="22"/>
           <w:lang w:val="en-GB"/>
@@ -2594,6 +3324,7 @@
       <w:r>
         <w:rPr>
           <w:rFonts w:ascii="Arial" w:hAnsi="Arial" w:cs="Arial"/>
+          <w:noProof/>
           <w:color w:val="auto"/>
           <w:szCs w:val="22"/>
           <w:lang w:val="en-GB"/>
@@ -2603,6 +3334,7 @@
       <w:r>
         <w:rPr>
           <w:rFonts w:ascii="Arial" w:hAnsi="Arial" w:cs="Arial"/>
+          <w:noProof/>
           <w:color w:val="auto"/>
           <w:szCs w:val="22"/>
           <w:lang w:val="en-GB"/>
@@ -2612,6 +3344,7 @@
       <w:r>
         <w:rPr>
           <w:rFonts w:ascii="Arial" w:hAnsi="Arial" w:cs="Arial"/>
+          <w:noProof/>
           <w:color w:val="auto"/>
           <w:szCs w:val="22"/>
           <w:lang w:val="en-GB"/>
@@ -2621,6 +3354,7 @@
       <w:r>
         <w:rPr>
           <w:rFonts w:ascii="Arial" w:hAnsi="Arial" w:cs="Arial"/>
+          <w:noProof/>
           <w:color w:val="auto"/>
           <w:szCs w:val="22"/>
           <w:lang w:val="en-GB"/>
@@ -2630,6 +3364,7 @@
       <w:r>
         <w:rPr>
           <w:rFonts w:ascii="Arial" w:hAnsi="Arial" w:cs="Arial"/>
+          <w:noProof/>
           <w:color w:val="auto"/>
           <w:szCs w:val="22"/>
           <w:lang w:val="en-GB"/>
@@ -2649,6 +3384,7 @@
         <w:rPr>
           <w:rFonts w:ascii="Arial" w:hAnsi="Arial" w:cs="Arial"/>
           <w:b/>
+          <w:noProof/>
           <w:color w:val="auto"/>
           <w:szCs w:val="22"/>
           <w:lang w:val="en-GB"/>
@@ -2657,6 +3393,7 @@
       <w:r>
         <w:rPr>
           <w:rFonts w:ascii="Arial" w:hAnsi="Arial" w:cs="Arial"/>
+          <w:noProof/>
           <w:color w:val="auto"/>
           <w:szCs w:val="22"/>
           <w:lang w:val="en-GB"/>
@@ -2666,6 +3403,7 @@
       <w:r>
         <w:rPr>
           <w:rFonts w:ascii="Arial" w:hAnsi="Arial" w:cs="Arial"/>
+          <w:noProof/>
           <w:color w:val="auto"/>
           <w:szCs w:val="22"/>
           <w:lang w:val="en-GB"/>
@@ -2675,6 +3413,7 @@
       <w:r>
         <w:rPr>
           <w:rFonts w:ascii="Arial" w:hAnsi="Arial" w:cs="Arial"/>
+          <w:noProof/>
           <w:color w:val="auto"/>
           <w:szCs w:val="22"/>
           <w:lang w:val="en-GB"/>
@@ -2693,7 +3432,7 @@
         <w:jc w:val="both"/>
         <w:rPr>
           <w:rFonts w:ascii="Arial" w:hAnsi="Arial" w:cs="Arial"/>
-          <w:b/>
+          <w:noProof/>
           <w:color w:val="auto"/>
           <w:szCs w:val="22"/>
           <w:lang w:val="en-GB"/>
@@ -2702,98 +3441,12 @@
       <w:r>
         <w:rPr>
           <w:rFonts w:ascii="Arial" w:hAnsi="Arial" w:cs="Arial"/>
+          <w:noProof/>
           <w:color w:val="auto"/>
           <w:szCs w:val="22"/>
           <w:lang w:val="en-GB"/>
         </w:rPr>
         <w:t>Design, developing and testing Android applications.</w:t>
-      </w:r>
-    </w:p>
-    <w:p>
-      <w:pPr>
-        <w:pStyle w:val="BodyTextIndent"/>
-        <w:numPr>
-          <w:ilvl w:val="0"/>
-          <w:numId w:val="1"/>
-        </w:numPr>
-        <w:spacing w:line="276" w:lineRule="auto"/>
-        <w:jc w:val="both"/>
-        <w:rPr>
-          <w:rFonts w:ascii="Arial" w:hAnsi="Arial" w:cs="Arial"/>
-          <w:color w:val="auto"/>
-          <w:szCs w:val="22"/>
-          <w:lang w:val="en-GB"/>
-        </w:rPr>
-      </w:pPr>
-      <w:r>
-        <w:rPr>
-          <w:rFonts w:ascii="Arial" w:hAnsi="Arial" w:cs="Arial"/>
-          <w:color w:val="auto"/>
-          <w:szCs w:val="22"/>
-          <w:lang w:val="en-GB"/>
-        </w:rPr>
-        <w:t xml:space="preserve">Competent user of Windows and Linux Operating Systems in system administration and command line interfaces. </w:t>
-      </w:r>
-    </w:p>
-    <w:p>
-      <w:pPr>
-        <w:pStyle w:val="BodyTextIndent"/>
-        <w:numPr>
-          <w:ilvl w:val="0"/>
-          <w:numId w:val="1"/>
-        </w:numPr>
-        <w:spacing w:line="276" w:lineRule="auto"/>
-        <w:jc w:val="both"/>
-        <w:rPr>
-          <w:rFonts w:ascii="Arial" w:hAnsi="Arial" w:cs="Arial"/>
-          <w:color w:val="auto"/>
-          <w:szCs w:val="22"/>
-          <w:lang w:val="en-GB"/>
-        </w:rPr>
-      </w:pPr>
-      <w:r>
-        <w:rPr>
-          <w:rFonts w:ascii="Arial" w:hAnsi="Arial" w:cs="Arial"/>
-          <w:color w:val="auto"/>
-          <w:szCs w:val="22"/>
-          <w:lang w:val="en-GB"/>
-        </w:rPr>
-        <w:t>Design programs using object orientated systems analysis and design.</w:t>
-      </w:r>
-    </w:p>
-    <w:p>
-      <w:pPr>
-        <w:pStyle w:val="BodyTextIndent"/>
-        <w:numPr>
-          <w:ilvl w:val="0"/>
-          <w:numId w:val="1"/>
-        </w:numPr>
-        <w:spacing w:line="276" w:lineRule="auto"/>
-        <w:jc w:val="both"/>
-        <w:rPr>
-          <w:rFonts w:ascii="Arial" w:hAnsi="Arial" w:cs="Arial"/>
-          <w:color w:val="auto"/>
-          <w:szCs w:val="22"/>
-          <w:lang w:val="en-GB"/>
-        </w:rPr>
-      </w:pPr>
-      <w:r>
-        <w:rPr>
-          <w:rFonts w:ascii="Arial" w:hAnsi="Arial" w:cs="Arial"/>
-          <w:color w:val="auto"/>
-          <w:szCs w:val="22"/>
-          <w:lang w:val="en-GB"/>
-        </w:rPr>
-        <w:t>Software quality and testing techniques such as Black and White Box testing</w:t>
-      </w:r>
-      <w:r>
-        <w:rPr>
-          <w:rFonts w:ascii="Arial" w:hAnsi="Arial" w:cs="Arial"/>
-          <w:color w:val="auto"/>
-          <w:szCs w:val="22"/>
-          <w:lang w:val="en-GB"/>
-        </w:rPr>
-        <w:t xml:space="preserve"> and developing unit tests.</w:t>
       </w:r>
     </w:p>
     <w:p>
@@ -2802,25 +3455,40 @@
         <w:ind w:left="0"/>
         <w:rPr>
           <w:rFonts w:ascii="Arial" w:hAnsi="Arial" w:cs="Arial"/>
+          <w:noProof/>
           <w:color w:val="auto"/>
           <w:szCs w:val="22"/>
           <w:lang w:val="en-GB"/>
         </w:rPr>
       </w:pPr>
-    </w:p>
-    <w:p>
-      <w:pPr>
-        <w:rPr>
-          <w:rFonts w:cs="Arial"/>
-          <w:b/>
-          <w:sz w:val="24"/>
-          <w:lang w:val="en-GB"/>
-        </w:rPr>
-      </w:pPr>
-      <w:r>
-        <w:rPr>
-          <w:rFonts w:cs="Arial"/>
-          <w:b/>
+      <w:bookmarkStart w:id="0" w:name="_GoBack"/>
+      <w:bookmarkEnd w:id="0"/>
+    </w:p>
+    <w:p>
+      <w:pPr>
+        <w:rPr>
+          <w:rFonts w:cs="Arial"/>
+          <w:b/>
+          <w:noProof/>
+          <w:sz w:val="24"/>
+          <w:lang w:val="en-GB"/>
+        </w:rPr>
+      </w:pPr>
+      <w:r>
+        <w:rPr>
+          <w:rFonts w:cs="Arial"/>
+          <w:b/>
+          <w:noProof/>
+          <w:sz w:val="24"/>
+          <w:lang w:val="en-GB"/>
+        </w:rPr>
+        <w:t xml:space="preserve">   </w:t>
+      </w:r>
+      <w:r>
+        <w:rPr>
+          <w:rFonts w:cs="Arial"/>
+          <w:b/>
+          <w:noProof/>
           <w:sz w:val="24"/>
           <w:lang w:val="en-GB"/>
         </w:rPr>
@@ -2830,6 +3498,7 @@
         <w:rPr>
           <w:rFonts w:cs="Arial"/>
           <w:b/>
+          <w:noProof/>
           <w:sz w:val="24"/>
           <w:vertAlign w:val="superscript"/>
           <w:lang w:val="en-GB"/>
@@ -2840,6 +3509,7 @@
         <w:rPr>
           <w:rFonts w:cs="Arial"/>
           <w:b/>
+          <w:noProof/>
           <w:sz w:val="24"/>
           <w:lang w:val="en-GB"/>
         </w:rPr>
@@ -2849,6 +3519,7 @@
         <w:rPr>
           <w:rFonts w:cs="Arial"/>
           <w:b/>
+          <w:noProof/>
           <w:sz w:val="24"/>
           <w:lang w:val="en-GB"/>
         </w:rPr>
@@ -2858,6 +3529,7 @@
         <w:rPr>
           <w:rFonts w:cs="Arial"/>
           <w:b/>
+          <w:noProof/>
           <w:sz w:val="24"/>
           <w:lang w:val="en-GB"/>
         </w:rPr>
@@ -2867,15 +3539,7 @@
         <w:rPr>
           <w:rFonts w:cs="Arial"/>
           <w:b/>
-          <w:sz w:val="24"/>
-          <w:lang w:val="en-GB"/>
-        </w:rPr>
-        <w:tab/>
-      </w:r>
-      <w:r>
-        <w:rPr>
-          <w:rFonts w:cs="Arial"/>
-          <w:b/>
+          <w:noProof/>
           <w:sz w:val="24"/>
           <w:lang w:val="en-GB"/>
         </w:rPr>
@@ -2892,6 +3556,7 @@
         <w:rPr>
           <w:rFonts w:cs="Arial"/>
           <w:b/>
+          <w:noProof/>
           <w:sz w:val="20"/>
           <w:szCs w:val="20"/>
           <w:lang w:val="en-GB"/>
@@ -2913,12 +3578,14 @@
         <w:jc w:val="both"/>
         <w:rPr>
           <w:rFonts w:ascii="Arial" w:hAnsi="Arial" w:cs="Arial"/>
-          <w:lang w:val="en-GB"/>
-        </w:rPr>
-      </w:pPr>
-      <w:r>
-        <w:rPr>
-          <w:rFonts w:ascii="Arial" w:hAnsi="Arial" w:cs="Arial"/>
+          <w:noProof/>
+          <w:lang w:val="en-GB"/>
+        </w:rPr>
+      </w:pPr>
+      <w:r>
+        <w:rPr>
+          <w:rFonts w:ascii="Arial" w:hAnsi="Arial" w:cs="Arial"/>
+          <w:noProof/>
           <w:lang w:val="en-GB"/>
         </w:rPr>
         <w:t>A fuel and maintenance cost tracker application for Android phones</w:t>
@@ -2926,6 +3593,7 @@
       <w:r>
         <w:rPr>
           <w:rFonts w:ascii="Arial" w:hAnsi="Arial" w:cs="Arial"/>
+          <w:noProof/>
           <w:lang w:val="en-GB"/>
         </w:rPr>
         <w:t xml:space="preserve"> built using Java, XML</w:t>
@@ -2933,6 +3601,7 @@
       <w:r>
         <w:rPr>
           <w:rFonts w:ascii="Arial" w:hAnsi="Arial" w:cs="Arial"/>
+          <w:noProof/>
           <w:lang w:val="en-GB"/>
         </w:rPr>
         <w:t>, NoSQL</w:t>
@@ -2940,6 +3609,7 @@
       <w:r>
         <w:rPr>
           <w:rFonts w:ascii="Arial" w:hAnsi="Arial" w:cs="Arial"/>
+          <w:noProof/>
           <w:lang w:val="en-GB"/>
         </w:rPr>
         <w:t>,</w:t>
@@ -2947,6 +3617,7 @@
       <w:r>
         <w:rPr>
           <w:rFonts w:ascii="Arial" w:hAnsi="Arial" w:cs="Arial"/>
+          <w:noProof/>
           <w:lang w:val="en-GB"/>
         </w:rPr>
         <w:t xml:space="preserve"> </w:t>
@@ -2954,6 +3625,7 @@
       <w:r>
         <w:rPr>
           <w:rFonts w:ascii="Arial" w:hAnsi="Arial" w:cs="Arial"/>
+          <w:noProof/>
           <w:lang w:val="en-GB"/>
         </w:rPr>
         <w:t>JavaScript</w:t>
@@ -2961,6 +3633,7 @@
       <w:r>
         <w:rPr>
           <w:rFonts w:ascii="Arial" w:hAnsi="Arial" w:cs="Arial"/>
+          <w:noProof/>
           <w:lang w:val="en-GB"/>
         </w:rPr>
         <w:t xml:space="preserve"> and numerous web </w:t>
@@ -2968,6 +3641,7 @@
       <w:r>
         <w:rPr>
           <w:rFonts w:ascii="Arial" w:hAnsi="Arial" w:cs="Arial"/>
+          <w:noProof/>
           <w:lang w:val="en-GB"/>
         </w:rPr>
         <w:t>API’s.</w:t>
@@ -2981,6 +3655,7 @@
         <w:jc w:val="both"/>
         <w:rPr>
           <w:rFonts w:cs="Arial"/>
+          <w:noProof/>
           <w:lang w:val="en-GB"/>
         </w:rPr>
       </w:pPr>
@@ -2995,6 +3670,7 @@
         <w:rPr>
           <w:rFonts w:ascii="Arial" w:hAnsi="Arial" w:cs="Arial"/>
           <w:b/>
+          <w:noProof/>
           <w:color w:val="1F4E79" w:themeColor="accent1" w:themeShade="80"/>
           <w:sz w:val="24"/>
           <w:lang w:val="en-GB"/>
@@ -3004,31 +3680,12 @@
         <w:rPr>
           <w:rFonts w:ascii="Arial" w:hAnsi="Arial" w:cs="Arial"/>
           <w:b/>
+          <w:noProof/>
           <w:color w:val="1F4E79" w:themeColor="accent1" w:themeShade="80"/>
           <w:sz w:val="24"/>
           <w:lang w:val="en-GB"/>
         </w:rPr>
-        <w:t xml:space="preserve">INTERESTS </w:t>
-      </w:r>
-      <w:r>
-        <w:rPr>
-          <w:rFonts w:ascii="Arial" w:hAnsi="Arial" w:cs="Arial"/>
-          <w:b/>
-          <w:color w:val="1F4E79" w:themeColor="accent1" w:themeShade="80"/>
-          <w:sz w:val="24"/>
-          <w:lang w:val="en-GB"/>
-        </w:rPr>
-        <w:t xml:space="preserve">&amp; </w:t>
-      </w:r>
-      <w:r>
-        <w:rPr>
-          <w:rFonts w:ascii="Arial" w:hAnsi="Arial" w:cs="Arial"/>
-          <w:b/>
-          <w:color w:val="1F4E79" w:themeColor="accent1" w:themeShade="80"/>
-          <w:sz w:val="24"/>
-          <w:lang w:val="en-GB"/>
-        </w:rPr>
-        <w:t>ACHIEVEMENTS</w:t>
+        <w:t>INTERESTS &amp; ACHIEVEMENTS</w:t>
       </w:r>
     </w:p>
     <w:p>
@@ -3036,6 +3693,7 @@
         <w:pStyle w:val="NoSpacing"/>
         <w:rPr>
           <w:rFonts w:ascii="Arial" w:hAnsi="Arial" w:cs="Arial"/>
+          <w:noProof/>
           <w:sz w:val="20"/>
           <w:szCs w:val="20"/>
           <w:lang w:val="en-GB"/>
@@ -3048,6 +3706,7 @@
         <w:spacing w:line="276" w:lineRule="auto"/>
         <w:rPr>
           <w:rFonts w:ascii="Arial" w:hAnsi="Arial" w:cs="Arial"/>
+          <w:noProof/>
           <w:sz w:val="24"/>
           <w:szCs w:val="24"/>
           <w:lang w:val="en-GB"/>
@@ -3056,6 +3715,7 @@
       <w:r>
         <w:rPr>
           <w:rFonts w:ascii="Arial" w:hAnsi="Arial" w:cs="Arial"/>
+          <w:noProof/>
           <w:sz w:val="24"/>
           <w:szCs w:val="24"/>
           <w:lang w:val="en-GB"/>
@@ -3065,6 +3725,7 @@
       <w:r>
         <w:rPr>
           <w:rFonts w:ascii="Arial" w:hAnsi="Arial" w:cs="Arial"/>
+          <w:noProof/>
           <w:sz w:val="24"/>
           <w:szCs w:val="24"/>
           <w:lang w:val="en-GB"/>
@@ -3077,6 +3738,7 @@
         <w:pStyle w:val="BodyText"/>
         <w:rPr>
           <w:rFonts w:ascii="Arial" w:hAnsi="Arial" w:cs="Arial"/>
+          <w:noProof/>
           <w:sz w:val="22"/>
           <w:szCs w:val="22"/>
           <w:lang w:val="en-GB"/>
@@ -3093,6 +3755,7 @@
         <w:rPr>
           <w:rFonts w:ascii="Arial" w:hAnsi="Arial" w:cs="Arial"/>
           <w:b/>
+          <w:noProof/>
           <w:color w:val="1F4E79" w:themeColor="accent1" w:themeShade="80"/>
           <w:sz w:val="24"/>
           <w:lang w:val="en-GB"/>
@@ -3102,6 +3765,7 @@
         <w:rPr>
           <w:rFonts w:ascii="Arial" w:hAnsi="Arial" w:cs="Arial"/>
           <w:b/>
+          <w:noProof/>
           <w:color w:val="1F4E79" w:themeColor="accent1" w:themeShade="80"/>
           <w:sz w:val="24"/>
           <w:lang w:val="en-GB"/>
@@ -3116,6 +3780,7 @@
         <w:rPr>
           <w:rFonts w:ascii="Arial" w:hAnsi="Arial" w:cs="Arial"/>
           <w:b/>
+          <w:noProof/>
           <w:color w:val="auto"/>
           <w:sz w:val="20"/>
           <w:szCs w:val="20"/>
@@ -3130,6 +3795,7 @@
         <w:ind w:left="0"/>
         <w:rPr>
           <w:rFonts w:ascii="Arial" w:hAnsi="Arial" w:cs="Arial"/>
+          <w:noProof/>
           <w:color w:val="333333"/>
           <w:szCs w:val="22"/>
           <w:shd w:val="clear" w:color="auto" w:fill="FFFFFF"/>
@@ -3141,6 +3807,7 @@
           <w:rStyle w:val="apple-converted-space"/>
           <w:rFonts w:ascii="Arial" w:hAnsi="Arial" w:cs="Arial"/>
           <w:b/>
+          <w:noProof/>
           <w:color w:val="000000" w:themeColor="text1"/>
           <w:szCs w:val="22"/>
           <w:shd w:val="clear" w:color="auto" w:fill="FFFFFF"/>
@@ -3152,6 +3819,7 @@
         <w:rPr>
           <w:rStyle w:val="Strong"/>
           <w:rFonts w:ascii="Arial" w:hAnsi="Arial" w:cs="Arial"/>
+          <w:noProof/>
           <w:color w:val="000000" w:themeColor="text1"/>
           <w:szCs w:val="22"/>
           <w:shd w:val="clear" w:color="auto" w:fill="FFFFFF"/>
@@ -3163,6 +3831,7 @@
         <w:rPr>
           <w:rStyle w:val="Strong"/>
           <w:rFonts w:ascii="Arial" w:hAnsi="Arial" w:cs="Arial"/>
+          <w:noProof/>
           <w:color w:val="000000" w:themeColor="text1"/>
           <w:szCs w:val="22"/>
           <w:shd w:val="clear" w:color="auto" w:fill="FFFFFF"/>
@@ -3174,6 +3843,7 @@
         <w:rPr>
           <w:rStyle w:val="Strong"/>
           <w:rFonts w:ascii="Arial" w:hAnsi="Arial" w:cs="Arial"/>
+          <w:noProof/>
           <w:color w:val="000000" w:themeColor="text1"/>
           <w:szCs w:val="22"/>
           <w:shd w:val="clear" w:color="auto" w:fill="FFFFFF"/>
@@ -3185,6 +3855,7 @@
         <w:rPr>
           <w:rStyle w:val="Strong"/>
           <w:rFonts w:ascii="Arial" w:hAnsi="Arial" w:cs="Arial"/>
+          <w:noProof/>
           <w:color w:val="000000" w:themeColor="text1"/>
           <w:szCs w:val="22"/>
           <w:shd w:val="clear" w:color="auto" w:fill="FFFFFF"/>
@@ -3196,6 +3867,7 @@
         <w:rPr>
           <w:rStyle w:val="Strong"/>
           <w:rFonts w:ascii="Arial" w:hAnsi="Arial" w:cs="Arial"/>
+          <w:noProof/>
           <w:color w:val="000000" w:themeColor="text1"/>
           <w:szCs w:val="22"/>
           <w:shd w:val="clear" w:color="auto" w:fill="FFFFFF"/>
@@ -3207,6 +3879,7 @@
         <w:rPr>
           <w:rStyle w:val="Strong"/>
           <w:rFonts w:ascii="Arial" w:hAnsi="Arial" w:cs="Arial"/>
+          <w:noProof/>
           <w:color w:val="000000" w:themeColor="text1"/>
           <w:szCs w:val="22"/>
           <w:shd w:val="clear" w:color="auto" w:fill="FFFFFF"/>
@@ -3218,16 +3891,30 @@
         <w:rPr>
           <w:rStyle w:val="Strong"/>
           <w:rFonts w:ascii="Arial" w:hAnsi="Arial" w:cs="Arial"/>
+          <w:noProof/>
           <w:color w:val="000000" w:themeColor="text1"/>
           <w:szCs w:val="22"/>
           <w:shd w:val="clear" w:color="auto" w:fill="FFFFFF"/>
           <w:lang w:val="en-GB"/>
         </w:rPr>
-        <w:t>Paul Johnston</w:t>
-      </w:r>
-      <w:r>
-        <w:rPr>
-          <w:rFonts w:ascii="Arial" w:hAnsi="Arial" w:cs="Arial"/>
+        <w:t>P</w:t>
+      </w:r>
+      <w:r>
+        <w:rPr>
+          <w:rStyle w:val="Strong"/>
+          <w:rFonts w:ascii="Arial" w:hAnsi="Arial" w:cs="Arial"/>
+          <w:noProof/>
+          <w:color w:val="000000" w:themeColor="text1"/>
+          <w:szCs w:val="22"/>
+          <w:shd w:val="clear" w:color="auto" w:fill="FFFFFF"/>
+          <w:lang w:val="en-GB"/>
+        </w:rPr>
+        <w:t>eter Moran</w:t>
+      </w:r>
+      <w:r>
+        <w:rPr>
+          <w:rFonts w:ascii="Arial" w:hAnsi="Arial" w:cs="Arial"/>
+          <w:noProof/>
           <w:color w:val="333333"/>
           <w:szCs w:val="22"/>
           <w:lang w:val="en-GB"/>
@@ -3238,6 +3925,7 @@
         <w:rPr>
           <w:rStyle w:val="apple-converted-space"/>
           <w:rFonts w:ascii="Arial" w:hAnsi="Arial" w:cs="Arial"/>
+          <w:noProof/>
           <w:color w:val="auto"/>
           <w:szCs w:val="22"/>
           <w:shd w:val="clear" w:color="auto" w:fill="FFFFFF"/>
@@ -3248,6 +3936,7 @@
       <w:r>
         <w:rPr>
           <w:rFonts w:ascii="Arial" w:hAnsi="Arial" w:cs="Arial"/>
+          <w:noProof/>
           <w:color w:val="auto"/>
           <w:szCs w:val="22"/>
           <w:shd w:val="clear" w:color="auto" w:fill="FFFFFF"/>
@@ -3258,6 +3947,7 @@
       <w:r>
         <w:rPr>
           <w:rFonts w:ascii="Arial" w:hAnsi="Arial" w:cs="Arial"/>
+          <w:noProof/>
           <w:color w:val="auto"/>
           <w:szCs w:val="22"/>
           <w:shd w:val="clear" w:color="auto" w:fill="FFFFFF"/>
@@ -3268,6 +3958,7 @@
       <w:r>
         <w:rPr>
           <w:rFonts w:ascii="Arial" w:hAnsi="Arial" w:cs="Arial"/>
+          <w:noProof/>
           <w:color w:val="auto"/>
           <w:szCs w:val="22"/>
           <w:shd w:val="clear" w:color="auto" w:fill="FFFFFF"/>
@@ -3278,6 +3969,7 @@
       <w:r>
         <w:rPr>
           <w:rFonts w:ascii="Arial" w:hAnsi="Arial" w:cs="Arial"/>
+          <w:noProof/>
           <w:color w:val="auto"/>
           <w:szCs w:val="22"/>
           <w:shd w:val="clear" w:color="auto" w:fill="FFFFFF"/>
@@ -3288,6 +3980,7 @@
       <w:r>
         <w:rPr>
           <w:rFonts w:ascii="Arial" w:hAnsi="Arial" w:cs="Arial"/>
+          <w:noProof/>
           <w:color w:val="auto"/>
           <w:szCs w:val="22"/>
           <w:shd w:val="clear" w:color="auto" w:fill="FFFFFF"/>
@@ -3298,16 +3991,29 @@
       <w:r>
         <w:rPr>
           <w:rFonts w:ascii="Arial" w:hAnsi="Arial" w:cs="Arial"/>
+          <w:noProof/>
           <w:color w:val="auto"/>
           <w:szCs w:val="22"/>
           <w:shd w:val="clear" w:color="auto" w:fill="FFFFFF"/>
           <w:lang w:val="en-GB"/>
         </w:rPr>
+        <w:t xml:space="preserve">Development </w:t>
+      </w:r>
+      <w:r>
+        <w:rPr>
+          <w:rFonts w:ascii="Arial" w:hAnsi="Arial" w:cs="Arial"/>
+          <w:noProof/>
+          <w:color w:val="auto"/>
+          <w:szCs w:val="22"/>
+          <w:shd w:val="clear" w:color="auto" w:fill="FFFFFF"/>
+          <w:lang w:val="en-GB"/>
+        </w:rPr>
         <w:t>Director</w:t>
       </w:r>
       <w:r>
         <w:rPr>
           <w:rFonts w:ascii="Arial" w:hAnsi="Arial" w:cs="Arial"/>
+          <w:noProof/>
           <w:color w:val="auto"/>
           <w:szCs w:val="22"/>
           <w:shd w:val="clear" w:color="auto" w:fill="FFFFFF"/>
@@ -3318,6 +4024,7 @@
       <w:r>
         <w:rPr>
           <w:rFonts w:ascii="Arial" w:hAnsi="Arial" w:cs="Arial"/>
+          <w:noProof/>
           <w:color w:val="auto"/>
           <w:szCs w:val="22"/>
           <w:lang w:val="en-GB"/>
@@ -3328,6 +4035,7 @@
         <w:rPr>
           <w:rStyle w:val="apple-converted-space"/>
           <w:rFonts w:ascii="Arial" w:hAnsi="Arial" w:cs="Arial"/>
+          <w:noProof/>
           <w:color w:val="auto"/>
           <w:szCs w:val="22"/>
           <w:shd w:val="clear" w:color="auto" w:fill="FFFFFF"/>
@@ -3339,6 +4047,7 @@
         <w:rPr>
           <w:rStyle w:val="apple-converted-space"/>
           <w:rFonts w:ascii="Arial" w:hAnsi="Arial" w:cs="Arial"/>
+          <w:noProof/>
           <w:color w:val="auto"/>
           <w:szCs w:val="22"/>
           <w:shd w:val="clear" w:color="auto" w:fill="FFFFFF"/>
@@ -3350,6 +4059,7 @@
         <w:rPr>
           <w:rStyle w:val="apple-converted-space"/>
           <w:rFonts w:ascii="Arial" w:hAnsi="Arial" w:cs="Arial"/>
+          <w:noProof/>
           <w:color w:val="auto"/>
           <w:szCs w:val="22"/>
           <w:shd w:val="clear" w:color="auto" w:fill="FFFFFF"/>
@@ -3361,6 +4071,7 @@
         <w:rPr>
           <w:rStyle w:val="apple-converted-space"/>
           <w:rFonts w:ascii="Arial" w:hAnsi="Arial" w:cs="Arial"/>
+          <w:noProof/>
           <w:color w:val="auto"/>
           <w:szCs w:val="22"/>
           <w:shd w:val="clear" w:color="auto" w:fill="FFFFFF"/>
@@ -3371,6 +4082,7 @@
       <w:r>
         <w:rPr>
           <w:rFonts w:ascii="Arial" w:hAnsi="Arial" w:cs="Arial"/>
+          <w:noProof/>
           <w:color w:val="auto"/>
           <w:szCs w:val="22"/>
           <w:shd w:val="clear" w:color="auto" w:fill="FFFFFF"/>
@@ -3381,6 +4093,7 @@
       <w:r>
         <w:rPr>
           <w:rFonts w:ascii="Arial" w:hAnsi="Arial" w:cs="Arial"/>
+          <w:noProof/>
           <w:color w:val="auto"/>
           <w:szCs w:val="22"/>
           <w:shd w:val="clear" w:color="auto" w:fill="FFFFFF"/>
@@ -3391,6 +4104,7 @@
       <w:r>
         <w:rPr>
           <w:rFonts w:ascii="Arial" w:hAnsi="Arial" w:cs="Arial"/>
+          <w:noProof/>
           <w:color w:val="auto"/>
           <w:szCs w:val="22"/>
           <w:shd w:val="clear" w:color="auto" w:fill="FFFFFF"/>
@@ -3401,12 +4115,24 @@
       <w:r>
         <w:rPr>
           <w:rFonts w:ascii="Arial" w:hAnsi="Arial" w:cs="Arial"/>
+          <w:noProof/>
           <w:color w:val="auto"/>
           <w:szCs w:val="22"/>
           <w:shd w:val="clear" w:color="auto" w:fill="FFFFFF"/>
           <w:lang w:val="en-GB"/>
         </w:rPr>
-        <w:t>O’Doherty’s Audio &amp; Video Productions Ltd.</w:t>
+        <w:t>Equisoft DAC</w:t>
+      </w:r>
+      <w:r>
+        <w:rPr>
+          <w:rFonts w:ascii="Arial" w:hAnsi="Arial" w:cs="Arial"/>
+          <w:noProof/>
+          <w:color w:val="auto"/>
+          <w:szCs w:val="22"/>
+          <w:shd w:val="clear" w:color="auto" w:fill="FFFFFF"/>
+          <w:lang w:val="en-GB"/>
+        </w:rPr>
+        <w:t>.</w:t>
       </w:r>
     </w:p>
     <w:p>
@@ -3416,6 +4142,7 @@
         <w:ind w:left="0"/>
         <w:rPr>
           <w:rFonts w:ascii="Arial" w:hAnsi="Arial" w:cs="Arial"/>
+          <w:noProof/>
           <w:color w:val="auto"/>
           <w:szCs w:val="22"/>
           <w:shd w:val="clear" w:color="auto" w:fill="FFFFFF"/>
@@ -3425,6 +4152,7 @@
       <w:r>
         <w:rPr>
           <w:rFonts w:ascii="Arial" w:hAnsi="Arial" w:cs="Arial"/>
+          <w:noProof/>
           <w:color w:val="auto"/>
           <w:szCs w:val="22"/>
           <w:shd w:val="clear" w:color="auto" w:fill="FFFFFF"/>
@@ -3435,6 +4163,7 @@
       <w:r>
         <w:rPr>
           <w:rFonts w:ascii="Arial" w:hAnsi="Arial" w:cs="Arial"/>
+          <w:noProof/>
           <w:color w:val="auto"/>
           <w:szCs w:val="22"/>
           <w:shd w:val="clear" w:color="auto" w:fill="FFFFFF"/>
@@ -3445,6 +4174,7 @@
       <w:r>
         <w:rPr>
           <w:rFonts w:ascii="Arial" w:hAnsi="Arial" w:cs="Arial"/>
+          <w:noProof/>
           <w:color w:val="auto"/>
           <w:szCs w:val="22"/>
           <w:shd w:val="clear" w:color="auto" w:fill="FFFFFF"/>
@@ -3455,6 +4185,7 @@
       <w:r>
         <w:rPr>
           <w:rFonts w:ascii="Arial" w:hAnsi="Arial" w:cs="Arial"/>
+          <w:noProof/>
           <w:color w:val="auto"/>
           <w:szCs w:val="22"/>
           <w:shd w:val="clear" w:color="auto" w:fill="FFFFFF"/>
@@ -3465,6 +4196,7 @@
       <w:r>
         <w:rPr>
           <w:rFonts w:ascii="Arial" w:hAnsi="Arial" w:cs="Arial"/>
+          <w:noProof/>
           <w:color w:val="auto"/>
           <w:szCs w:val="22"/>
           <w:shd w:val="clear" w:color="auto" w:fill="FFFFFF"/>
@@ -3475,6 +4207,7 @@
       <w:r>
         <w:rPr>
           <w:rFonts w:ascii="Arial" w:hAnsi="Arial" w:cs="Arial"/>
+          <w:noProof/>
           <w:color w:val="auto"/>
           <w:szCs w:val="22"/>
           <w:shd w:val="clear" w:color="auto" w:fill="FFFFFF"/>
@@ -3485,72 +4218,44 @@
       <w:r>
         <w:rPr>
           <w:rFonts w:ascii="Arial" w:hAnsi="Arial" w:cs="Arial"/>
+          <w:noProof/>
           <w:color w:val="auto"/>
           <w:szCs w:val="22"/>
           <w:shd w:val="clear" w:color="auto" w:fill="FFFFFF"/>
           <w:lang w:val="en-GB"/>
         </w:rPr>
-        <w:t>: +353</w:t>
-      </w:r>
-      <w:r>
-        <w:rPr>
-          <w:rFonts w:ascii="Arial" w:hAnsi="Arial" w:cs="Arial"/>
+        <w:t>: +</w:t>
+      </w:r>
+      <w:r>
+        <w:rPr>
+          <w:rFonts w:ascii="Arial" w:hAnsi="Arial" w:cs="Arial"/>
+          <w:noProof/>
           <w:color w:val="auto"/>
           <w:szCs w:val="22"/>
           <w:shd w:val="clear" w:color="auto" w:fill="FFFFFF"/>
           <w:lang w:val="en-GB"/>
         </w:rPr>
+        <w:t>353</w:t>
+      </w:r>
+      <w:r>
+        <w:rPr>
+          <w:rFonts w:ascii="Arial" w:hAnsi="Arial"/>
+          <w:noProof/>
+          <w:color w:val="auto"/>
+          <w:lang w:val="en-GB"/>
+        </w:rPr>
         <w:t xml:space="preserve"> </w:t>
       </w:r>
       <w:r>
         <w:rPr>
           <w:rFonts w:ascii="Arial" w:hAnsi="Arial" w:cs="Arial"/>
+          <w:noProof/>
           <w:color w:val="auto"/>
           <w:szCs w:val="22"/>
           <w:shd w:val="clear" w:color="auto" w:fill="FFFFFF"/>
           <w:lang w:val="en-GB"/>
         </w:rPr>
-        <w:t>86</w:t>
-      </w:r>
-      <w:r>
-        <w:rPr>
-          <w:rFonts w:ascii="Arial" w:hAnsi="Arial" w:cs="Arial"/>
-          <w:color w:val="auto"/>
-          <w:szCs w:val="22"/>
-          <w:shd w:val="clear" w:color="auto" w:fill="FFFFFF"/>
-          <w:lang w:val="en-GB"/>
-        </w:rPr>
-        <w:t xml:space="preserve"> </w:t>
-      </w:r>
-      <w:r>
-        <w:rPr>
-          <w:rFonts w:ascii="Arial" w:hAnsi="Arial" w:cs="Arial"/>
-          <w:color w:val="auto"/>
-          <w:szCs w:val="22"/>
-          <w:shd w:val="clear" w:color="auto" w:fill="FFFFFF"/>
-          <w:lang w:val="en-GB"/>
-        </w:rPr>
-        <w:t>256</w:t>
-      </w:r>
-      <w:r>
-        <w:rPr>
-          <w:rFonts w:ascii="Arial" w:hAnsi="Arial" w:cs="Arial"/>
-          <w:color w:val="auto"/>
-          <w:szCs w:val="22"/>
-          <w:shd w:val="clear" w:color="auto" w:fill="FFFFFF"/>
-          <w:lang w:val="en-GB"/>
-        </w:rPr>
-        <w:t xml:space="preserve"> </w:t>
-      </w:r>
-      <w:r>
-        <w:rPr>
-          <w:rFonts w:ascii="Arial" w:hAnsi="Arial" w:cs="Arial"/>
-          <w:color w:val="auto"/>
-          <w:szCs w:val="22"/>
-          <w:shd w:val="clear" w:color="auto" w:fill="FFFFFF"/>
-          <w:lang w:val="en-GB"/>
-        </w:rPr>
-        <w:t>7912</w:t>
+        <w:t>45 431 680</w:t>
       </w:r>
     </w:p>
     <w:sectPr>
@@ -6276,6 +6981,7 @@
   <w:style w:type="character" w:default="1" w:styleId="DefaultParagraphFont">
     <w:name w:val="Default Paragraph Font"/>
     <w:uiPriority w:val="1"/>
+    <w:semiHidden/>
     <w:unhideWhenUsed/>
   </w:style>
   <w:style w:type="table" w:default="1" w:styleId="TableNormal">
@@ -6771,7 +7477,7 @@
 </file>
 
 <file path=customXml/itemProps1.xml><?xml version="1.0" encoding="utf-8"?>
-<ds:datastoreItem xmlns:ds="http://schemas.openxmlformats.org/officeDocument/2006/customXml" ds:itemID="{731B7498-F25B-4870-8A6B-4DBCD3D8D73C}">
+<ds:datastoreItem xmlns:ds="http://schemas.openxmlformats.org/officeDocument/2006/customXml" ds:itemID="{4BCEF30B-0B25-444D-9499-19BF2D945E68}">
   <ds:schemaRefs>
     <ds:schemaRef ds:uri="http://schemas.openxmlformats.org/officeDocument/2006/bibliography"/>
   </ds:schemaRefs>

</xml_diff>

<commit_message>
Updated CV to finished in Equisoft
</commit_message>
<xml_diff>
--- a/bin/PeterBradyCV.docx
+++ b/bin/PeterBradyCV.docx
@@ -260,31 +260,23 @@
           <w:szCs w:val="22"/>
           <w:lang w:val="en-GB"/>
         </w:rPr>
-        <w:t>C</w:t>
-      </w:r>
-      <w:r>
-        <w:rPr>
-          <w:noProof/>
-          <w:szCs w:val="22"/>
-          <w:lang w:val="en-GB"/>
-        </w:rPr>
-        <w:t xml:space="preserve">urrently </w:t>
-      </w:r>
-      <w:r>
-        <w:rPr>
-          <w:noProof/>
-          <w:szCs w:val="22"/>
-          <w:lang w:val="en-GB"/>
-        </w:rPr>
-        <w:t xml:space="preserve">employed as </w:t>
-      </w:r>
-      <w:r>
-        <w:rPr>
-          <w:noProof/>
-          <w:szCs w:val="22"/>
-          <w:lang w:val="en-GB"/>
-        </w:rPr>
-        <w:t>a</w:t>
+        <w:t xml:space="preserve">An enthuasiastic </w:t>
+      </w:r>
+      <w:r>
+        <w:rPr>
+          <w:noProof/>
+          <w:szCs w:val="22"/>
+          <w:lang w:val="en-GB"/>
+        </w:rPr>
+        <w:t>Software</w:t>
+      </w:r>
+      <w:r>
+        <w:rPr>
+          <w:noProof/>
+          <w:szCs w:val="22"/>
+          <w:lang w:val="en-GB"/>
+        </w:rPr>
+        <w:t xml:space="preserve"> Developer</w:t>
       </w:r>
       <w:r>
         <w:rPr>
@@ -300,32 +292,10 @@
           <w:szCs w:val="22"/>
           <w:lang w:val="en-GB"/>
         </w:rPr>
-        <w:t>Software</w:t>
-      </w:r>
-      <w:r>
-        <w:rPr>
-          <w:noProof/>
-          <w:szCs w:val="22"/>
-          <w:lang w:val="en-GB"/>
-        </w:rPr>
-        <w:t xml:space="preserve"> Developer</w:t>
-      </w:r>
-      <w:r>
-        <w:rPr>
-          <w:noProof/>
-          <w:szCs w:val="22"/>
-          <w:lang w:val="en-GB"/>
-        </w:rPr>
-        <w:t xml:space="preserve"> with </w:t>
-      </w:r>
-      <w:r>
-        <w:rPr>
-          <w:noProof/>
-          <w:szCs w:val="22"/>
-          <w:lang w:val="en-GB"/>
-        </w:rPr>
-        <w:t>Equisoft DAC</w:t>
-      </w:r>
+        <w:t>seeking exciting development role</w:t>
+      </w:r>
+      <w:bookmarkStart w:id="0" w:name="_GoBack"/>
+      <w:bookmarkEnd w:id="0"/>
       <w:r>
         <w:rPr>
           <w:noProof/>
@@ -897,17 +867,47 @@
           <w:lang w:val="en-GB"/>
         </w:rPr>
         <w:tab/>
-        <w:t xml:space="preserve">       </w:t>
-      </w:r>
-      <w:r>
-        <w:rPr>
-          <w:rFonts w:cs="Arial"/>
-          <w:b/>
-          <w:noProof/>
-          <w:sz w:val="24"/>
-          <w:lang w:val="en-GB"/>
-        </w:rPr>
-        <w:t>January 2020 - Present</w:t>
+        <w:t xml:space="preserve">    </w:t>
+      </w:r>
+      <w:r>
+        <w:rPr>
+          <w:rFonts w:cs="Arial"/>
+          <w:b/>
+          <w:noProof/>
+          <w:sz w:val="24"/>
+          <w:lang w:val="en-GB"/>
+        </w:rPr>
+        <w:t xml:space="preserve">January 2020 </w:t>
+      </w:r>
+      <w:r>
+        <w:rPr>
+          <w:rFonts w:cs="Arial"/>
+          <w:b/>
+          <w:noProof/>
+          <w:sz w:val="24"/>
+          <w:lang w:val="en-GB"/>
+        </w:rPr>
+        <w:t>–</w:t>
+      </w:r>
+      <w:r>
+        <w:rPr>
+          <w:rFonts w:cs="Arial"/>
+          <w:b/>
+          <w:noProof/>
+          <w:sz w:val="24"/>
+          <w:lang w:val="en-GB"/>
+        </w:rPr>
+        <w:t xml:space="preserve"> </w:t>
+      </w:r>
+      <w:r>
+        <w:rPr>
+          <w:rFonts w:cs="Arial"/>
+          <w:b/>
+          <w:noProof/>
+          <w:sz w:val="24"/>
+          <w:lang w:val="en-GB"/>
+        </w:rPr>
+        <w:t>May 2020</w:t>
       </w:r>
     </w:p>
     <w:p>
@@ -3461,8 +3461,6 @@
           <w:lang w:val="en-GB"/>
         </w:rPr>
       </w:pPr>
-      <w:bookmarkStart w:id="0" w:name="_GoBack"/>
-      <w:bookmarkEnd w:id="0"/>
     </w:p>
     <w:p>
       <w:pPr>
@@ -7477,7 +7475,7 @@
 </file>
 
 <file path=customXml/itemProps1.xml><?xml version="1.0" encoding="utf-8"?>
-<ds:datastoreItem xmlns:ds="http://schemas.openxmlformats.org/officeDocument/2006/customXml" ds:itemID="{4BCEF30B-0B25-444D-9499-19BF2D945E68}">
+<ds:datastoreItem xmlns:ds="http://schemas.openxmlformats.org/officeDocument/2006/customXml" ds:itemID="{0EC411F6-3C78-4577-9CC1-B484B172C141}">
   <ds:schemaRefs>
     <ds:schemaRef ds:uri="http://schemas.openxmlformats.org/officeDocument/2006/bibliography"/>
   </ds:schemaRefs>

</xml_diff>

<commit_message>
Ended employment at Equisoft
</commit_message>
<xml_diff>
--- a/bin/PeterBradyCV.docx
+++ b/bin/PeterBradyCV.docx
@@ -14,6 +14,8 @@
           <w:lang w:val="en-GB"/>
         </w:rPr>
       </w:pPr>
+      <w:bookmarkStart w:id="0" w:name="_GoBack"/>
+      <w:bookmarkEnd w:id="0"/>
       <w:r>
         <w:rPr>
           <w:rFonts w:cs="Arial"/>
@@ -294,8 +296,6 @@
         </w:rPr>
         <w:t>seeking exciting development role</w:t>
       </w:r>
-      <w:bookmarkStart w:id="0" w:name="_GoBack"/>
-      <w:bookmarkEnd w:id="0"/>
       <w:r>
         <w:rPr>
           <w:noProof/>
@@ -4323,7 +4323,7 @@
         <w:rStyle w:val="PageNumber"/>
         <w:noProof/>
       </w:rPr>
-      <w:t>2</w:t>
+      <w:t>1</w:t>
     </w:r>
     <w:r>
       <w:rPr>
@@ -7475,7 +7475,7 @@
 </file>
 
 <file path=customXml/itemProps1.xml><?xml version="1.0" encoding="utf-8"?>
-<ds:datastoreItem xmlns:ds="http://schemas.openxmlformats.org/officeDocument/2006/customXml" ds:itemID="{0EC411F6-3C78-4577-9CC1-B484B172C141}">
+<ds:datastoreItem xmlns:ds="http://schemas.openxmlformats.org/officeDocument/2006/customXml" ds:itemID="{CFD40BA2-E184-4B03-A994-E2B55BA59F38}">
   <ds:schemaRefs>
     <ds:schemaRef ds:uri="http://schemas.openxmlformats.org/officeDocument/2006/bibliography"/>
   </ds:schemaRefs>

</xml_diff>

<commit_message>
Updated CV August 2021
</commit_message>
<xml_diff>
--- a/bin/PeterBradyCV.docx
+++ b/bin/PeterBradyCV.docx
@@ -14,8 +14,6 @@
           <w:lang w:val="en-GB"/>
         </w:rPr>
       </w:pPr>
-      <w:bookmarkStart w:id="0" w:name="_GoBack"/>
-      <w:bookmarkEnd w:id="0"/>
       <w:r>
         <w:rPr>
           <w:rFonts w:cs="Arial"/>
@@ -202,6 +200,20 @@
     <w:p>
       <w:pPr>
         <w:pStyle w:val="BodyTextIndent"/>
+        <w:ind w:left="0"/>
+        <w:rPr>
+          <w:rFonts w:ascii="Arial" w:hAnsi="Arial" w:cs="Arial"/>
+          <w:b/>
+          <w:noProof/>
+          <w:color w:val="1F4E79" w:themeColor="accent1" w:themeShade="80"/>
+          <w:szCs w:val="22"/>
+          <w:lang w:val="en-GB"/>
+        </w:rPr>
+      </w:pPr>
+    </w:p>
+    <w:p>
+      <w:pPr>
+        <w:pStyle w:val="BodyTextIndent"/>
         <w:pBdr>
           <w:bottom w:val="single" w:sz="12" w:space="1" w:color="auto"/>
         </w:pBdr>
@@ -294,7 +306,23 @@
           <w:szCs w:val="22"/>
           <w:lang w:val="en-GB"/>
         </w:rPr>
-        <w:t>seeking exciting development role</w:t>
+        <w:t xml:space="preserve">seeking </w:t>
+      </w:r>
+      <w:r>
+        <w:rPr>
+          <w:noProof/>
+          <w:szCs w:val="22"/>
+          <w:lang w:val="en-GB"/>
+        </w:rPr>
+        <w:t xml:space="preserve">an </w:t>
+      </w:r>
+      <w:r>
+        <w:rPr>
+          <w:noProof/>
+          <w:szCs w:val="22"/>
+          <w:lang w:val="en-GB"/>
+        </w:rPr>
+        <w:t>exciting development role</w:t>
       </w:r>
       <w:r>
         <w:rPr>
@@ -404,15 +432,17 @@
       <w:r>
         <w:rPr>
           <w:rStyle w:val="background-details"/>
-          <w:noProof/>
-          <w:szCs w:val="22"/>
-          <w:lang w:val="en-GB"/>
-        </w:rPr>
-        <w:t>PowerBuilder</w:t>
+          <w:b/>
+          <w:noProof/>
+          <w:szCs w:val="22"/>
+          <w:lang w:val="en-GB"/>
+        </w:rPr>
+        <w:t>Vue.js</w:t>
       </w:r>
       <w:r>
         <w:rPr>
           <w:rStyle w:val="background-details"/>
+          <w:b/>
           <w:noProof/>
           <w:szCs w:val="22"/>
           <w:lang w:val="en-GB"/>
@@ -427,40 +457,63 @@
           <w:szCs w:val="22"/>
           <w:lang w:val="en-GB"/>
         </w:rPr>
-        <w:t>C</w:t>
+        <w:t>HTML5, CSS3</w:t>
       </w:r>
       <w:r>
         <w:rPr>
           <w:rStyle w:val="background-details"/>
           <w:b/>
           <w:noProof/>
-          <w:szCs w:val="22"/>
-          <w:lang w:val="en-GB"/>
-        </w:rPr>
-        <w:t>++</w:t>
+          <w:lang w:val="en-GB"/>
+        </w:rPr>
+        <w:t>, JQuery, JavaScript</w:t>
       </w:r>
       <w:r>
         <w:rPr>
           <w:rStyle w:val="background-details"/>
-          <w:noProof/>
-          <w:szCs w:val="22"/>
-          <w:lang w:val="en-GB"/>
-        </w:rPr>
-        <w:t xml:space="preserve">, </w:t>
+          <w:b/>
+          <w:noProof/>
+          <w:lang w:val="en-GB"/>
+        </w:rPr>
+        <w:t xml:space="preserve"> </w:t>
       </w:r>
       <w:r>
         <w:rPr>
           <w:rStyle w:val="background-details"/>
-          <w:b/>
-          <w:noProof/>
-          <w:szCs w:val="22"/>
-          <w:lang w:val="en-GB"/>
-        </w:rPr>
-        <w:t>Java</w:t>
+          <w:noProof/>
+          <w:lang w:val="en-GB"/>
+        </w:rPr>
+        <w:t>and</w:t>
       </w:r>
       <w:r>
         <w:rPr>
           <w:rStyle w:val="background-details"/>
+          <w:b/>
+          <w:noProof/>
+          <w:lang w:val="en-GB"/>
+        </w:rPr>
+        <w:t xml:space="preserve"> Bootstrap</w:t>
+      </w:r>
+      <w:r>
+        <w:rPr>
+          <w:rStyle w:val="background-details"/>
+          <w:b/>
+          <w:noProof/>
+          <w:lang w:val="en-GB"/>
+        </w:rPr>
+        <w:t>.</w:t>
+      </w:r>
+      <w:r>
+        <w:rPr>
+          <w:rStyle w:val="background-details"/>
+          <w:noProof/>
+          <w:lang w:val="en-GB"/>
+        </w:rPr>
+        <w:t xml:space="preserve"> Also</w:t>
+      </w:r>
+      <w:r>
+        <w:rPr>
+          <w:rStyle w:val="background-details"/>
           <w:noProof/>
           <w:szCs w:val="22"/>
           <w:lang w:val="en-GB"/>
@@ -474,7 +527,7 @@
           <w:szCs w:val="22"/>
           <w:lang w:val="en-GB"/>
         </w:rPr>
-        <w:t>and</w:t>
+        <w:t xml:space="preserve">developed </w:t>
       </w:r>
       <w:r>
         <w:rPr>
@@ -483,92 +536,115 @@
           <w:szCs w:val="22"/>
           <w:lang w:val="en-GB"/>
         </w:rPr>
+        <w:t xml:space="preserve">other </w:t>
+      </w:r>
+      <w:r>
+        <w:rPr>
+          <w:rStyle w:val="background-details"/>
+          <w:noProof/>
+          <w:szCs w:val="22"/>
+          <w:lang w:val="en-GB"/>
+        </w:rPr>
+        <w:t xml:space="preserve">frontend applications using </w:t>
+      </w:r>
+      <w:r>
+        <w:rPr>
+          <w:rStyle w:val="background-details"/>
+          <w:noProof/>
+          <w:szCs w:val="22"/>
+          <w:lang w:val="en-GB"/>
+        </w:rPr>
+        <w:t xml:space="preserve">PowerBuilder, </w:t>
+      </w:r>
+      <w:r>
+        <w:rPr>
+          <w:rStyle w:val="background-details"/>
+          <w:noProof/>
+          <w:szCs w:val="22"/>
+          <w:lang w:val="en-GB"/>
+        </w:rPr>
+        <w:t>C++, Java</w:t>
+      </w:r>
+      <w:r>
+        <w:rPr>
+          <w:rStyle w:val="background-details"/>
+          <w:noProof/>
+          <w:szCs w:val="22"/>
+          <w:lang w:val="en-GB"/>
+        </w:rPr>
         <w:t xml:space="preserve"> </w:t>
       </w:r>
       <w:r>
         <w:rPr>
           <w:rStyle w:val="background-details"/>
           <w:noProof/>
-          <w:szCs w:val="22"/>
-          <w:lang w:val="en-GB"/>
-        </w:rPr>
-        <w:t xml:space="preserve">developed </w:t>
+          <w:lang w:val="en-GB"/>
+        </w:rPr>
+        <w:t xml:space="preserve">and Perl. </w:t>
       </w:r>
       <w:r>
         <w:rPr>
           <w:rStyle w:val="background-details"/>
           <w:noProof/>
-          <w:szCs w:val="22"/>
-          <w:lang w:val="en-GB"/>
-        </w:rPr>
-        <w:t xml:space="preserve">frontend applications using </w:t>
+          <w:lang w:val="en-GB"/>
+        </w:rPr>
+        <w:t xml:space="preserve">Prior to </w:t>
       </w:r>
       <w:r>
         <w:rPr>
           <w:rStyle w:val="background-details"/>
-          <w:b/>
-          <w:noProof/>
-          <w:szCs w:val="22"/>
-          <w:lang w:val="en-GB"/>
-        </w:rPr>
-        <w:t>HTML</w:t>
+          <w:noProof/>
+          <w:lang w:val="en-GB"/>
+        </w:rPr>
+        <w:t>employment</w:t>
       </w:r>
       <w:r>
         <w:rPr>
           <w:rStyle w:val="background-details"/>
-          <w:b/>
-          <w:noProof/>
-          <w:szCs w:val="22"/>
-          <w:lang w:val="en-GB"/>
-        </w:rPr>
-        <w:t>5</w:t>
+          <w:noProof/>
+          <w:lang w:val="en-GB"/>
+        </w:rPr>
+        <w:t xml:space="preserve"> I successfully completed a BSc</w:t>
       </w:r>
       <w:r>
         <w:rPr>
           <w:rStyle w:val="background-details"/>
-          <w:b/>
-          <w:noProof/>
-          <w:szCs w:val="22"/>
-          <w:lang w:val="en-GB"/>
-        </w:rPr>
-        <w:t>, CSS</w:t>
+          <w:noProof/>
+          <w:lang w:val="en-GB"/>
+        </w:rPr>
+        <w:t>.</w:t>
       </w:r>
       <w:r>
         <w:rPr>
           <w:rStyle w:val="background-details"/>
-          <w:b/>
-          <w:noProof/>
-          <w:szCs w:val="22"/>
-          <w:lang w:val="en-GB"/>
-        </w:rPr>
-        <w:t>3</w:t>
+          <w:noProof/>
+          <w:lang w:val="en-GB"/>
+        </w:rPr>
+        <w:t xml:space="preserve"> in Computer Science </w:t>
       </w:r>
       <w:r>
         <w:rPr>
           <w:rStyle w:val="background-details"/>
-          <w:b/>
-          <w:noProof/>
-          <w:lang w:val="en-GB"/>
-        </w:rPr>
-        <w:t xml:space="preserve">, JQuery, </w:t>
+          <w:noProof/>
+          <w:lang w:val="en-GB"/>
+        </w:rPr>
+        <w:t xml:space="preserve">(honours) </w:t>
       </w:r>
       <w:r>
         <w:rPr>
           <w:rStyle w:val="background-details"/>
-          <w:b/>
-          <w:noProof/>
-          <w:lang w:val="en-GB"/>
-        </w:rPr>
-        <w:t>JavaScript</w:t>
+          <w:noProof/>
+          <w:lang w:val="en-GB"/>
+        </w:rPr>
+        <w:t xml:space="preserve">degree achieving First Class </w:t>
       </w:r>
       <w:r>
         <w:rPr>
           <w:rStyle w:val="background-details"/>
-          <w:b/>
-          <w:noProof/>
-          <w:lang w:val="en-GB"/>
-        </w:rPr>
-        <w:t>, Bootstrap</w:t>
+          <w:noProof/>
+          <w:lang w:val="en-GB"/>
+        </w:rPr>
+        <w:t>H</w:t>
       </w:r>
       <w:r>
         <w:rPr>
@@ -576,80 +652,23 @@
           <w:noProof/>
           <w:lang w:val="en-GB"/>
         </w:rPr>
-        <w:t xml:space="preserve"> and Perl. </w:t>
-      </w:r>
-      <w:r>
-        <w:rPr>
-          <w:rStyle w:val="background-details"/>
-          <w:noProof/>
-          <w:lang w:val="en-GB"/>
-        </w:rPr>
-        <w:t xml:space="preserve">Prior to </w:t>
-      </w:r>
-      <w:r>
-        <w:rPr>
-          <w:rStyle w:val="background-details"/>
-          <w:noProof/>
-          <w:lang w:val="en-GB"/>
-        </w:rPr>
-        <w:t>employment</w:t>
-      </w:r>
-      <w:r>
-        <w:rPr>
-          <w:rStyle w:val="background-details"/>
-          <w:noProof/>
-          <w:lang w:val="en-GB"/>
-        </w:rPr>
-        <w:t xml:space="preserve"> I successfully completed a BSc</w:t>
-      </w:r>
-      <w:r>
-        <w:rPr>
-          <w:rStyle w:val="background-details"/>
-          <w:noProof/>
-          <w:lang w:val="en-GB"/>
-        </w:rPr>
-        <w:t>.</w:t>
-      </w:r>
-      <w:r>
-        <w:rPr>
-          <w:rStyle w:val="background-details"/>
-          <w:noProof/>
-          <w:lang w:val="en-GB"/>
-        </w:rPr>
-        <w:t xml:space="preserve"> in Computer Science </w:t>
-      </w:r>
-      <w:r>
-        <w:rPr>
-          <w:rStyle w:val="background-details"/>
-          <w:noProof/>
-          <w:lang w:val="en-GB"/>
-        </w:rPr>
-        <w:t xml:space="preserve">(honours) </w:t>
-      </w:r>
-      <w:r>
-        <w:rPr>
-          <w:rStyle w:val="background-details"/>
-          <w:noProof/>
-          <w:lang w:val="en-GB"/>
-        </w:rPr>
-        <w:t xml:space="preserve">degree achieving First Class </w:t>
-      </w:r>
-      <w:r>
-        <w:rPr>
-          <w:rStyle w:val="background-details"/>
-          <w:noProof/>
-          <w:lang w:val="en-GB"/>
-        </w:rPr>
-        <w:t>H</w:t>
-      </w:r>
-      <w:r>
-        <w:rPr>
-          <w:rStyle w:val="background-details"/>
-          <w:noProof/>
-          <w:lang w:val="en-GB"/>
-        </w:rPr>
         <w:t>onours in the process.</w:t>
       </w:r>
+    </w:p>
+    <w:p>
+      <w:pPr>
+        <w:autoSpaceDE w:val="0"/>
+        <w:autoSpaceDN w:val="0"/>
+        <w:adjustRightInd w:val="0"/>
+        <w:jc w:val="both"/>
+        <w:rPr>
+          <w:rFonts w:cs="Arial"/>
+          <w:b/>
+          <w:noProof/>
+          <w:szCs w:val="22"/>
+          <w:lang w:val="en-GB"/>
+        </w:rPr>
+      </w:pPr>
     </w:p>
     <w:p>
       <w:pPr>
@@ -742,7 +761,7 @@
           <w:u w:val="single" w:color="1F4E79" w:themeColor="accent1" w:themeShade="80"/>
           <w:lang w:val="en-GB"/>
         </w:rPr>
-        <w:t>Equisoft:  Newbridge, Co Kildare</w:t>
+        <w:t>Aspire Technology:  Sandyford, Dublin 18</w:t>
       </w:r>
     </w:p>
     <w:p>
@@ -768,14 +787,33 @@
         <w:autoSpaceDE w:val="0"/>
         <w:autoSpaceDN w:val="0"/>
         <w:adjustRightInd w:val="0"/>
-        <w:jc w:val="both"/>
-        <w:rPr>
-          <w:rFonts w:cs="Arial"/>
-          <w:noProof/>
-          <w:sz w:val="24"/>
-          <w:lang w:val="en-GB"/>
-        </w:rPr>
-      </w:pPr>
+        <w:rPr>
+          <w:rFonts w:cs="Arial"/>
+          <w:noProof/>
+          <w:sz w:val="24"/>
+          <w:lang w:val="en-GB"/>
+        </w:rPr>
+      </w:pPr>
+      <w:r>
+        <w:rPr>
+          <w:rFonts w:cs="Arial"/>
+          <w:b/>
+          <w:noProof/>
+          <w:sz w:val="24"/>
+          <w:lang w:val="en-GB"/>
+        </w:rPr>
+        <w:t xml:space="preserve">   </w:t>
+      </w:r>
+      <w:r>
+        <w:rPr>
+          <w:rFonts w:cs="Arial"/>
+          <w:b/>
+          <w:noProof/>
+          <w:sz w:val="24"/>
+          <w:lang w:val="en-GB"/>
+        </w:rPr>
+        <w:t>Position: Frontend Developer</w:t>
+      </w:r>
       <w:r>
         <w:rPr>
           <w:rFonts w:cs="Arial"/>
@@ -785,17 +823,6 @@
           <w:lang w:val="en-GB"/>
         </w:rPr>
         <w:tab/>
-        <w:t xml:space="preserve">   </w:t>
-      </w:r>
-      <w:r>
-        <w:rPr>
-          <w:rFonts w:cs="Arial"/>
-          <w:b/>
-          <w:noProof/>
-          <w:sz w:val="24"/>
-          <w:lang w:val="en-GB"/>
-        </w:rPr>
-        <w:t>Position: Software Developer</w:t>
       </w:r>
       <w:r>
         <w:rPr>
@@ -815,16 +842,6 @@
           <w:sz w:val="24"/>
           <w:lang w:val="en-GB"/>
         </w:rPr>
-        <w:t xml:space="preserve">   </w:t>
-      </w:r>
-      <w:r>
-        <w:rPr>
-          <w:rFonts w:cs="Arial"/>
-          <w:b/>
-          <w:noProof/>
-          <w:sz w:val="24"/>
-          <w:lang w:val="en-GB"/>
-        </w:rPr>
         <w:tab/>
       </w:r>
       <w:r>
@@ -846,17 +863,6 @@
           <w:lang w:val="en-GB"/>
         </w:rPr>
         <w:tab/>
-        <w:t xml:space="preserve">      </w:t>
-      </w:r>
-      <w:r>
-        <w:rPr>
-          <w:rFonts w:cs="Arial"/>
-          <w:b/>
-          <w:noProof/>
-          <w:sz w:val="24"/>
-          <w:lang w:val="en-GB"/>
-        </w:rPr>
-        <w:t xml:space="preserve">   </w:t>
       </w:r>
       <w:r>
         <w:rPr>
@@ -867,47 +873,47 @@
           <w:lang w:val="en-GB"/>
         </w:rPr>
         <w:tab/>
-        <w:t xml:space="preserve">    </w:t>
-      </w:r>
-      <w:r>
-        <w:rPr>
-          <w:rFonts w:cs="Arial"/>
-          <w:b/>
-          <w:noProof/>
-          <w:sz w:val="24"/>
-          <w:lang w:val="en-GB"/>
-        </w:rPr>
-        <w:t xml:space="preserve">January 2020 </w:t>
-      </w:r>
-      <w:r>
-        <w:rPr>
-          <w:rFonts w:cs="Arial"/>
-          <w:b/>
-          <w:noProof/>
-          <w:sz w:val="24"/>
-          <w:lang w:val="en-GB"/>
-        </w:rPr>
-        <w:t>–</w:t>
-      </w:r>
-      <w:r>
-        <w:rPr>
-          <w:rFonts w:cs="Arial"/>
-          <w:b/>
-          <w:noProof/>
-          <w:sz w:val="24"/>
-          <w:lang w:val="en-GB"/>
-        </w:rPr>
-        <w:t xml:space="preserve"> </w:t>
-      </w:r>
-      <w:r>
-        <w:rPr>
-          <w:rFonts w:cs="Arial"/>
-          <w:b/>
-          <w:noProof/>
-          <w:sz w:val="24"/>
-          <w:lang w:val="en-GB"/>
-        </w:rPr>
-        <w:t>May 2020</w:t>
+        <w:t>June</w:t>
+      </w:r>
+      <w:r>
+        <w:rPr>
+          <w:rFonts w:cs="Arial"/>
+          <w:b/>
+          <w:noProof/>
+          <w:sz w:val="24"/>
+          <w:lang w:val="en-GB"/>
+        </w:rPr>
+        <w:t xml:space="preserve"> 20</w:t>
+      </w:r>
+      <w:r>
+        <w:rPr>
+          <w:rFonts w:cs="Arial"/>
+          <w:b/>
+          <w:noProof/>
+          <w:sz w:val="24"/>
+          <w:lang w:val="en-GB"/>
+        </w:rPr>
+        <w:t>20</w:t>
+      </w:r>
+      <w:r>
+        <w:rPr>
+          <w:rFonts w:cs="Arial"/>
+          <w:b/>
+          <w:noProof/>
+          <w:sz w:val="24"/>
+          <w:lang w:val="en-GB"/>
+        </w:rPr>
+        <w:t xml:space="preserve"> – </w:t>
+      </w:r>
+      <w:r>
+        <w:rPr>
+          <w:rFonts w:cs="Arial"/>
+          <w:b/>
+          <w:noProof/>
+          <w:sz w:val="24"/>
+          <w:lang w:val="en-GB"/>
+        </w:rPr>
+        <w:t>Present</w:t>
       </w:r>
     </w:p>
     <w:p>
@@ -981,7 +987,18 @@
           <w:szCs w:val="22"/>
           <w:lang w:val="en-GB"/>
         </w:rPr>
-        <w:t>Development of high quality code for the Timesheets and Horse Management System, communicating within an agile environment, to deliver software releases on time</w:t>
+        <w:t xml:space="preserve">Delivery of high quality, interactive frontend dashboards for both internal and external use. Examples include </w:t>
+      </w:r>
+      <w:r>
+        <w:rPr>
+          <w:rFonts w:ascii="Arial" w:hAnsi="Arial" w:cs="Arial"/>
+          <w:bCs/>
+          <w:noProof/>
+          <w:sz w:val="22"/>
+          <w:szCs w:val="22"/>
+          <w:lang w:val="en-GB"/>
+        </w:rPr>
+        <w:t>‘Alarm Analytics Dashboards’, ‘Health Checks’ and ‘Energy Saving and Consumption Dashboards’</w:t>
       </w:r>
       <w:r>
         <w:rPr>
@@ -1025,246 +1042,8 @@
           <w:szCs w:val="22"/>
           <w:lang w:val="en-GB"/>
         </w:rPr>
-        <w:t>Developed within PowerBuilder IDE along with Microsoft SQL Server and SourceSafe for version control.</w:t>
-      </w:r>
-    </w:p>
-    <w:p>
-      <w:pPr>
-        <w:pStyle w:val="NormalWeb"/>
-        <w:shd w:val="clear" w:color="auto" w:fill="FFFFFF"/>
-        <w:spacing w:after="200" w:afterAutospacing="0" w:line="276" w:lineRule="auto"/>
-        <w:ind w:left="714"/>
-        <w:contextualSpacing/>
-        <w:jc w:val="both"/>
-        <w:rPr>
-          <w:rFonts w:ascii="Arial" w:hAnsi="Arial" w:cs="Arial"/>
-          <w:bCs/>
-          <w:noProof/>
-          <w:sz w:val="20"/>
-          <w:szCs w:val="20"/>
-          <w:lang w:val="en-GB"/>
-        </w:rPr>
-      </w:pPr>
-    </w:p>
-    <w:p>
-      <w:pPr>
-        <w:autoSpaceDE w:val="0"/>
-        <w:autoSpaceDN w:val="0"/>
-        <w:adjustRightInd w:val="0"/>
-        <w:rPr>
-          <w:rFonts w:cs="Arial"/>
-          <w:noProof/>
-          <w:sz w:val="24"/>
-          <w:u w:val="single" w:color="1F4E79" w:themeColor="accent1" w:themeShade="80"/>
-          <w:lang w:val="en-GB"/>
-        </w:rPr>
-      </w:pPr>
-      <w:r>
-        <w:rPr>
-          <w:rFonts w:cs="Arial"/>
-          <w:b/>
-          <w:noProof/>
-          <w:sz w:val="24"/>
-          <w:u w:val="single" w:color="1F4E79" w:themeColor="accent1" w:themeShade="80"/>
-          <w:lang w:val="en-GB"/>
-        </w:rPr>
-        <w:t>Aspire Technolog</w:t>
-      </w:r>
-      <w:r>
-        <w:rPr>
-          <w:rFonts w:cs="Arial"/>
-          <w:b/>
-          <w:noProof/>
-          <w:sz w:val="24"/>
-          <w:u w:val="single" w:color="1F4E79" w:themeColor="accent1" w:themeShade="80"/>
-          <w:lang w:val="en-GB"/>
-        </w:rPr>
-        <w:t>y</w:t>
-      </w:r>
-      <w:r>
-        <w:rPr>
-          <w:rFonts w:cs="Arial"/>
-          <w:b/>
-          <w:noProof/>
-          <w:sz w:val="24"/>
-          <w:u w:val="single" w:color="1F4E79" w:themeColor="accent1" w:themeShade="80"/>
-          <w:lang w:val="en-GB"/>
-        </w:rPr>
-        <w:t xml:space="preserve">:  </w:t>
-      </w:r>
-      <w:r>
-        <w:rPr>
-          <w:rFonts w:cs="Arial"/>
-          <w:b/>
-          <w:noProof/>
-          <w:sz w:val="24"/>
-          <w:u w:val="single" w:color="1F4E79" w:themeColor="accent1" w:themeShade="80"/>
-          <w:lang w:val="en-GB"/>
-        </w:rPr>
-        <w:t>Sandyford, Dublin 18</w:t>
-      </w:r>
-    </w:p>
-    <w:p>
-      <w:pPr>
-        <w:autoSpaceDE w:val="0"/>
-        <w:autoSpaceDN w:val="0"/>
-        <w:adjustRightInd w:val="0"/>
-        <w:rPr>
-          <w:rFonts w:cs="Arial"/>
-          <w:noProof/>
-          <w:sz w:val="20"/>
-          <w:szCs w:val="20"/>
-          <w:lang w:val="en-GB"/>
-        </w:rPr>
-      </w:pPr>
-    </w:p>
-    <w:p>
-      <w:pPr>
-        <w:tabs>
-          <w:tab w:val="right" w:pos="567"/>
-          <w:tab w:val="right" w:pos="3402"/>
-        </w:tabs>
-        <w:autoSpaceDE w:val="0"/>
-        <w:autoSpaceDN w:val="0"/>
-        <w:adjustRightInd w:val="0"/>
-        <w:rPr>
-          <w:rFonts w:cs="Arial"/>
-          <w:noProof/>
-          <w:sz w:val="24"/>
-          <w:lang w:val="en-GB"/>
-        </w:rPr>
-      </w:pPr>
-      <w:r>
-        <w:rPr>
-          <w:rFonts w:cs="Arial"/>
-          <w:b/>
-          <w:noProof/>
-          <w:sz w:val="24"/>
-          <w:lang w:val="en-GB"/>
-        </w:rPr>
-        <w:t xml:space="preserve">   </w:t>
-      </w:r>
-      <w:r>
-        <w:rPr>
-          <w:rFonts w:cs="Arial"/>
-          <w:b/>
-          <w:noProof/>
-          <w:sz w:val="24"/>
-          <w:lang w:val="en-GB"/>
-        </w:rPr>
-        <w:t>Position:</w:t>
-      </w:r>
-      <w:r>
-        <w:rPr>
-          <w:rFonts w:cs="Arial"/>
-          <w:b/>
-          <w:noProof/>
-          <w:sz w:val="24"/>
-          <w:lang w:val="en-GB"/>
-        </w:rPr>
-        <w:t xml:space="preserve"> Frontend Developer</w:t>
-      </w:r>
-      <w:r>
-        <w:rPr>
-          <w:rFonts w:cs="Arial"/>
-          <w:b/>
-          <w:noProof/>
-          <w:sz w:val="24"/>
-          <w:lang w:val="en-GB"/>
-        </w:rPr>
-        <w:tab/>
-      </w:r>
-      <w:r>
-        <w:rPr>
-          <w:rFonts w:cs="Arial"/>
-          <w:b/>
-          <w:noProof/>
-          <w:sz w:val="24"/>
-          <w:lang w:val="en-GB"/>
-        </w:rPr>
-        <w:tab/>
-      </w:r>
-      <w:r>
-        <w:rPr>
-          <w:rFonts w:cs="Arial"/>
-          <w:b/>
-          <w:noProof/>
-          <w:sz w:val="24"/>
-          <w:lang w:val="en-GB"/>
-        </w:rPr>
-        <w:tab/>
-      </w:r>
-      <w:r>
-        <w:rPr>
-          <w:rFonts w:cs="Arial"/>
-          <w:b/>
-          <w:noProof/>
-          <w:sz w:val="24"/>
-          <w:lang w:val="en-GB"/>
-        </w:rPr>
-        <w:tab/>
-      </w:r>
-      <w:r>
-        <w:rPr>
-          <w:rFonts w:cs="Arial"/>
-          <w:b/>
-          <w:noProof/>
-          <w:sz w:val="24"/>
-          <w:lang w:val="en-GB"/>
-        </w:rPr>
-        <w:t xml:space="preserve">February 2019 – </w:t>
-      </w:r>
-      <w:r>
-        <w:rPr>
-          <w:rFonts w:cs="Arial"/>
-          <w:b/>
-          <w:noProof/>
-          <w:sz w:val="24"/>
-          <w:lang w:val="en-GB"/>
-        </w:rPr>
-        <w:t>September 2019</w:t>
-      </w:r>
-    </w:p>
-    <w:p>
-      <w:pPr>
-        <w:pStyle w:val="NormalWeb"/>
-        <w:shd w:val="clear" w:color="auto" w:fill="FFFFFF"/>
-        <w:spacing w:after="0" w:afterAutospacing="0"/>
-        <w:ind w:firstLine="357"/>
-        <w:rPr>
-          <w:rFonts w:ascii="Arial" w:hAnsi="Arial" w:cs="Arial"/>
-          <w:b/>
-          <w:bCs/>
-          <w:noProof/>
-          <w:lang w:val="en-GB"/>
-        </w:rPr>
-      </w:pPr>
-      <w:r>
-        <w:rPr>
-          <w:rFonts w:ascii="Arial" w:hAnsi="Arial" w:cs="Arial"/>
-          <w:b/>
-          <w:bCs/>
-          <w:noProof/>
-          <w:lang w:val="en-GB"/>
-        </w:rPr>
-        <w:t>Main Responsibilities</w:t>
-      </w:r>
-    </w:p>
-    <w:p>
-      <w:pPr>
-        <w:pStyle w:val="NormalWeb"/>
-        <w:shd w:val="clear" w:color="auto" w:fill="FFFFFF"/>
-        <w:spacing w:after="0" w:afterAutospacing="0"/>
-        <w:rPr>
-          <w:rFonts w:ascii="Arial" w:hAnsi="Arial" w:cs="Arial"/>
-          <w:b/>
-          <w:bCs/>
-          <w:noProof/>
-          <w:sz w:val="22"/>
-          <w:szCs w:val="22"/>
-          <w:lang w:val="en-GB"/>
-        </w:rPr>
-      </w:pPr>
+        <w:t>Dashboards were visualisations of large data sets returned from REST API calls.</w:t>
+      </w:r>
     </w:p>
     <w:p>
       <w:pPr>
@@ -1296,381 +1075,51 @@
           <w:szCs w:val="22"/>
           <w:lang w:val="en-GB"/>
         </w:rPr>
-        <w:t>Delivery of high quality</w:t>
-      </w:r>
-      <w:r>
-        <w:rPr>
-          <w:rFonts w:ascii="Arial" w:hAnsi="Arial" w:cs="Arial"/>
-          <w:bCs/>
-          <w:noProof/>
-          <w:sz w:val="22"/>
-          <w:szCs w:val="22"/>
-          <w:lang w:val="en-GB"/>
-        </w:rPr>
-        <w:t>, interactive</w:t>
-      </w:r>
-      <w:r>
-        <w:rPr>
-          <w:rFonts w:ascii="Arial" w:hAnsi="Arial" w:cs="Arial"/>
-          <w:bCs/>
-          <w:noProof/>
-          <w:sz w:val="22"/>
-          <w:szCs w:val="22"/>
-          <w:lang w:val="en-GB"/>
-        </w:rPr>
-        <w:t xml:space="preserve"> fron</w:t>
-      </w:r>
-      <w:r>
-        <w:rPr>
-          <w:rFonts w:ascii="Arial" w:hAnsi="Arial" w:cs="Arial"/>
-          <w:bCs/>
-          <w:noProof/>
-          <w:sz w:val="22"/>
-          <w:szCs w:val="22"/>
-          <w:lang w:val="en-GB"/>
-        </w:rPr>
-        <w:t>t</w:t>
-      </w:r>
-      <w:r>
-        <w:rPr>
-          <w:rFonts w:ascii="Arial" w:hAnsi="Arial" w:cs="Arial"/>
-          <w:bCs/>
-          <w:noProof/>
-          <w:sz w:val="22"/>
-          <w:szCs w:val="22"/>
-          <w:lang w:val="en-GB"/>
-        </w:rPr>
-        <w:t xml:space="preserve">end dashboards for </w:t>
-      </w:r>
-      <w:r>
-        <w:rPr>
-          <w:rFonts w:ascii="Arial" w:hAnsi="Arial" w:cs="Arial"/>
-          <w:bCs/>
-          <w:noProof/>
-          <w:sz w:val="22"/>
-          <w:szCs w:val="22"/>
-          <w:lang w:val="en-GB"/>
-        </w:rPr>
-        <w:t xml:space="preserve">both </w:t>
-      </w:r>
-      <w:r>
-        <w:rPr>
-          <w:rFonts w:ascii="Arial" w:hAnsi="Arial" w:cs="Arial"/>
-          <w:bCs/>
-          <w:noProof/>
-          <w:sz w:val="22"/>
-          <w:szCs w:val="22"/>
-          <w:lang w:val="en-GB"/>
-        </w:rPr>
-        <w:t xml:space="preserve">internal and external </w:t>
-      </w:r>
-      <w:r>
-        <w:rPr>
-          <w:rFonts w:ascii="Arial" w:hAnsi="Arial" w:cs="Arial"/>
-          <w:bCs/>
-          <w:noProof/>
-          <w:sz w:val="22"/>
-          <w:szCs w:val="22"/>
-          <w:lang w:val="en-GB"/>
-        </w:rPr>
-        <w:t>use</w:t>
-      </w:r>
-      <w:r>
-        <w:rPr>
-          <w:rFonts w:ascii="Arial" w:hAnsi="Arial" w:cs="Arial"/>
-          <w:bCs/>
-          <w:noProof/>
-          <w:sz w:val="22"/>
-          <w:szCs w:val="22"/>
-          <w:lang w:val="en-GB"/>
-        </w:rPr>
-        <w:t xml:space="preserve">. </w:t>
-      </w:r>
-      <w:r>
-        <w:rPr>
-          <w:rFonts w:ascii="Arial" w:hAnsi="Arial" w:cs="Arial"/>
-          <w:bCs/>
-          <w:noProof/>
-          <w:sz w:val="22"/>
-          <w:szCs w:val="22"/>
-          <w:lang w:val="en-GB"/>
-        </w:rPr>
-        <w:t xml:space="preserve">Examples </w:t>
-      </w:r>
-      <w:r>
-        <w:rPr>
-          <w:rFonts w:ascii="Arial" w:hAnsi="Arial" w:cs="Arial"/>
-          <w:bCs/>
-          <w:noProof/>
-          <w:sz w:val="22"/>
-          <w:szCs w:val="22"/>
-          <w:lang w:val="en-GB"/>
-        </w:rPr>
-        <w:t xml:space="preserve">include </w:t>
-      </w:r>
-      <w:r>
-        <w:rPr>
-          <w:rFonts w:ascii="Arial" w:hAnsi="Arial" w:cs="Arial"/>
-          <w:bCs/>
-          <w:noProof/>
-          <w:sz w:val="22"/>
-          <w:szCs w:val="22"/>
-          <w:lang w:val="en-GB"/>
-        </w:rPr>
-        <w:t>V</w:t>
-      </w:r>
-      <w:r>
-        <w:rPr>
-          <w:rFonts w:ascii="Arial" w:hAnsi="Arial" w:cs="Arial"/>
-          <w:bCs/>
-          <w:noProof/>
-          <w:sz w:val="22"/>
-          <w:szCs w:val="22"/>
-          <w:lang w:val="en-GB"/>
-        </w:rPr>
-        <w:t xml:space="preserve">oice and </w:t>
-      </w:r>
-      <w:r>
-        <w:rPr>
-          <w:rFonts w:ascii="Arial" w:hAnsi="Arial" w:cs="Arial"/>
-          <w:bCs/>
-          <w:noProof/>
-          <w:sz w:val="22"/>
-          <w:szCs w:val="22"/>
-          <w:lang w:val="en-GB"/>
-        </w:rPr>
-        <w:t>D</w:t>
-      </w:r>
-      <w:r>
-        <w:rPr>
-          <w:rFonts w:ascii="Arial" w:hAnsi="Arial" w:cs="Arial"/>
-          <w:bCs/>
-          <w:noProof/>
-          <w:sz w:val="22"/>
-          <w:szCs w:val="22"/>
-          <w:lang w:val="en-GB"/>
-        </w:rPr>
-        <w:t xml:space="preserve">ata </w:t>
-      </w:r>
-      <w:r>
-        <w:rPr>
-          <w:rFonts w:ascii="Arial" w:hAnsi="Arial" w:cs="Arial"/>
-          <w:bCs/>
-          <w:noProof/>
-          <w:sz w:val="22"/>
-          <w:szCs w:val="22"/>
-          <w:lang w:val="en-GB"/>
-        </w:rPr>
-        <w:t>Q</w:t>
-      </w:r>
-      <w:r>
-        <w:rPr>
-          <w:rFonts w:ascii="Arial" w:hAnsi="Arial" w:cs="Arial"/>
-          <w:bCs/>
-          <w:noProof/>
-          <w:sz w:val="22"/>
-          <w:szCs w:val="22"/>
-          <w:lang w:val="en-GB"/>
-        </w:rPr>
-        <w:t xml:space="preserve">uality </w:t>
-      </w:r>
-      <w:r>
-        <w:rPr>
-          <w:rFonts w:ascii="Arial" w:hAnsi="Arial" w:cs="Arial"/>
-          <w:bCs/>
-          <w:noProof/>
-          <w:sz w:val="22"/>
-          <w:szCs w:val="22"/>
-          <w:lang w:val="en-GB"/>
-        </w:rPr>
-        <w:t>V</w:t>
-      </w:r>
-      <w:r>
-        <w:rPr>
-          <w:rFonts w:ascii="Arial" w:hAnsi="Arial" w:cs="Arial"/>
-          <w:bCs/>
-          <w:noProof/>
-          <w:sz w:val="22"/>
-          <w:szCs w:val="22"/>
-          <w:lang w:val="en-GB"/>
-        </w:rPr>
-        <w:t>isualisation</w:t>
-      </w:r>
-      <w:r>
-        <w:rPr>
-          <w:rFonts w:ascii="Arial" w:hAnsi="Arial" w:cs="Arial"/>
-          <w:bCs/>
-          <w:noProof/>
-          <w:sz w:val="22"/>
-          <w:szCs w:val="22"/>
-          <w:lang w:val="en-GB"/>
-        </w:rPr>
-        <w:t>s</w:t>
-      </w:r>
-      <w:r>
-        <w:rPr>
-          <w:rFonts w:ascii="Arial" w:hAnsi="Arial" w:cs="Arial"/>
-          <w:bCs/>
-          <w:noProof/>
-          <w:sz w:val="22"/>
-          <w:szCs w:val="22"/>
-          <w:lang w:val="en-GB"/>
-        </w:rPr>
-        <w:t xml:space="preserve"> and Site Alarm Trends.</w:t>
-      </w:r>
-    </w:p>
-    <w:p>
-      <w:pPr>
-        <w:pStyle w:val="NormalWeb"/>
-        <w:numPr>
-          <w:ilvl w:val="0"/>
-          <w:numId w:val="7"/>
-        </w:numPr>
-        <w:shd w:val="clear" w:color="auto" w:fill="FFFFFF"/>
-        <w:spacing w:after="200" w:afterAutospacing="0" w:line="276" w:lineRule="auto"/>
-        <w:ind w:left="714" w:hanging="357"/>
-        <w:contextualSpacing/>
-        <w:jc w:val="both"/>
-        <w:rPr>
-          <w:rFonts w:ascii="Arial" w:hAnsi="Arial" w:cs="Arial"/>
-          <w:bCs/>
-          <w:noProof/>
-          <w:sz w:val="22"/>
-          <w:szCs w:val="22"/>
-          <w:lang w:val="en-GB"/>
-        </w:rPr>
-      </w:pPr>
-      <w:r>
-        <w:rPr>
-          <w:rFonts w:ascii="Arial" w:hAnsi="Arial" w:cs="Arial"/>
-          <w:bCs/>
-          <w:noProof/>
-          <w:sz w:val="22"/>
-          <w:szCs w:val="22"/>
-          <w:lang w:val="en-GB"/>
-        </w:rPr>
-        <w:t xml:space="preserve">Tools were developed within eclipse and VS Code </w:t>
-      </w:r>
-      <w:r>
-        <w:rPr>
-          <w:rFonts w:ascii="Arial" w:hAnsi="Arial" w:cs="Arial"/>
-          <w:bCs/>
-          <w:noProof/>
-          <w:sz w:val="22"/>
-          <w:szCs w:val="22"/>
-          <w:lang w:val="en-GB"/>
-        </w:rPr>
-        <w:t xml:space="preserve">IDE’s </w:t>
-      </w:r>
-      <w:r>
-        <w:rPr>
-          <w:rFonts w:ascii="Arial" w:hAnsi="Arial" w:cs="Arial"/>
-          <w:bCs/>
-          <w:noProof/>
-          <w:sz w:val="22"/>
-          <w:szCs w:val="22"/>
-          <w:lang w:val="en-GB"/>
-        </w:rPr>
-        <w:t>using HTML</w:t>
-      </w:r>
-      <w:r>
-        <w:rPr>
-          <w:rFonts w:ascii="Arial" w:hAnsi="Arial" w:cs="Arial"/>
-          <w:bCs/>
-          <w:noProof/>
-          <w:sz w:val="22"/>
-          <w:szCs w:val="22"/>
-          <w:lang w:val="en-GB"/>
-        </w:rPr>
-        <w:t>5</w:t>
-      </w:r>
-      <w:r>
-        <w:rPr>
-          <w:rFonts w:ascii="Arial" w:hAnsi="Arial" w:cs="Arial"/>
-          <w:bCs/>
-          <w:noProof/>
-          <w:sz w:val="22"/>
-          <w:szCs w:val="22"/>
-          <w:lang w:val="en-GB"/>
-        </w:rPr>
-        <w:t>, CSS</w:t>
-      </w:r>
-      <w:r>
-        <w:rPr>
-          <w:rFonts w:ascii="Arial" w:hAnsi="Arial" w:cs="Arial"/>
-          <w:bCs/>
-          <w:noProof/>
-          <w:sz w:val="22"/>
-          <w:szCs w:val="22"/>
-          <w:lang w:val="en-GB"/>
-        </w:rPr>
-        <w:t>3</w:t>
-      </w:r>
-      <w:r>
-        <w:rPr>
-          <w:rFonts w:ascii="Arial" w:hAnsi="Arial" w:cs="Arial"/>
-          <w:bCs/>
-          <w:noProof/>
-          <w:sz w:val="22"/>
-          <w:szCs w:val="22"/>
-          <w:lang w:val="en-GB"/>
-        </w:rPr>
-        <w:t xml:space="preserve">, </w:t>
-      </w:r>
-      <w:r>
-        <w:rPr>
-          <w:rFonts w:ascii="Arial" w:hAnsi="Arial" w:cs="Arial"/>
-          <w:bCs/>
-          <w:noProof/>
-          <w:sz w:val="22"/>
-          <w:szCs w:val="22"/>
-          <w:lang w:val="en-GB"/>
-        </w:rPr>
-        <w:t>jQuery</w:t>
-      </w:r>
-      <w:r>
-        <w:rPr>
-          <w:rFonts w:ascii="Arial" w:hAnsi="Arial" w:cs="Arial"/>
-          <w:bCs/>
-          <w:noProof/>
-          <w:sz w:val="22"/>
-          <w:szCs w:val="22"/>
-          <w:lang w:val="en-GB"/>
-        </w:rPr>
-        <w:t xml:space="preserve">, </w:t>
-      </w:r>
-      <w:r>
-        <w:rPr>
-          <w:rFonts w:ascii="Arial" w:hAnsi="Arial" w:cs="Arial"/>
-          <w:bCs/>
-          <w:noProof/>
-          <w:sz w:val="22"/>
-          <w:szCs w:val="22"/>
-          <w:lang w:val="en-GB"/>
-        </w:rPr>
-        <w:t>JavaScript</w:t>
-      </w:r>
-      <w:r>
-        <w:rPr>
-          <w:rFonts w:ascii="Arial" w:hAnsi="Arial" w:cs="Arial"/>
-          <w:bCs/>
-          <w:noProof/>
-          <w:sz w:val="22"/>
-          <w:szCs w:val="22"/>
-          <w:lang w:val="en-GB"/>
-        </w:rPr>
-        <w:t>, Bootstrap and Perl and were done in an agile methodology environment</w:t>
-      </w:r>
-      <w:r>
-        <w:rPr>
-          <w:rFonts w:ascii="Arial" w:hAnsi="Arial" w:cs="Arial"/>
-          <w:bCs/>
-          <w:noProof/>
-          <w:sz w:val="22"/>
-          <w:szCs w:val="22"/>
-          <w:lang w:val="en-GB"/>
-        </w:rPr>
-        <w:t>.</w:t>
+        <w:t xml:space="preserve">Tools were developed within VS Code IDE using </w:t>
+      </w:r>
+      <w:r>
+        <w:rPr>
+          <w:rFonts w:ascii="Arial" w:hAnsi="Arial" w:cs="Arial"/>
+          <w:bCs/>
+          <w:noProof/>
+          <w:sz w:val="22"/>
+          <w:szCs w:val="22"/>
+          <w:lang w:val="en-GB"/>
+        </w:rPr>
+        <w:t xml:space="preserve">the Vue.js framework aswell as </w:t>
+      </w:r>
+      <w:r>
+        <w:rPr>
+          <w:rFonts w:ascii="Arial" w:hAnsi="Arial" w:cs="Arial"/>
+          <w:bCs/>
+          <w:noProof/>
+          <w:sz w:val="22"/>
+          <w:szCs w:val="22"/>
+          <w:lang w:val="en-GB"/>
+        </w:rPr>
+        <w:t>HTML5, CSS3</w:t>
+      </w:r>
+      <w:r>
+        <w:rPr>
+          <w:rFonts w:ascii="Arial" w:hAnsi="Arial" w:cs="Arial"/>
+          <w:bCs/>
+          <w:noProof/>
+          <w:sz w:val="22"/>
+          <w:szCs w:val="22"/>
+          <w:lang w:val="en-GB"/>
+        </w:rPr>
+        <w:t xml:space="preserve"> and</w:t>
+      </w:r>
+      <w:r>
+        <w:rPr>
+          <w:rFonts w:ascii="Arial" w:hAnsi="Arial" w:cs="Arial"/>
+          <w:bCs/>
+          <w:noProof/>
+          <w:sz w:val="22"/>
+          <w:szCs w:val="22"/>
+          <w:lang w:val="en-GB"/>
+        </w:rPr>
+        <w:t xml:space="preserve"> JavaScript and were done in an agile methodology environment.</w:t>
       </w:r>
     </w:p>
     <w:p>
@@ -1707,161 +1156,7 @@
           <w:szCs w:val="22"/>
           <w:lang w:val="en-GB"/>
         </w:rPr>
-        <w:t>D</w:t>
-      </w:r>
-      <w:r>
-        <w:rPr>
-          <w:rFonts w:ascii="Arial" w:hAnsi="Arial" w:cs="Arial"/>
-          <w:bCs/>
-          <w:noProof/>
-          <w:sz w:val="22"/>
-          <w:szCs w:val="22"/>
-          <w:lang w:val="en-GB"/>
-        </w:rPr>
-        <w:t>elivery of software was performed</w:t>
-      </w:r>
-      <w:r>
-        <w:rPr>
-          <w:rFonts w:ascii="Arial" w:hAnsi="Arial" w:cs="Arial"/>
-          <w:bCs/>
-          <w:noProof/>
-          <w:sz w:val="22"/>
-          <w:szCs w:val="22"/>
-          <w:lang w:val="en-GB"/>
-        </w:rPr>
-        <w:t xml:space="preserve"> using git and deployed </w:t>
-      </w:r>
-      <w:r>
-        <w:rPr>
-          <w:rFonts w:ascii="Arial" w:hAnsi="Arial" w:cs="Arial"/>
-          <w:bCs/>
-          <w:noProof/>
-          <w:sz w:val="22"/>
-          <w:szCs w:val="22"/>
-          <w:lang w:val="en-GB"/>
-        </w:rPr>
-        <w:t xml:space="preserve">either via Docker </w:t>
-      </w:r>
-      <w:r>
-        <w:rPr>
-          <w:rFonts w:ascii="Arial" w:hAnsi="Arial" w:cs="Arial"/>
-          <w:bCs/>
-          <w:noProof/>
-          <w:sz w:val="22"/>
-          <w:szCs w:val="22"/>
-          <w:lang w:val="en-GB"/>
-        </w:rPr>
-        <w:t xml:space="preserve">images </w:t>
-      </w:r>
-      <w:r>
-        <w:rPr>
-          <w:rFonts w:ascii="Arial" w:hAnsi="Arial" w:cs="Arial"/>
-          <w:bCs/>
-          <w:noProof/>
-          <w:sz w:val="22"/>
-          <w:szCs w:val="22"/>
-          <w:lang w:val="en-GB"/>
-        </w:rPr>
-        <w:t xml:space="preserve">or </w:t>
-      </w:r>
-      <w:r>
-        <w:rPr>
-          <w:rFonts w:ascii="Arial" w:hAnsi="Arial" w:cs="Arial"/>
-          <w:bCs/>
-          <w:noProof/>
-          <w:sz w:val="22"/>
-          <w:szCs w:val="22"/>
-          <w:lang w:val="en-GB"/>
-        </w:rPr>
-        <w:t xml:space="preserve">by logging </w:t>
-      </w:r>
-      <w:r>
-        <w:rPr>
-          <w:rFonts w:ascii="Arial" w:hAnsi="Arial" w:cs="Arial"/>
-          <w:bCs/>
-          <w:noProof/>
-          <w:sz w:val="22"/>
-          <w:szCs w:val="22"/>
-          <w:lang w:val="en-GB"/>
-        </w:rPr>
-        <w:t>o</w:t>
-      </w:r>
-      <w:r>
-        <w:rPr>
-          <w:rFonts w:ascii="Arial" w:hAnsi="Arial" w:cs="Arial"/>
-          <w:bCs/>
-          <w:noProof/>
-          <w:sz w:val="22"/>
-          <w:szCs w:val="22"/>
-          <w:lang w:val="en-GB"/>
-        </w:rPr>
-        <w:t xml:space="preserve">nto </w:t>
-      </w:r>
-      <w:r>
-        <w:rPr>
-          <w:rFonts w:ascii="Arial" w:hAnsi="Arial" w:cs="Arial"/>
-          <w:bCs/>
-          <w:noProof/>
-          <w:sz w:val="22"/>
-          <w:szCs w:val="22"/>
-          <w:lang w:val="en-GB"/>
-        </w:rPr>
-        <w:t xml:space="preserve">internal or </w:t>
-      </w:r>
-      <w:r>
-        <w:rPr>
-          <w:rFonts w:ascii="Arial" w:hAnsi="Arial" w:cs="Arial"/>
-          <w:bCs/>
-          <w:noProof/>
-          <w:sz w:val="22"/>
-          <w:szCs w:val="22"/>
-          <w:lang w:val="en-GB"/>
-        </w:rPr>
-        <w:t>external servers</w:t>
-      </w:r>
-      <w:r>
-        <w:rPr>
-          <w:rFonts w:ascii="Arial" w:hAnsi="Arial" w:cs="Arial"/>
-          <w:bCs/>
-          <w:noProof/>
-          <w:sz w:val="22"/>
-          <w:szCs w:val="22"/>
-          <w:lang w:val="en-GB"/>
-        </w:rPr>
-        <w:t xml:space="preserve"> (i.e. AWS)</w:t>
-      </w:r>
-      <w:r>
-        <w:rPr>
-          <w:rFonts w:ascii="Arial" w:hAnsi="Arial" w:cs="Arial"/>
-          <w:bCs/>
-          <w:noProof/>
-          <w:sz w:val="22"/>
-          <w:szCs w:val="22"/>
-          <w:lang w:val="en-GB"/>
-        </w:rPr>
-        <w:t xml:space="preserve"> via </w:t>
-      </w:r>
-      <w:r>
-        <w:rPr>
-          <w:rFonts w:ascii="Arial" w:hAnsi="Arial" w:cs="Arial"/>
-          <w:bCs/>
-          <w:noProof/>
-          <w:sz w:val="22"/>
-          <w:szCs w:val="22"/>
-          <w:lang w:val="en-GB"/>
-        </w:rPr>
-        <w:t>PuTTY</w:t>
-      </w:r>
-      <w:r>
-        <w:rPr>
-          <w:rFonts w:ascii="Arial" w:hAnsi="Arial" w:cs="Arial"/>
-          <w:bCs/>
-          <w:noProof/>
-          <w:sz w:val="22"/>
-          <w:szCs w:val="22"/>
-          <w:lang w:val="en-GB"/>
-        </w:rPr>
-        <w:t>.</w:t>
+        <w:t>Delivery of software was performed using git and deployed either via Docker images or by logging onto internal or external servers (i.e. AWS) via PuTTY.</w:t>
       </w:r>
     </w:p>
     <w:p>
@@ -1898,7 +1193,7 @@
           <w:szCs w:val="22"/>
           <w:lang w:val="en-GB"/>
         </w:rPr>
-        <w:t>Required e</w:t>
+        <w:t xml:space="preserve">Required excellent communication skills </w:t>
       </w:r>
       <w:r>
         <w:rPr>
@@ -1909,7 +1204,7 @@
           <w:szCs w:val="22"/>
           <w:lang w:val="en-GB"/>
         </w:rPr>
-        <w:t>xcellent communication skills working in a team environment</w:t>
+        <w:t xml:space="preserve">while </w:t>
       </w:r>
       <w:r>
         <w:rPr>
@@ -1920,6 +1215,39 @@
           <w:szCs w:val="22"/>
           <w:lang w:val="en-GB"/>
         </w:rPr>
+        <w:t xml:space="preserve">working </w:t>
+      </w:r>
+      <w:r>
+        <w:rPr>
+          <w:rFonts w:ascii="Arial" w:hAnsi="Arial" w:cs="Arial"/>
+          <w:noProof/>
+          <w:color w:val="000000"/>
+          <w:sz w:val="22"/>
+          <w:szCs w:val="22"/>
+          <w:lang w:val="en-GB"/>
+        </w:rPr>
+        <w:t xml:space="preserve">remotely </w:t>
+      </w:r>
+      <w:r>
+        <w:rPr>
+          <w:rFonts w:ascii="Arial" w:hAnsi="Arial" w:cs="Arial"/>
+          <w:noProof/>
+          <w:color w:val="000000"/>
+          <w:sz w:val="22"/>
+          <w:szCs w:val="22"/>
+          <w:lang w:val="en-GB"/>
+        </w:rPr>
+        <w:t>in a team environment, based in Dublin</w:t>
+      </w:r>
+      <w:r>
+        <w:rPr>
+          <w:rFonts w:ascii="Arial" w:hAnsi="Arial" w:cs="Arial"/>
+          <w:noProof/>
+          <w:color w:val="000000"/>
+          <w:sz w:val="22"/>
+          <w:szCs w:val="22"/>
+          <w:lang w:val="en-GB"/>
+        </w:rPr>
         <w:t>,</w:t>
       </w:r>
       <w:r>
@@ -1931,7 +1259,7 @@
           <w:szCs w:val="22"/>
           <w:lang w:val="en-GB"/>
         </w:rPr>
-        <w:t xml:space="preserve"> based in Dublin and Belgrade</w:t>
+        <w:t xml:space="preserve"> Belgrade</w:t>
       </w:r>
       <w:r>
         <w:rPr>
@@ -1942,7 +1270,7 @@
           <w:szCs w:val="22"/>
           <w:lang w:val="en-GB"/>
         </w:rPr>
-        <w:t>.</w:t>
+        <w:t xml:space="preserve"> and Lisbon</w:t>
       </w:r>
       <w:r>
         <w:rPr>
@@ -1953,29 +1281,96 @@
           <w:szCs w:val="22"/>
           <w:lang w:val="en-GB"/>
         </w:rPr>
-        <w:t xml:space="preserve"> Often worked under pressure to deliver dashboards within a short timeframe.</w:t>
-      </w:r>
-    </w:p>
-    <w:p>
-      <w:pPr>
+        <w:t>. Often worked under pressure to deliver dashboards within a short timeframe.</w:t>
+      </w:r>
+    </w:p>
+    <w:p>
+      <w:pPr>
+        <w:pStyle w:val="NormalWeb"/>
+        <w:widowControl w:val="0"/>
+        <w:shd w:val="clear" w:color="auto" w:fill="FFFFFF"/>
+        <w:overflowPunct w:val="0"/>
         <w:autoSpaceDE w:val="0"/>
         <w:autoSpaceDN w:val="0"/>
         <w:adjustRightInd w:val="0"/>
-        <w:rPr>
-          <w:rFonts w:cs="Arial"/>
-          <w:noProof/>
-          <w:sz w:val="24"/>
-          <w:lang w:val="en-GB"/>
-        </w:rPr>
-      </w:pPr>
-      <w:r>
-        <w:rPr>
-          <w:rFonts w:cs="Arial"/>
-          <w:b/>
-          <w:noProof/>
-          <w:sz w:val="24"/>
-          <w:lang w:val="en-GB"/>
-        </w:rPr>
+        <w:spacing w:after="200" w:afterAutospacing="0" w:line="276" w:lineRule="auto"/>
+        <w:ind w:left="714"/>
+        <w:contextualSpacing/>
+        <w:jc w:val="both"/>
+        <w:rPr>
+          <w:rFonts w:cs="Arial"/>
+          <w:noProof/>
+          <w:color w:val="000000"/>
+          <w:szCs w:val="22"/>
+          <w:lang w:val="en-GB"/>
+        </w:rPr>
+      </w:pPr>
+    </w:p>
+    <w:p>
+      <w:pPr>
+        <w:autoSpaceDE w:val="0"/>
+        <w:autoSpaceDN w:val="0"/>
+        <w:adjustRightInd w:val="0"/>
+        <w:rPr>
+          <w:rFonts w:cs="Arial"/>
+          <w:noProof/>
+          <w:sz w:val="24"/>
+          <w:u w:val="single" w:color="1F4E79" w:themeColor="accent1" w:themeShade="80"/>
+          <w:lang w:val="en-GB"/>
+        </w:rPr>
+      </w:pPr>
+      <w:r>
+        <w:rPr>
+          <w:rFonts w:cs="Arial"/>
+          <w:b/>
+          <w:noProof/>
+          <w:sz w:val="24"/>
+          <w:u w:val="single" w:color="1F4E79" w:themeColor="accent1" w:themeShade="80"/>
+          <w:lang w:val="en-GB"/>
+        </w:rPr>
+        <w:t>Equisoft:  Newbridge, Co Kildare</w:t>
+      </w:r>
+    </w:p>
+    <w:p>
+      <w:pPr>
+        <w:autoSpaceDE w:val="0"/>
+        <w:autoSpaceDN w:val="0"/>
+        <w:adjustRightInd w:val="0"/>
+        <w:rPr>
+          <w:rFonts w:cs="Arial"/>
+          <w:noProof/>
+          <w:sz w:val="20"/>
+          <w:szCs w:val="20"/>
+          <w:lang w:val="en-GB"/>
+        </w:rPr>
+      </w:pPr>
+    </w:p>
+    <w:p>
+      <w:pPr>
+        <w:tabs>
+          <w:tab w:val="right" w:pos="567"/>
+          <w:tab w:val="right" w:pos="3402"/>
+        </w:tabs>
+        <w:autoSpaceDE w:val="0"/>
+        <w:autoSpaceDN w:val="0"/>
+        <w:adjustRightInd w:val="0"/>
+        <w:jc w:val="both"/>
+        <w:rPr>
+          <w:rFonts w:cs="Arial"/>
+          <w:noProof/>
+          <w:sz w:val="24"/>
+          <w:lang w:val="en-GB"/>
+        </w:rPr>
+      </w:pPr>
+      <w:r>
+        <w:rPr>
+          <w:rFonts w:cs="Arial"/>
+          <w:b/>
+          <w:noProof/>
+          <w:sz w:val="24"/>
+          <w:lang w:val="en-GB"/>
+        </w:rPr>
+        <w:tab/>
         <w:t xml:space="preserve">   </w:t>
       </w:r>
       <w:r>
@@ -1986,17 +1381,7 @@
           <w:sz w:val="24"/>
           <w:lang w:val="en-GB"/>
         </w:rPr>
-        <w:t xml:space="preserve">Position: Software </w:t>
-      </w:r>
-      <w:r>
-        <w:rPr>
-          <w:rFonts w:cs="Arial"/>
-          <w:b/>
-          <w:noProof/>
-          <w:sz w:val="24"/>
-          <w:lang w:val="en-GB"/>
-        </w:rPr>
-        <w:t>Engineer</w:t>
+        <w:t>Position: Software Developer</w:t>
       </w:r>
       <w:r>
         <w:rPr>
@@ -2016,6 +1401,16 @@
           <w:sz w:val="24"/>
           <w:lang w:val="en-GB"/>
         </w:rPr>
+        <w:t xml:space="preserve">   </w:t>
+      </w:r>
+      <w:r>
+        <w:rPr>
+          <w:rFonts w:cs="Arial"/>
+          <w:b/>
+          <w:noProof/>
+          <w:sz w:val="24"/>
+          <w:lang w:val="en-GB"/>
+        </w:rPr>
         <w:tab/>
       </w:r>
       <w:r>
@@ -2037,27 +1432,68 @@
           <w:lang w:val="en-GB"/>
         </w:rPr>
         <w:tab/>
-        <w:t xml:space="preserve">        </w:t>
-      </w:r>
-      <w:r>
-        <w:rPr>
-          <w:rFonts w:cs="Arial"/>
-          <w:b/>
-          <w:noProof/>
-          <w:sz w:val="24"/>
-          <w:lang w:val="en-GB"/>
-        </w:rPr>
-        <w:t xml:space="preserve">August 2017 – </w:t>
-      </w:r>
-      <w:r>
-        <w:rPr>
-          <w:rFonts w:cs="Arial"/>
-          <w:b/>
-          <w:noProof/>
-          <w:sz w:val="24"/>
-          <w:lang w:val="en-GB"/>
-        </w:rPr>
-        <w:t>January 2019</w:t>
+        <w:t xml:space="preserve">      </w:t>
+      </w:r>
+      <w:r>
+        <w:rPr>
+          <w:rFonts w:cs="Arial"/>
+          <w:b/>
+          <w:noProof/>
+          <w:sz w:val="24"/>
+          <w:lang w:val="en-GB"/>
+        </w:rPr>
+        <w:t xml:space="preserve">   </w:t>
+      </w:r>
+      <w:r>
+        <w:rPr>
+          <w:rFonts w:cs="Arial"/>
+          <w:b/>
+          <w:noProof/>
+          <w:sz w:val="24"/>
+          <w:lang w:val="en-GB"/>
+        </w:rPr>
+        <w:tab/>
+        <w:t xml:space="preserve">    </w:t>
+      </w:r>
+      <w:r>
+        <w:rPr>
+          <w:rFonts w:cs="Arial"/>
+          <w:b/>
+          <w:noProof/>
+          <w:sz w:val="24"/>
+          <w:lang w:val="en-GB"/>
+        </w:rPr>
+        <w:t xml:space="preserve">January 2020 </w:t>
+      </w:r>
+      <w:r>
+        <w:rPr>
+          <w:rFonts w:cs="Arial"/>
+          <w:b/>
+          <w:noProof/>
+          <w:sz w:val="24"/>
+          <w:lang w:val="en-GB"/>
+        </w:rPr>
+        <w:t>–</w:t>
+      </w:r>
+      <w:r>
+        <w:rPr>
+          <w:rFonts w:cs="Arial"/>
+          <w:b/>
+          <w:noProof/>
+          <w:sz w:val="24"/>
+          <w:lang w:val="en-GB"/>
+        </w:rPr>
+        <w:t xml:space="preserve"> </w:t>
+      </w:r>
+      <w:r>
+        <w:rPr>
+          <w:rFonts w:cs="Arial"/>
+          <w:b/>
+          <w:noProof/>
+          <w:sz w:val="24"/>
+          <w:lang w:val="en-GB"/>
+        </w:rPr>
+        <w:t>May 2020</w:t>
       </w:r>
     </w:p>
     <w:p>
@@ -2131,29 +1567,18 @@
           <w:szCs w:val="22"/>
           <w:lang w:val="en-GB"/>
         </w:rPr>
-        <w:t xml:space="preserve">Responsible for the delivery of </w:t>
-      </w:r>
-      <w:r>
-        <w:rPr>
-          <w:rFonts w:ascii="Arial" w:hAnsi="Arial" w:cs="Arial"/>
-          <w:bCs/>
-          <w:noProof/>
-          <w:sz w:val="22"/>
-          <w:szCs w:val="22"/>
-          <w:lang w:val="en-GB"/>
-        </w:rPr>
-        <w:t>high-quality</w:t>
-      </w:r>
-      <w:r>
-        <w:rPr>
-          <w:rFonts w:ascii="Arial" w:hAnsi="Arial" w:cs="Arial"/>
-          <w:bCs/>
-          <w:noProof/>
-          <w:sz w:val="22"/>
-          <w:szCs w:val="22"/>
-          <w:lang w:val="en-GB"/>
-        </w:rPr>
-        <w:t xml:space="preserve"> software to Ericsson’s RNC platform, communicating within a team in an agile environment, to deliver software releases on time.</w:t>
+        <w:t>Development of high quality code for the Timesheets and Horse Management System, communicating within an agile environment, to deliver software releases on time</w:t>
+      </w:r>
+      <w:r>
+        <w:rPr>
+          <w:rFonts w:ascii="Arial" w:hAnsi="Arial" w:cs="Arial"/>
+          <w:bCs/>
+          <w:noProof/>
+          <w:sz w:val="22"/>
+          <w:szCs w:val="22"/>
+          <w:lang w:val="en-GB"/>
+        </w:rPr>
+        <w:t>.</w:t>
       </w:r>
     </w:p>
     <w:p>
@@ -2186,29 +1611,676 @@
           <w:szCs w:val="22"/>
           <w:lang w:val="en-GB"/>
         </w:rPr>
-        <w:t xml:space="preserve">Executing test suites on software deliverables and upgrading / adding test suites if </w:t>
-      </w:r>
-      <w:r>
-        <w:rPr>
-          <w:rFonts w:ascii="Arial" w:hAnsi="Arial" w:cs="Arial"/>
-          <w:bCs/>
-          <w:noProof/>
-          <w:sz w:val="22"/>
-          <w:szCs w:val="22"/>
-          <w:lang w:val="en-GB"/>
-        </w:rPr>
-        <w:t>necessary,</w:t>
-      </w:r>
-      <w:r>
-        <w:rPr>
-          <w:rFonts w:ascii="Arial" w:hAnsi="Arial" w:cs="Arial"/>
-          <w:bCs/>
-          <w:noProof/>
-          <w:sz w:val="22"/>
-          <w:szCs w:val="22"/>
-          <w:lang w:val="en-GB"/>
-        </w:rPr>
-        <w:t xml:space="preserve"> followed by documenting work undertaken and the impact of the changes.</w:t>
+        <w:t>Developed within PowerBuilder IDE along with Microsoft SQL Server and SourceSafe for version control.</w:t>
+      </w:r>
+    </w:p>
+    <w:p>
+      <w:pPr>
+        <w:spacing w:after="160" w:line="259" w:lineRule="auto"/>
+        <w:rPr>
+          <w:rFonts w:cs="Arial"/>
+          <w:bCs/>
+          <w:noProof/>
+          <w:sz w:val="20"/>
+          <w:szCs w:val="20"/>
+          <w:lang w:val="en-GB"/>
+        </w:rPr>
+      </w:pPr>
+      <w:r>
+        <w:rPr>
+          <w:rFonts w:cs="Arial"/>
+          <w:bCs/>
+          <w:noProof/>
+          <w:sz w:val="20"/>
+          <w:szCs w:val="20"/>
+          <w:lang w:val="en-GB"/>
+        </w:rPr>
+        <w:br w:type="page"/>
+      </w:r>
+    </w:p>
+    <w:p>
+      <w:pPr>
+        <w:pStyle w:val="NormalWeb"/>
+        <w:shd w:val="clear" w:color="auto" w:fill="FFFFFF"/>
+        <w:spacing w:after="200" w:afterAutospacing="0" w:line="276" w:lineRule="auto"/>
+        <w:ind w:left="714"/>
+        <w:contextualSpacing/>
+        <w:jc w:val="both"/>
+        <w:rPr>
+          <w:rFonts w:ascii="Arial" w:hAnsi="Arial" w:cs="Arial"/>
+          <w:bCs/>
+          <w:noProof/>
+          <w:sz w:val="20"/>
+          <w:szCs w:val="20"/>
+          <w:lang w:val="en-GB"/>
+        </w:rPr>
+      </w:pPr>
+    </w:p>
+    <w:p>
+      <w:pPr>
+        <w:autoSpaceDE w:val="0"/>
+        <w:autoSpaceDN w:val="0"/>
+        <w:adjustRightInd w:val="0"/>
+        <w:rPr>
+          <w:rFonts w:cs="Arial"/>
+          <w:noProof/>
+          <w:sz w:val="24"/>
+          <w:u w:val="single" w:color="1F4E79" w:themeColor="accent1" w:themeShade="80"/>
+          <w:lang w:val="en-GB"/>
+        </w:rPr>
+      </w:pPr>
+      <w:r>
+        <w:rPr>
+          <w:rFonts w:cs="Arial"/>
+          <w:b/>
+          <w:noProof/>
+          <w:sz w:val="24"/>
+          <w:u w:val="single" w:color="1F4E79" w:themeColor="accent1" w:themeShade="80"/>
+          <w:lang w:val="en-GB"/>
+        </w:rPr>
+        <w:t>Aspire Technolog</w:t>
+      </w:r>
+      <w:r>
+        <w:rPr>
+          <w:rFonts w:cs="Arial"/>
+          <w:b/>
+          <w:noProof/>
+          <w:sz w:val="24"/>
+          <w:u w:val="single" w:color="1F4E79" w:themeColor="accent1" w:themeShade="80"/>
+          <w:lang w:val="en-GB"/>
+        </w:rPr>
+        <w:t>y</w:t>
+      </w:r>
+      <w:r>
+        <w:rPr>
+          <w:rFonts w:cs="Arial"/>
+          <w:b/>
+          <w:noProof/>
+          <w:sz w:val="24"/>
+          <w:u w:val="single" w:color="1F4E79" w:themeColor="accent1" w:themeShade="80"/>
+          <w:lang w:val="en-GB"/>
+        </w:rPr>
+        <w:t xml:space="preserve">:  </w:t>
+      </w:r>
+      <w:r>
+        <w:rPr>
+          <w:rFonts w:cs="Arial"/>
+          <w:b/>
+          <w:noProof/>
+          <w:sz w:val="24"/>
+          <w:u w:val="single" w:color="1F4E79" w:themeColor="accent1" w:themeShade="80"/>
+          <w:lang w:val="en-GB"/>
+        </w:rPr>
+        <w:t>Sandyford, Dublin 18</w:t>
+      </w:r>
+    </w:p>
+    <w:p>
+      <w:pPr>
+        <w:autoSpaceDE w:val="0"/>
+        <w:autoSpaceDN w:val="0"/>
+        <w:adjustRightInd w:val="0"/>
+        <w:rPr>
+          <w:rFonts w:cs="Arial"/>
+          <w:noProof/>
+          <w:sz w:val="20"/>
+          <w:szCs w:val="20"/>
+          <w:lang w:val="en-GB"/>
+        </w:rPr>
+      </w:pPr>
+    </w:p>
+    <w:p>
+      <w:pPr>
+        <w:tabs>
+          <w:tab w:val="right" w:pos="567"/>
+          <w:tab w:val="right" w:pos="3402"/>
+        </w:tabs>
+        <w:autoSpaceDE w:val="0"/>
+        <w:autoSpaceDN w:val="0"/>
+        <w:adjustRightInd w:val="0"/>
+        <w:rPr>
+          <w:rFonts w:cs="Arial"/>
+          <w:noProof/>
+          <w:sz w:val="24"/>
+          <w:lang w:val="en-GB"/>
+        </w:rPr>
+      </w:pPr>
+      <w:r>
+        <w:rPr>
+          <w:rFonts w:cs="Arial"/>
+          <w:b/>
+          <w:noProof/>
+          <w:sz w:val="24"/>
+          <w:lang w:val="en-GB"/>
+        </w:rPr>
+        <w:t xml:space="preserve">   </w:t>
+      </w:r>
+      <w:r>
+        <w:rPr>
+          <w:rFonts w:cs="Arial"/>
+          <w:b/>
+          <w:noProof/>
+          <w:sz w:val="24"/>
+          <w:lang w:val="en-GB"/>
+        </w:rPr>
+        <w:t>Position:</w:t>
+      </w:r>
+      <w:r>
+        <w:rPr>
+          <w:rFonts w:cs="Arial"/>
+          <w:b/>
+          <w:noProof/>
+          <w:sz w:val="24"/>
+          <w:lang w:val="en-GB"/>
+        </w:rPr>
+        <w:t xml:space="preserve"> Frontend Developer</w:t>
+      </w:r>
+      <w:r>
+        <w:rPr>
+          <w:rFonts w:cs="Arial"/>
+          <w:b/>
+          <w:noProof/>
+          <w:sz w:val="24"/>
+          <w:lang w:val="en-GB"/>
+        </w:rPr>
+        <w:tab/>
+      </w:r>
+      <w:r>
+        <w:rPr>
+          <w:rFonts w:cs="Arial"/>
+          <w:b/>
+          <w:noProof/>
+          <w:sz w:val="24"/>
+          <w:lang w:val="en-GB"/>
+        </w:rPr>
+        <w:tab/>
+      </w:r>
+      <w:r>
+        <w:rPr>
+          <w:rFonts w:cs="Arial"/>
+          <w:b/>
+          <w:noProof/>
+          <w:sz w:val="24"/>
+          <w:lang w:val="en-GB"/>
+        </w:rPr>
+        <w:tab/>
+      </w:r>
+      <w:r>
+        <w:rPr>
+          <w:rFonts w:cs="Arial"/>
+          <w:b/>
+          <w:noProof/>
+          <w:sz w:val="24"/>
+          <w:lang w:val="en-GB"/>
+        </w:rPr>
+        <w:tab/>
+      </w:r>
+      <w:r>
+        <w:rPr>
+          <w:rFonts w:cs="Arial"/>
+          <w:b/>
+          <w:noProof/>
+          <w:sz w:val="24"/>
+          <w:lang w:val="en-GB"/>
+        </w:rPr>
+        <w:t xml:space="preserve">February 2019 – </w:t>
+      </w:r>
+      <w:r>
+        <w:rPr>
+          <w:rFonts w:cs="Arial"/>
+          <w:b/>
+          <w:noProof/>
+          <w:sz w:val="24"/>
+          <w:lang w:val="en-GB"/>
+        </w:rPr>
+        <w:t>September 2019</w:t>
+      </w:r>
+    </w:p>
+    <w:p>
+      <w:pPr>
+        <w:pStyle w:val="NormalWeb"/>
+        <w:shd w:val="clear" w:color="auto" w:fill="FFFFFF"/>
+        <w:spacing w:after="0" w:afterAutospacing="0"/>
+        <w:ind w:firstLine="357"/>
+        <w:rPr>
+          <w:rFonts w:ascii="Arial" w:hAnsi="Arial" w:cs="Arial"/>
+          <w:b/>
+          <w:bCs/>
+          <w:noProof/>
+          <w:lang w:val="en-GB"/>
+        </w:rPr>
+      </w:pPr>
+      <w:r>
+        <w:rPr>
+          <w:rFonts w:ascii="Arial" w:hAnsi="Arial" w:cs="Arial"/>
+          <w:b/>
+          <w:bCs/>
+          <w:noProof/>
+          <w:lang w:val="en-GB"/>
+        </w:rPr>
+        <w:t>Main Responsibilities</w:t>
+      </w:r>
+    </w:p>
+    <w:p>
+      <w:pPr>
+        <w:pStyle w:val="NormalWeb"/>
+        <w:shd w:val="clear" w:color="auto" w:fill="FFFFFF"/>
+        <w:spacing w:after="0" w:afterAutospacing="0"/>
+        <w:rPr>
+          <w:rFonts w:ascii="Arial" w:hAnsi="Arial" w:cs="Arial"/>
+          <w:b/>
+          <w:bCs/>
+          <w:noProof/>
+          <w:sz w:val="22"/>
+          <w:szCs w:val="22"/>
+          <w:lang w:val="en-GB"/>
+        </w:rPr>
+      </w:pPr>
+    </w:p>
+    <w:p>
+      <w:pPr>
+        <w:pStyle w:val="NormalWeb"/>
+        <w:numPr>
+          <w:ilvl w:val="0"/>
+          <w:numId w:val="7"/>
+        </w:numPr>
+        <w:shd w:val="clear" w:color="auto" w:fill="FFFFFF"/>
+        <w:spacing w:after="200" w:afterAutospacing="0" w:line="276" w:lineRule="auto"/>
+        <w:ind w:left="714" w:hanging="357"/>
+        <w:contextualSpacing/>
+        <w:jc w:val="both"/>
+        <w:rPr>
+          <w:rFonts w:ascii="Arial" w:hAnsi="Arial" w:cs="Arial"/>
+          <w:bCs/>
+          <w:noProof/>
+          <w:sz w:val="22"/>
+          <w:szCs w:val="22"/>
+          <w:lang w:val="en-GB"/>
+        </w:rPr>
+      </w:pPr>
+      <w:r>
+        <w:rPr>
+          <w:rFonts w:ascii="Arial" w:hAnsi="Arial" w:cs="Arial"/>
+          <w:bCs/>
+          <w:noProof/>
+          <w:sz w:val="22"/>
+          <w:szCs w:val="22"/>
+          <w:lang w:val="en-GB"/>
+        </w:rPr>
+        <w:t>Delivery of high quality</w:t>
+      </w:r>
+      <w:r>
+        <w:rPr>
+          <w:rFonts w:ascii="Arial" w:hAnsi="Arial" w:cs="Arial"/>
+          <w:bCs/>
+          <w:noProof/>
+          <w:sz w:val="22"/>
+          <w:szCs w:val="22"/>
+          <w:lang w:val="en-GB"/>
+        </w:rPr>
+        <w:t>, interactive</w:t>
+      </w:r>
+      <w:r>
+        <w:rPr>
+          <w:rFonts w:ascii="Arial" w:hAnsi="Arial" w:cs="Arial"/>
+          <w:bCs/>
+          <w:noProof/>
+          <w:sz w:val="22"/>
+          <w:szCs w:val="22"/>
+          <w:lang w:val="en-GB"/>
+        </w:rPr>
+        <w:t xml:space="preserve"> fron</w:t>
+      </w:r>
+      <w:r>
+        <w:rPr>
+          <w:rFonts w:ascii="Arial" w:hAnsi="Arial" w:cs="Arial"/>
+          <w:bCs/>
+          <w:noProof/>
+          <w:sz w:val="22"/>
+          <w:szCs w:val="22"/>
+          <w:lang w:val="en-GB"/>
+        </w:rPr>
+        <w:t>t</w:t>
+      </w:r>
+      <w:r>
+        <w:rPr>
+          <w:rFonts w:ascii="Arial" w:hAnsi="Arial" w:cs="Arial"/>
+          <w:bCs/>
+          <w:noProof/>
+          <w:sz w:val="22"/>
+          <w:szCs w:val="22"/>
+          <w:lang w:val="en-GB"/>
+        </w:rPr>
+        <w:t xml:space="preserve">end dashboards for </w:t>
+      </w:r>
+      <w:r>
+        <w:rPr>
+          <w:rFonts w:ascii="Arial" w:hAnsi="Arial" w:cs="Arial"/>
+          <w:bCs/>
+          <w:noProof/>
+          <w:sz w:val="22"/>
+          <w:szCs w:val="22"/>
+          <w:lang w:val="en-GB"/>
+        </w:rPr>
+        <w:t xml:space="preserve">both </w:t>
+      </w:r>
+      <w:r>
+        <w:rPr>
+          <w:rFonts w:ascii="Arial" w:hAnsi="Arial" w:cs="Arial"/>
+          <w:bCs/>
+          <w:noProof/>
+          <w:sz w:val="22"/>
+          <w:szCs w:val="22"/>
+          <w:lang w:val="en-GB"/>
+        </w:rPr>
+        <w:t xml:space="preserve">internal and external </w:t>
+      </w:r>
+      <w:r>
+        <w:rPr>
+          <w:rFonts w:ascii="Arial" w:hAnsi="Arial" w:cs="Arial"/>
+          <w:bCs/>
+          <w:noProof/>
+          <w:sz w:val="22"/>
+          <w:szCs w:val="22"/>
+          <w:lang w:val="en-GB"/>
+        </w:rPr>
+        <w:t>use</w:t>
+      </w:r>
+      <w:r>
+        <w:rPr>
+          <w:rFonts w:ascii="Arial" w:hAnsi="Arial" w:cs="Arial"/>
+          <w:bCs/>
+          <w:noProof/>
+          <w:sz w:val="22"/>
+          <w:szCs w:val="22"/>
+          <w:lang w:val="en-GB"/>
+        </w:rPr>
+        <w:t xml:space="preserve">. </w:t>
+      </w:r>
+      <w:r>
+        <w:rPr>
+          <w:rFonts w:ascii="Arial" w:hAnsi="Arial" w:cs="Arial"/>
+          <w:bCs/>
+          <w:noProof/>
+          <w:sz w:val="22"/>
+          <w:szCs w:val="22"/>
+          <w:lang w:val="en-GB"/>
+        </w:rPr>
+        <w:t xml:space="preserve">Examples </w:t>
+      </w:r>
+      <w:r>
+        <w:rPr>
+          <w:rFonts w:ascii="Arial" w:hAnsi="Arial" w:cs="Arial"/>
+          <w:bCs/>
+          <w:noProof/>
+          <w:sz w:val="22"/>
+          <w:szCs w:val="22"/>
+          <w:lang w:val="en-GB"/>
+        </w:rPr>
+        <w:t xml:space="preserve">include </w:t>
+      </w:r>
+      <w:r>
+        <w:rPr>
+          <w:rFonts w:ascii="Arial" w:hAnsi="Arial" w:cs="Arial"/>
+          <w:bCs/>
+          <w:noProof/>
+          <w:sz w:val="22"/>
+          <w:szCs w:val="22"/>
+          <w:lang w:val="en-GB"/>
+        </w:rPr>
+        <w:t>V</w:t>
+      </w:r>
+      <w:r>
+        <w:rPr>
+          <w:rFonts w:ascii="Arial" w:hAnsi="Arial" w:cs="Arial"/>
+          <w:bCs/>
+          <w:noProof/>
+          <w:sz w:val="22"/>
+          <w:szCs w:val="22"/>
+          <w:lang w:val="en-GB"/>
+        </w:rPr>
+        <w:t xml:space="preserve">oice and </w:t>
+      </w:r>
+      <w:r>
+        <w:rPr>
+          <w:rFonts w:ascii="Arial" w:hAnsi="Arial" w:cs="Arial"/>
+          <w:bCs/>
+          <w:noProof/>
+          <w:sz w:val="22"/>
+          <w:szCs w:val="22"/>
+          <w:lang w:val="en-GB"/>
+        </w:rPr>
+        <w:t>D</w:t>
+      </w:r>
+      <w:r>
+        <w:rPr>
+          <w:rFonts w:ascii="Arial" w:hAnsi="Arial" w:cs="Arial"/>
+          <w:bCs/>
+          <w:noProof/>
+          <w:sz w:val="22"/>
+          <w:szCs w:val="22"/>
+          <w:lang w:val="en-GB"/>
+        </w:rPr>
+        <w:t xml:space="preserve">ata </w:t>
+      </w:r>
+      <w:r>
+        <w:rPr>
+          <w:rFonts w:ascii="Arial" w:hAnsi="Arial" w:cs="Arial"/>
+          <w:bCs/>
+          <w:noProof/>
+          <w:sz w:val="22"/>
+          <w:szCs w:val="22"/>
+          <w:lang w:val="en-GB"/>
+        </w:rPr>
+        <w:t>Q</w:t>
+      </w:r>
+      <w:r>
+        <w:rPr>
+          <w:rFonts w:ascii="Arial" w:hAnsi="Arial" w:cs="Arial"/>
+          <w:bCs/>
+          <w:noProof/>
+          <w:sz w:val="22"/>
+          <w:szCs w:val="22"/>
+          <w:lang w:val="en-GB"/>
+        </w:rPr>
+        <w:t xml:space="preserve">uality </w:t>
+      </w:r>
+      <w:r>
+        <w:rPr>
+          <w:rFonts w:ascii="Arial" w:hAnsi="Arial" w:cs="Arial"/>
+          <w:bCs/>
+          <w:noProof/>
+          <w:sz w:val="22"/>
+          <w:szCs w:val="22"/>
+          <w:lang w:val="en-GB"/>
+        </w:rPr>
+        <w:t>V</w:t>
+      </w:r>
+      <w:r>
+        <w:rPr>
+          <w:rFonts w:ascii="Arial" w:hAnsi="Arial" w:cs="Arial"/>
+          <w:bCs/>
+          <w:noProof/>
+          <w:sz w:val="22"/>
+          <w:szCs w:val="22"/>
+          <w:lang w:val="en-GB"/>
+        </w:rPr>
+        <w:t>isualisation</w:t>
+      </w:r>
+      <w:r>
+        <w:rPr>
+          <w:rFonts w:ascii="Arial" w:hAnsi="Arial" w:cs="Arial"/>
+          <w:bCs/>
+          <w:noProof/>
+          <w:sz w:val="22"/>
+          <w:szCs w:val="22"/>
+          <w:lang w:val="en-GB"/>
+        </w:rPr>
+        <w:t>s</w:t>
+      </w:r>
+      <w:r>
+        <w:rPr>
+          <w:rFonts w:ascii="Arial" w:hAnsi="Arial" w:cs="Arial"/>
+          <w:bCs/>
+          <w:noProof/>
+          <w:sz w:val="22"/>
+          <w:szCs w:val="22"/>
+          <w:lang w:val="en-GB"/>
+        </w:rPr>
+        <w:t xml:space="preserve"> and Site Alarm Trends.</w:t>
+      </w:r>
+    </w:p>
+    <w:p>
+      <w:pPr>
+        <w:pStyle w:val="NormalWeb"/>
+        <w:numPr>
+          <w:ilvl w:val="0"/>
+          <w:numId w:val="7"/>
+        </w:numPr>
+        <w:shd w:val="clear" w:color="auto" w:fill="FFFFFF"/>
+        <w:spacing w:after="200" w:afterAutospacing="0" w:line="276" w:lineRule="auto"/>
+        <w:ind w:left="714" w:hanging="357"/>
+        <w:contextualSpacing/>
+        <w:jc w:val="both"/>
+        <w:rPr>
+          <w:rFonts w:ascii="Arial" w:hAnsi="Arial" w:cs="Arial"/>
+          <w:bCs/>
+          <w:noProof/>
+          <w:sz w:val="22"/>
+          <w:szCs w:val="22"/>
+          <w:lang w:val="en-GB"/>
+        </w:rPr>
+      </w:pPr>
+      <w:r>
+        <w:rPr>
+          <w:rFonts w:ascii="Arial" w:hAnsi="Arial" w:cs="Arial"/>
+          <w:bCs/>
+          <w:noProof/>
+          <w:sz w:val="22"/>
+          <w:szCs w:val="22"/>
+          <w:lang w:val="en-GB"/>
+        </w:rPr>
+        <w:t xml:space="preserve">Tools were developed within eclipse and VS Code </w:t>
+      </w:r>
+      <w:r>
+        <w:rPr>
+          <w:rFonts w:ascii="Arial" w:hAnsi="Arial" w:cs="Arial"/>
+          <w:bCs/>
+          <w:noProof/>
+          <w:sz w:val="22"/>
+          <w:szCs w:val="22"/>
+          <w:lang w:val="en-GB"/>
+        </w:rPr>
+        <w:t xml:space="preserve">IDE’s </w:t>
+      </w:r>
+      <w:r>
+        <w:rPr>
+          <w:rFonts w:ascii="Arial" w:hAnsi="Arial" w:cs="Arial"/>
+          <w:bCs/>
+          <w:noProof/>
+          <w:sz w:val="22"/>
+          <w:szCs w:val="22"/>
+          <w:lang w:val="en-GB"/>
+        </w:rPr>
+        <w:t>using HTML</w:t>
+      </w:r>
+      <w:r>
+        <w:rPr>
+          <w:rFonts w:ascii="Arial" w:hAnsi="Arial" w:cs="Arial"/>
+          <w:bCs/>
+          <w:noProof/>
+          <w:sz w:val="22"/>
+          <w:szCs w:val="22"/>
+          <w:lang w:val="en-GB"/>
+        </w:rPr>
+        <w:t>5</w:t>
+      </w:r>
+      <w:r>
+        <w:rPr>
+          <w:rFonts w:ascii="Arial" w:hAnsi="Arial" w:cs="Arial"/>
+          <w:bCs/>
+          <w:noProof/>
+          <w:sz w:val="22"/>
+          <w:szCs w:val="22"/>
+          <w:lang w:val="en-GB"/>
+        </w:rPr>
+        <w:t>, CSS</w:t>
+      </w:r>
+      <w:r>
+        <w:rPr>
+          <w:rFonts w:ascii="Arial" w:hAnsi="Arial" w:cs="Arial"/>
+          <w:bCs/>
+          <w:noProof/>
+          <w:sz w:val="22"/>
+          <w:szCs w:val="22"/>
+          <w:lang w:val="en-GB"/>
+        </w:rPr>
+        <w:t>3</w:t>
+      </w:r>
+      <w:r>
+        <w:rPr>
+          <w:rFonts w:ascii="Arial" w:hAnsi="Arial" w:cs="Arial"/>
+          <w:bCs/>
+          <w:noProof/>
+          <w:sz w:val="22"/>
+          <w:szCs w:val="22"/>
+          <w:lang w:val="en-GB"/>
+        </w:rPr>
+        <w:t xml:space="preserve">, </w:t>
+      </w:r>
+      <w:r>
+        <w:rPr>
+          <w:rFonts w:ascii="Arial" w:hAnsi="Arial" w:cs="Arial"/>
+          <w:bCs/>
+          <w:noProof/>
+          <w:sz w:val="22"/>
+          <w:szCs w:val="22"/>
+          <w:lang w:val="en-GB"/>
+        </w:rPr>
+        <w:t>jQuery</w:t>
+      </w:r>
+      <w:r>
+        <w:rPr>
+          <w:rFonts w:ascii="Arial" w:hAnsi="Arial" w:cs="Arial"/>
+          <w:bCs/>
+          <w:noProof/>
+          <w:sz w:val="22"/>
+          <w:szCs w:val="22"/>
+          <w:lang w:val="en-GB"/>
+        </w:rPr>
+        <w:t xml:space="preserve">, </w:t>
+      </w:r>
+      <w:r>
+        <w:rPr>
+          <w:rFonts w:ascii="Arial" w:hAnsi="Arial" w:cs="Arial"/>
+          <w:bCs/>
+          <w:noProof/>
+          <w:sz w:val="22"/>
+          <w:szCs w:val="22"/>
+          <w:lang w:val="en-GB"/>
+        </w:rPr>
+        <w:t>JavaScript</w:t>
+      </w:r>
+      <w:r>
+        <w:rPr>
+          <w:rFonts w:ascii="Arial" w:hAnsi="Arial" w:cs="Arial"/>
+          <w:bCs/>
+          <w:noProof/>
+          <w:sz w:val="22"/>
+          <w:szCs w:val="22"/>
+          <w:lang w:val="en-GB"/>
+        </w:rPr>
+        <w:t>, Bootstrap and Perl and were done in an agile methodology environment</w:t>
+      </w:r>
+      <w:r>
+        <w:rPr>
+          <w:rFonts w:ascii="Arial" w:hAnsi="Arial" w:cs="Arial"/>
+          <w:bCs/>
+          <w:noProof/>
+          <w:sz w:val="22"/>
+          <w:szCs w:val="22"/>
+          <w:lang w:val="en-GB"/>
+        </w:rPr>
+        <w:t>.</w:t>
       </w:r>
     </w:p>
     <w:p>
@@ -2245,14 +2317,574 @@
           <w:szCs w:val="22"/>
           <w:lang w:val="en-GB"/>
         </w:rPr>
-        <w:t>Duties included collaborating within a team, gathering requirements, implementation, testing, documenting and the delivery of software at set intervals.</w:t>
-      </w:r>
-    </w:p>
-    <w:p>
-      <w:pPr>
+        <w:t>D</w:t>
+      </w:r>
+      <w:r>
+        <w:rPr>
+          <w:rFonts w:ascii="Arial" w:hAnsi="Arial" w:cs="Arial"/>
+          <w:bCs/>
+          <w:noProof/>
+          <w:sz w:val="22"/>
+          <w:szCs w:val="22"/>
+          <w:lang w:val="en-GB"/>
+        </w:rPr>
+        <w:t>elivery of software was performed</w:t>
+      </w:r>
+      <w:r>
+        <w:rPr>
+          <w:rFonts w:ascii="Arial" w:hAnsi="Arial" w:cs="Arial"/>
+          <w:bCs/>
+          <w:noProof/>
+          <w:sz w:val="22"/>
+          <w:szCs w:val="22"/>
+          <w:lang w:val="en-GB"/>
+        </w:rPr>
+        <w:t xml:space="preserve"> using git and deployed </w:t>
+      </w:r>
+      <w:r>
+        <w:rPr>
+          <w:rFonts w:ascii="Arial" w:hAnsi="Arial" w:cs="Arial"/>
+          <w:bCs/>
+          <w:noProof/>
+          <w:sz w:val="22"/>
+          <w:szCs w:val="22"/>
+          <w:lang w:val="en-GB"/>
+        </w:rPr>
+        <w:t xml:space="preserve">either via Docker </w:t>
+      </w:r>
+      <w:r>
+        <w:rPr>
+          <w:rFonts w:ascii="Arial" w:hAnsi="Arial" w:cs="Arial"/>
+          <w:bCs/>
+          <w:noProof/>
+          <w:sz w:val="22"/>
+          <w:szCs w:val="22"/>
+          <w:lang w:val="en-GB"/>
+        </w:rPr>
+        <w:t xml:space="preserve">images </w:t>
+      </w:r>
+      <w:r>
+        <w:rPr>
+          <w:rFonts w:ascii="Arial" w:hAnsi="Arial" w:cs="Arial"/>
+          <w:bCs/>
+          <w:noProof/>
+          <w:sz w:val="22"/>
+          <w:szCs w:val="22"/>
+          <w:lang w:val="en-GB"/>
+        </w:rPr>
+        <w:t xml:space="preserve">or </w:t>
+      </w:r>
+      <w:r>
+        <w:rPr>
+          <w:rFonts w:ascii="Arial" w:hAnsi="Arial" w:cs="Arial"/>
+          <w:bCs/>
+          <w:noProof/>
+          <w:sz w:val="22"/>
+          <w:szCs w:val="22"/>
+          <w:lang w:val="en-GB"/>
+        </w:rPr>
+        <w:t xml:space="preserve">by logging </w:t>
+      </w:r>
+      <w:r>
+        <w:rPr>
+          <w:rFonts w:ascii="Arial" w:hAnsi="Arial" w:cs="Arial"/>
+          <w:bCs/>
+          <w:noProof/>
+          <w:sz w:val="22"/>
+          <w:szCs w:val="22"/>
+          <w:lang w:val="en-GB"/>
+        </w:rPr>
+        <w:t>o</w:t>
+      </w:r>
+      <w:r>
+        <w:rPr>
+          <w:rFonts w:ascii="Arial" w:hAnsi="Arial" w:cs="Arial"/>
+          <w:bCs/>
+          <w:noProof/>
+          <w:sz w:val="22"/>
+          <w:szCs w:val="22"/>
+          <w:lang w:val="en-GB"/>
+        </w:rPr>
+        <w:t xml:space="preserve">nto </w:t>
+      </w:r>
+      <w:r>
+        <w:rPr>
+          <w:rFonts w:ascii="Arial" w:hAnsi="Arial" w:cs="Arial"/>
+          <w:bCs/>
+          <w:noProof/>
+          <w:sz w:val="22"/>
+          <w:szCs w:val="22"/>
+          <w:lang w:val="en-GB"/>
+        </w:rPr>
+        <w:t xml:space="preserve">internal or </w:t>
+      </w:r>
+      <w:r>
+        <w:rPr>
+          <w:rFonts w:ascii="Arial" w:hAnsi="Arial" w:cs="Arial"/>
+          <w:bCs/>
+          <w:noProof/>
+          <w:sz w:val="22"/>
+          <w:szCs w:val="22"/>
+          <w:lang w:val="en-GB"/>
+        </w:rPr>
+        <w:t>external servers</w:t>
+      </w:r>
+      <w:r>
+        <w:rPr>
+          <w:rFonts w:ascii="Arial" w:hAnsi="Arial" w:cs="Arial"/>
+          <w:bCs/>
+          <w:noProof/>
+          <w:sz w:val="22"/>
+          <w:szCs w:val="22"/>
+          <w:lang w:val="en-GB"/>
+        </w:rPr>
+        <w:t xml:space="preserve"> (i.e. AWS)</w:t>
+      </w:r>
+      <w:r>
+        <w:rPr>
+          <w:rFonts w:ascii="Arial" w:hAnsi="Arial" w:cs="Arial"/>
+          <w:bCs/>
+          <w:noProof/>
+          <w:sz w:val="22"/>
+          <w:szCs w:val="22"/>
+          <w:lang w:val="en-GB"/>
+        </w:rPr>
+        <w:t xml:space="preserve"> via </w:t>
+      </w:r>
+      <w:r>
+        <w:rPr>
+          <w:rFonts w:ascii="Arial" w:hAnsi="Arial" w:cs="Arial"/>
+          <w:bCs/>
+          <w:noProof/>
+          <w:sz w:val="22"/>
+          <w:szCs w:val="22"/>
+          <w:lang w:val="en-GB"/>
+        </w:rPr>
+        <w:t>PuTTY</w:t>
+      </w:r>
+      <w:r>
+        <w:rPr>
+          <w:rFonts w:ascii="Arial" w:hAnsi="Arial" w:cs="Arial"/>
+          <w:bCs/>
+          <w:noProof/>
+          <w:sz w:val="22"/>
+          <w:szCs w:val="22"/>
+          <w:lang w:val="en-GB"/>
+        </w:rPr>
+        <w:t>.</w:t>
+      </w:r>
+    </w:p>
+    <w:p>
+      <w:pPr>
+        <w:pStyle w:val="NormalWeb"/>
+        <w:widowControl w:val="0"/>
+        <w:numPr>
+          <w:ilvl w:val="0"/>
+          <w:numId w:val="5"/>
+        </w:numPr>
+        <w:shd w:val="clear" w:color="auto" w:fill="FFFFFF"/>
+        <w:overflowPunct w:val="0"/>
         <w:autoSpaceDE w:val="0"/>
         <w:autoSpaceDN w:val="0"/>
         <w:adjustRightInd w:val="0"/>
+        <w:spacing w:after="200" w:afterAutospacing="0" w:line="276" w:lineRule="auto"/>
+        <w:ind w:left="714" w:hanging="357"/>
+        <w:contextualSpacing/>
+        <w:jc w:val="both"/>
+        <w:rPr>
+          <w:rFonts w:cs="Arial"/>
+          <w:noProof/>
+          <w:color w:val="000000"/>
+          <w:szCs w:val="22"/>
+          <w:lang w:val="en-GB"/>
+        </w:rPr>
+      </w:pPr>
+      <w:r>
+        <w:rPr>
+          <w:rFonts w:ascii="Arial" w:hAnsi="Arial" w:cs="Arial"/>
+          <w:noProof/>
+          <w:color w:val="000000"/>
+          <w:sz w:val="22"/>
+          <w:szCs w:val="22"/>
+          <w:lang w:val="en-GB"/>
+        </w:rPr>
+        <w:t>Required e</w:t>
+      </w:r>
+      <w:r>
+        <w:rPr>
+          <w:rFonts w:ascii="Arial" w:hAnsi="Arial" w:cs="Arial"/>
+          <w:noProof/>
+          <w:color w:val="000000"/>
+          <w:sz w:val="22"/>
+          <w:szCs w:val="22"/>
+          <w:lang w:val="en-GB"/>
+        </w:rPr>
+        <w:t>xcellent communication skills working in a team environment</w:t>
+      </w:r>
+      <w:r>
+        <w:rPr>
+          <w:rFonts w:ascii="Arial" w:hAnsi="Arial" w:cs="Arial"/>
+          <w:noProof/>
+          <w:color w:val="000000"/>
+          <w:sz w:val="22"/>
+          <w:szCs w:val="22"/>
+          <w:lang w:val="en-GB"/>
+        </w:rPr>
+        <w:t>,</w:t>
+      </w:r>
+      <w:r>
+        <w:rPr>
+          <w:rFonts w:ascii="Arial" w:hAnsi="Arial" w:cs="Arial"/>
+          <w:noProof/>
+          <w:color w:val="000000"/>
+          <w:sz w:val="22"/>
+          <w:szCs w:val="22"/>
+          <w:lang w:val="en-GB"/>
+        </w:rPr>
+        <w:t xml:space="preserve"> based in Dublin and Belgrade</w:t>
+      </w:r>
+      <w:r>
+        <w:rPr>
+          <w:rFonts w:ascii="Arial" w:hAnsi="Arial" w:cs="Arial"/>
+          <w:noProof/>
+          <w:color w:val="000000"/>
+          <w:sz w:val="22"/>
+          <w:szCs w:val="22"/>
+          <w:lang w:val="en-GB"/>
+        </w:rPr>
+        <w:t>.</w:t>
+      </w:r>
+      <w:r>
+        <w:rPr>
+          <w:rFonts w:ascii="Arial" w:hAnsi="Arial" w:cs="Arial"/>
+          <w:noProof/>
+          <w:color w:val="000000"/>
+          <w:sz w:val="22"/>
+          <w:szCs w:val="22"/>
+          <w:lang w:val="en-GB"/>
+        </w:rPr>
+        <w:t xml:space="preserve"> Often worked under pressure to deliver dashboards within a short timeframe.</w:t>
+      </w:r>
+    </w:p>
+    <w:p>
+      <w:pPr>
+        <w:autoSpaceDE w:val="0"/>
+        <w:autoSpaceDN w:val="0"/>
+        <w:adjustRightInd w:val="0"/>
+        <w:rPr>
+          <w:rFonts w:cs="Arial"/>
+          <w:noProof/>
+          <w:sz w:val="24"/>
+          <w:lang w:val="en-GB"/>
+        </w:rPr>
+      </w:pPr>
+      <w:r>
+        <w:rPr>
+          <w:rFonts w:cs="Arial"/>
+          <w:b/>
+          <w:noProof/>
+          <w:sz w:val="24"/>
+          <w:lang w:val="en-GB"/>
+        </w:rPr>
+        <w:t xml:space="preserve">   </w:t>
+      </w:r>
+      <w:r>
+        <w:rPr>
+          <w:rFonts w:cs="Arial"/>
+          <w:b/>
+          <w:noProof/>
+          <w:sz w:val="24"/>
+          <w:lang w:val="en-GB"/>
+        </w:rPr>
+        <w:t xml:space="preserve">Position: Software </w:t>
+      </w:r>
+      <w:r>
+        <w:rPr>
+          <w:rFonts w:cs="Arial"/>
+          <w:b/>
+          <w:noProof/>
+          <w:sz w:val="24"/>
+          <w:lang w:val="en-GB"/>
+        </w:rPr>
+        <w:t>Engineer</w:t>
+      </w:r>
+      <w:r>
+        <w:rPr>
+          <w:rFonts w:cs="Arial"/>
+          <w:b/>
+          <w:noProof/>
+          <w:sz w:val="24"/>
+          <w:lang w:val="en-GB"/>
+        </w:rPr>
+        <w:tab/>
+      </w:r>
+      <w:r>
+        <w:rPr>
+          <w:rFonts w:cs="Arial"/>
+          <w:b/>
+          <w:noProof/>
+          <w:sz w:val="24"/>
+          <w:lang w:val="en-GB"/>
+        </w:rPr>
+        <w:tab/>
+      </w:r>
+      <w:r>
+        <w:rPr>
+          <w:rFonts w:cs="Arial"/>
+          <w:b/>
+          <w:noProof/>
+          <w:sz w:val="24"/>
+          <w:lang w:val="en-GB"/>
+        </w:rPr>
+        <w:tab/>
+      </w:r>
+      <w:r>
+        <w:rPr>
+          <w:rFonts w:cs="Arial"/>
+          <w:b/>
+          <w:noProof/>
+          <w:sz w:val="24"/>
+          <w:lang w:val="en-GB"/>
+        </w:rPr>
+        <w:tab/>
+        <w:t xml:space="preserve">        </w:t>
+      </w:r>
+      <w:r>
+        <w:rPr>
+          <w:rFonts w:cs="Arial"/>
+          <w:b/>
+          <w:noProof/>
+          <w:sz w:val="24"/>
+          <w:lang w:val="en-GB"/>
+        </w:rPr>
+        <w:t xml:space="preserve">August 2017 – </w:t>
+      </w:r>
+      <w:r>
+        <w:rPr>
+          <w:rFonts w:cs="Arial"/>
+          <w:b/>
+          <w:noProof/>
+          <w:sz w:val="24"/>
+          <w:lang w:val="en-GB"/>
+        </w:rPr>
+        <w:t>January 2019</w:t>
+      </w:r>
+    </w:p>
+    <w:p>
+      <w:pPr>
+        <w:pStyle w:val="NormalWeb"/>
+        <w:shd w:val="clear" w:color="auto" w:fill="FFFFFF"/>
+        <w:spacing w:after="0" w:afterAutospacing="0"/>
+        <w:ind w:firstLine="357"/>
+        <w:rPr>
+          <w:rFonts w:ascii="Arial" w:hAnsi="Arial" w:cs="Arial"/>
+          <w:b/>
+          <w:bCs/>
+          <w:noProof/>
+          <w:lang w:val="en-GB"/>
+        </w:rPr>
+      </w:pPr>
+      <w:r>
+        <w:rPr>
+          <w:rFonts w:ascii="Arial" w:hAnsi="Arial" w:cs="Arial"/>
+          <w:b/>
+          <w:bCs/>
+          <w:noProof/>
+          <w:lang w:val="en-GB"/>
+        </w:rPr>
+        <w:t>Main Responsibilities</w:t>
+      </w:r>
+    </w:p>
+    <w:p>
+      <w:pPr>
+        <w:pStyle w:val="NormalWeb"/>
+        <w:shd w:val="clear" w:color="auto" w:fill="FFFFFF"/>
+        <w:spacing w:after="0" w:afterAutospacing="0"/>
+        <w:rPr>
+          <w:rFonts w:ascii="Arial" w:hAnsi="Arial" w:cs="Arial"/>
+          <w:b/>
+          <w:bCs/>
+          <w:noProof/>
+          <w:sz w:val="22"/>
+          <w:szCs w:val="22"/>
+          <w:lang w:val="en-GB"/>
+        </w:rPr>
+      </w:pPr>
+    </w:p>
+    <w:p>
+      <w:pPr>
+        <w:pStyle w:val="NormalWeb"/>
+        <w:numPr>
+          <w:ilvl w:val="0"/>
+          <w:numId w:val="7"/>
+        </w:numPr>
+        <w:shd w:val="clear" w:color="auto" w:fill="FFFFFF"/>
+        <w:spacing w:after="200" w:afterAutospacing="0" w:line="276" w:lineRule="auto"/>
+        <w:ind w:left="714" w:hanging="357"/>
+        <w:contextualSpacing/>
+        <w:jc w:val="both"/>
+        <w:rPr>
+          <w:rFonts w:ascii="Arial" w:hAnsi="Arial" w:cs="Arial"/>
+          <w:bCs/>
+          <w:noProof/>
+          <w:sz w:val="22"/>
+          <w:szCs w:val="22"/>
+          <w:lang w:val="en-GB"/>
+        </w:rPr>
+      </w:pPr>
+      <w:r>
+        <w:rPr>
+          <w:rFonts w:ascii="Arial" w:hAnsi="Arial" w:cs="Arial"/>
+          <w:bCs/>
+          <w:noProof/>
+          <w:sz w:val="22"/>
+          <w:szCs w:val="22"/>
+          <w:lang w:val="en-GB"/>
+        </w:rPr>
+        <w:t xml:space="preserve">Responsible for the delivery of </w:t>
+      </w:r>
+      <w:r>
+        <w:rPr>
+          <w:rFonts w:ascii="Arial" w:hAnsi="Arial" w:cs="Arial"/>
+          <w:bCs/>
+          <w:noProof/>
+          <w:sz w:val="22"/>
+          <w:szCs w:val="22"/>
+          <w:lang w:val="en-GB"/>
+        </w:rPr>
+        <w:t>high-quality</w:t>
+      </w:r>
+      <w:r>
+        <w:rPr>
+          <w:rFonts w:ascii="Arial" w:hAnsi="Arial" w:cs="Arial"/>
+          <w:bCs/>
+          <w:noProof/>
+          <w:sz w:val="22"/>
+          <w:szCs w:val="22"/>
+          <w:lang w:val="en-GB"/>
+        </w:rPr>
+        <w:t xml:space="preserve"> software to Ericsson’s RNC platform, communicating within a team in an agile environment, to deliver software releases on time.</w:t>
+      </w:r>
+    </w:p>
+    <w:p>
+      <w:pPr>
+        <w:pStyle w:val="NormalWeb"/>
+        <w:numPr>
+          <w:ilvl w:val="0"/>
+          <w:numId w:val="7"/>
+        </w:numPr>
+        <w:shd w:val="clear" w:color="auto" w:fill="FFFFFF"/>
+        <w:spacing w:after="200" w:afterAutospacing="0" w:line="276" w:lineRule="auto"/>
+        <w:ind w:left="714" w:hanging="357"/>
+        <w:contextualSpacing/>
+        <w:jc w:val="both"/>
+        <w:rPr>
+          <w:rFonts w:ascii="Arial" w:hAnsi="Arial" w:cs="Arial"/>
+          <w:bCs/>
+          <w:noProof/>
+          <w:sz w:val="22"/>
+          <w:szCs w:val="22"/>
+          <w:lang w:val="en-GB"/>
+        </w:rPr>
+      </w:pPr>
+      <w:r>
+        <w:rPr>
+          <w:rFonts w:ascii="Arial" w:hAnsi="Arial" w:cs="Arial"/>
+          <w:bCs/>
+          <w:noProof/>
+          <w:sz w:val="22"/>
+          <w:szCs w:val="22"/>
+          <w:lang w:val="en-GB"/>
+        </w:rPr>
+        <w:t xml:space="preserve">Executing test suites on software deliverables and upgrading / adding test suites if </w:t>
+      </w:r>
+      <w:r>
+        <w:rPr>
+          <w:rFonts w:ascii="Arial" w:hAnsi="Arial" w:cs="Arial"/>
+          <w:bCs/>
+          <w:noProof/>
+          <w:sz w:val="22"/>
+          <w:szCs w:val="22"/>
+          <w:lang w:val="en-GB"/>
+        </w:rPr>
+        <w:t>necessary,</w:t>
+      </w:r>
+      <w:r>
+        <w:rPr>
+          <w:rFonts w:ascii="Arial" w:hAnsi="Arial" w:cs="Arial"/>
+          <w:bCs/>
+          <w:noProof/>
+          <w:sz w:val="22"/>
+          <w:szCs w:val="22"/>
+          <w:lang w:val="en-GB"/>
+        </w:rPr>
+        <w:t xml:space="preserve"> followed by documenting work undertaken and the impact of the changes.</w:t>
+      </w:r>
+    </w:p>
+    <w:p>
+      <w:pPr>
+        <w:pStyle w:val="NormalWeb"/>
+        <w:widowControl w:val="0"/>
+        <w:numPr>
+          <w:ilvl w:val="0"/>
+          <w:numId w:val="5"/>
+        </w:numPr>
+        <w:shd w:val="clear" w:color="auto" w:fill="FFFFFF"/>
+        <w:overflowPunct w:val="0"/>
+        <w:autoSpaceDE w:val="0"/>
+        <w:autoSpaceDN w:val="0"/>
+        <w:adjustRightInd w:val="0"/>
+        <w:spacing w:after="200" w:afterAutospacing="0" w:line="276" w:lineRule="auto"/>
+        <w:ind w:left="714" w:hanging="357"/>
+        <w:contextualSpacing/>
+        <w:jc w:val="both"/>
+        <w:rPr>
+          <w:rFonts w:ascii="Arial" w:hAnsi="Arial" w:cs="Arial"/>
+          <w:noProof/>
+          <w:sz w:val="20"/>
+          <w:szCs w:val="20"/>
+          <w:lang w:val="en-GB"/>
+        </w:rPr>
+      </w:pPr>
+      <w:r>
+        <w:rPr>
+          <w:rFonts w:ascii="Arial" w:hAnsi="Arial" w:cs="Arial"/>
+          <w:bCs/>
+          <w:noProof/>
+          <w:sz w:val="22"/>
+          <w:szCs w:val="22"/>
+          <w:lang w:val="en-GB"/>
+        </w:rPr>
+        <w:t>Duties included collaborating within a team, gathering requirements, implementation, testing, documenting and the delivery of software at set intervals.</w:t>
+      </w:r>
+    </w:p>
+    <w:p>
+      <w:pPr>
+        <w:pStyle w:val="NormalWeb"/>
+        <w:widowControl w:val="0"/>
+        <w:shd w:val="clear" w:color="auto" w:fill="FFFFFF"/>
+        <w:overflowPunct w:val="0"/>
+        <w:autoSpaceDE w:val="0"/>
+        <w:autoSpaceDN w:val="0"/>
+        <w:adjustRightInd w:val="0"/>
+        <w:spacing w:after="200" w:afterAutospacing="0" w:line="276" w:lineRule="auto"/>
+        <w:ind w:left="714"/>
+        <w:contextualSpacing/>
+        <w:jc w:val="both"/>
+        <w:rPr>
+          <w:rFonts w:ascii="Arial" w:hAnsi="Arial" w:cs="Arial"/>
+          <w:noProof/>
+          <w:sz w:val="20"/>
+          <w:szCs w:val="20"/>
+          <w:lang w:val="en-GB"/>
+        </w:rPr>
+      </w:pPr>
+    </w:p>
+    <w:p>
+      <w:pPr>
+        <w:autoSpaceDE w:val="0"/>
+        <w:autoSpaceDN w:val="0"/>
+        <w:adjustRightInd w:val="0"/>
         <w:rPr>
           <w:rFonts w:cs="Arial"/>
           <w:noProof/>
@@ -2270,7 +2902,6 @@
           <w:u w:val="single" w:color="1F4E79" w:themeColor="accent1" w:themeShade="80"/>
           <w:lang w:val="en-GB"/>
         </w:rPr>
-        <w:lastRenderedPageBreak/>
         <w:t>Ericsson Ireland</w:t>
       </w:r>
       <w:r>
@@ -2970,6 +3601,28 @@
     </w:p>
     <w:p>
       <w:pPr>
+        <w:spacing w:after="160" w:line="259" w:lineRule="auto"/>
+        <w:rPr>
+          <w:rFonts w:cs="Arial"/>
+          <w:bCs/>
+          <w:noProof/>
+          <w:szCs w:val="22"/>
+          <w:lang w:val="en-GB"/>
+        </w:rPr>
+      </w:pPr>
+      <w:r>
+        <w:rPr>
+          <w:rFonts w:cs="Arial"/>
+          <w:bCs/>
+          <w:noProof/>
+          <w:szCs w:val="22"/>
+          <w:lang w:val="en-GB"/>
+        </w:rPr>
+        <w:br w:type="page"/>
+      </w:r>
+    </w:p>
+    <w:p>
+      <w:pPr>
         <w:pStyle w:val="NormalWeb"/>
         <w:shd w:val="clear" w:color="auto" w:fill="FFFFFF"/>
         <w:spacing w:after="0" w:afterAutospacing="0"/>
@@ -3660,6 +4313,19 @@
     </w:p>
     <w:p>
       <w:pPr>
+        <w:autoSpaceDE w:val="0"/>
+        <w:autoSpaceDN w:val="0"/>
+        <w:adjustRightInd w:val="0"/>
+        <w:jc w:val="both"/>
+        <w:rPr>
+          <w:rFonts w:cs="Arial"/>
+          <w:noProof/>
+          <w:lang w:val="en-GB"/>
+        </w:rPr>
+      </w:pPr>
+    </w:p>
+    <w:p>
+      <w:pPr>
         <w:pStyle w:val="BodyTextIndent"/>
         <w:pBdr>
           <w:bottom w:val="single" w:sz="12" w:space="1" w:color="auto"/>
@@ -3745,6 +4411,18 @@
     </w:p>
     <w:p>
       <w:pPr>
+        <w:pStyle w:val="BodyText"/>
+        <w:rPr>
+          <w:rFonts w:ascii="Arial" w:hAnsi="Arial" w:cs="Arial"/>
+          <w:noProof/>
+          <w:sz w:val="22"/>
+          <w:szCs w:val="22"/>
+          <w:lang w:val="en-GB"/>
+        </w:rPr>
+      </w:pPr>
+    </w:p>
+    <w:p>
+      <w:pPr>
         <w:pStyle w:val="BodyTextIndent"/>
         <w:pBdr>
           <w:bottom w:val="single" w:sz="12" w:space="1" w:color="auto"/>
@@ -3811,7 +4489,20 @@
           <w:shd w:val="clear" w:color="auto" w:fill="FFFFFF"/>
           <w:lang w:val="en-GB"/>
         </w:rPr>
-        <w:t>Claire Lawlor</w:t>
+        <w:t>Declan Friel</w:t>
+      </w:r>
+      <w:r>
+        <w:rPr>
+          <w:rStyle w:val="apple-converted-space"/>
+          <w:rFonts w:ascii="Arial" w:hAnsi="Arial" w:cs="Arial"/>
+          <w:b/>
+          <w:noProof/>
+          <w:color w:val="000000" w:themeColor="text1"/>
+          <w:szCs w:val="22"/>
+          <w:shd w:val="clear" w:color="auto" w:fill="FFFFFF"/>
+          <w:lang w:val="en-GB"/>
+        </w:rPr>
+        <w:tab/>
       </w:r>
       <w:r>
         <w:rPr>
@@ -3929,10 +4620,11 @@
           <w:shd w:val="clear" w:color="auto" w:fill="FFFFFF"/>
           <w:lang w:val="en-GB"/>
         </w:rPr>
-        <w:t>Software Delivery Manager,</w:t>
-      </w:r>
-      <w:r>
-        <w:rPr>
+        <w:t>CTO</w:t>
+      </w:r>
+      <w:r>
+        <w:rPr>
+          <w:rStyle w:val="apple-converted-space"/>
           <w:rFonts w:ascii="Arial" w:hAnsi="Arial" w:cs="Arial"/>
           <w:noProof/>
           <w:color w:val="auto"/>
@@ -3940,7 +4632,53 @@
           <w:shd w:val="clear" w:color="auto" w:fill="FFFFFF"/>
           <w:lang w:val="en-GB"/>
         </w:rPr>
+        <w:t>,</w:t>
+      </w:r>
+      <w:r>
+        <w:rPr>
+          <w:rStyle w:val="apple-converted-space"/>
+          <w:rFonts w:ascii="Arial" w:hAnsi="Arial" w:cs="Arial"/>
+          <w:noProof/>
+          <w:color w:val="auto"/>
+          <w:szCs w:val="22"/>
+          <w:shd w:val="clear" w:color="auto" w:fill="FFFFFF"/>
+          <w:lang w:val="en-GB"/>
+        </w:rPr>
+        <w:tab/>
+      </w:r>
+      <w:r>
+        <w:rPr>
+          <w:rStyle w:val="apple-converted-space"/>
+          <w:rFonts w:ascii="Arial" w:hAnsi="Arial" w:cs="Arial"/>
+          <w:noProof/>
+          <w:color w:val="auto"/>
+          <w:szCs w:val="22"/>
+          <w:shd w:val="clear" w:color="auto" w:fill="FFFFFF"/>
+          <w:lang w:val="en-GB"/>
+        </w:rPr>
+        <w:tab/>
+      </w:r>
+      <w:r>
+        <w:rPr>
+          <w:rFonts w:ascii="Arial" w:hAnsi="Arial" w:cs="Arial"/>
+          <w:noProof/>
+          <w:color w:val="auto"/>
+          <w:szCs w:val="22"/>
+          <w:shd w:val="clear" w:color="auto" w:fill="FFFFFF"/>
+          <w:lang w:val="en-GB"/>
+        </w:rPr>
         <w:t xml:space="preserve"> </w:t>
+      </w:r>
+      <w:r>
+        <w:rPr>
+          <w:rFonts w:ascii="Arial" w:hAnsi="Arial" w:cs="Arial"/>
+          <w:noProof/>
+          <w:color w:val="auto"/>
+          <w:szCs w:val="22"/>
+          <w:shd w:val="clear" w:color="auto" w:fill="FFFFFF"/>
+          <w:lang w:val="en-GB"/>
+        </w:rPr>
+        <w:tab/>
       </w:r>
       <w:r>
         <w:rPr>
@@ -4156,7 +4894,7 @@
           <w:shd w:val="clear" w:color="auto" w:fill="FFFFFF"/>
           <w:lang w:val="en-GB"/>
         </w:rPr>
-        <w:t>Tel: +353 87 981 3032</w:t>
+        <w:t xml:space="preserve">Tel: +353 87 </w:t>
       </w:r>
       <w:r>
         <w:rPr>
@@ -4167,6 +4905,17 @@
           <w:shd w:val="clear" w:color="auto" w:fill="FFFFFF"/>
           <w:lang w:val="en-GB"/>
         </w:rPr>
+        <w:t>910 4456</w:t>
+      </w:r>
+      <w:r>
+        <w:rPr>
+          <w:rFonts w:ascii="Arial" w:hAnsi="Arial" w:cs="Arial"/>
+          <w:noProof/>
+          <w:color w:val="auto"/>
+          <w:szCs w:val="22"/>
+          <w:shd w:val="clear" w:color="auto" w:fill="FFFFFF"/>
+          <w:lang w:val="en-GB"/>
+        </w:rPr>
         <w:tab/>
       </w:r>
       <w:r>
@@ -4180,6 +4929,8 @@
         </w:rPr>
         <w:tab/>
       </w:r>
+      <w:bookmarkStart w:id="0" w:name="_GoBack"/>
+      <w:bookmarkEnd w:id="0"/>
       <w:r>
         <w:rPr>
           <w:rFonts w:ascii="Arial" w:hAnsi="Arial" w:cs="Arial"/>
@@ -4323,7 +5074,7 @@
         <w:rStyle w:val="PageNumber"/>
         <w:noProof/>
       </w:rPr>
-      <w:t>1</w:t>
+      <w:t>2</w:t>
     </w:r>
     <w:r>
       <w:rPr>
@@ -4360,7 +5111,7 @@
         <w:rStyle w:val="PageNumber"/>
         <w:noProof/>
       </w:rPr>
-      <w:t>2</w:t>
+      <w:t>3</w:t>
     </w:r>
     <w:r>
       <w:rPr>
@@ -7475,7 +8226,7 @@
 </file>
 
 <file path=customXml/itemProps1.xml><?xml version="1.0" encoding="utf-8"?>
-<ds:datastoreItem xmlns:ds="http://schemas.openxmlformats.org/officeDocument/2006/customXml" ds:itemID="{CFD40BA2-E184-4B03-A994-E2B55BA59F38}">
+<ds:datastoreItem xmlns:ds="http://schemas.openxmlformats.org/officeDocument/2006/customXml" ds:itemID="{D0EF018A-7E9F-400D-BEBB-E58BDA6F07A4}">
   <ds:schemaRefs>
     <ds:schemaRef ds:uri="http://schemas.openxmlformats.org/officeDocument/2006/bibliography"/>
   </ds:schemaRefs>

</xml_diff>